<commit_message>
Tracked down justins CV subset
</commit_message>
<xml_diff>
--- a/Manuscript/Manuscript v.2/Manuscript Draft v.2.4.docx
+++ b/Manuscript/Manuscript v.2/Manuscript Draft v.2.4.docx
@@ -12419,7 +12419,6 @@
         </w:rPr>
         <w:t xml:space="preserve"> </w:t>
       </w:r>
-      <w:commentRangeStart w:id="4"/>
       <w:r>
         <w:rPr>
           <w:rFonts w:ascii="Arial" w:hAnsi="Arial" w:cs="Arial"/>
@@ -12495,16 +12494,6 @@
         </w:rPr>
         <w:t xml:space="preserve">) </w:t>
       </w:r>
-      <w:commentRangeEnd w:id="4"/>
-      <w:r>
-        <w:rPr>
-          <w:rStyle w:val="CommentReference"/>
-          <w:rFonts w:ascii="Arial" w:hAnsi="Arial" w:cs="Arial"/>
-          <w:sz w:val="20"/>
-          <w:szCs w:val="20"/>
-        </w:rPr>
-        <w:commentReference w:id="4"/>
-      </w:r>
       <w:r>
         <w:rPr>
           <w:rFonts w:ascii="Arial" w:hAnsi="Arial" w:cs="Arial"/>
@@ -14791,7 +14780,40 @@
           <w:szCs w:val="20"/>
           <w:highlight w:val="yellow"/>
         </w:rPr>
-        <w:t>xx</w:t>
+        <w:t>Appendix S13</w:t>
+      </w:r>
+      <w:r>
+        <w:rPr>
+          <w:rFonts w:ascii="Arial" w:hAnsi="Arial" w:cs="Arial"/>
+          <w:sz w:val="20"/>
+          <w:szCs w:val="20"/>
+        </w:rPr>
+        <w:t>)</w:t>
+      </w:r>
+      <w:r>
+        <w:rPr>
+          <w:rFonts w:ascii="Arial" w:hAnsi="Arial" w:cs="Arial"/>
+          <w:sz w:val="20"/>
+          <w:szCs w:val="20"/>
+        </w:rPr>
+        <w:t>, whereas 6_POA_Mixed contained a more restricted set of accessibility-</w:t>
+      </w:r>
+      <w:r>
+        <w:rPr>
+          <w:rFonts w:ascii="Arial" w:hAnsi="Arial" w:cs="Arial"/>
+          <w:sz w:val="20"/>
+          <w:szCs w:val="20"/>
+        </w:rPr>
+        <w:lastRenderedPageBreak/>
+        <w:t>coupled modules</w:t>
+      </w:r>
+      <w:r>
+        <w:rPr>
+          <w:rFonts w:ascii="Arial" w:hAnsi="Arial" w:cs="Arial"/>
+          <w:sz w:val="20"/>
+          <w:szCs w:val="20"/>
+        </w:rPr>
+        <w:t xml:space="preserve"> (</w:t>
       </w:r>
       <w:r>
         <w:rPr>
@@ -14800,90 +14822,7 @@
           <w:szCs w:val="20"/>
           <w:highlight w:val="yellow"/>
         </w:rPr>
-        <w:t>Supplementary excel file called</w:t>
-      </w:r>
-      <w:r>
-        <w:rPr>
-          <w:rFonts w:ascii="Arial" w:hAnsi="Arial" w:cs="Arial"/>
-          <w:highlight w:val="yellow"/>
-        </w:rPr>
-        <w:t xml:space="preserve"> “</w:t>
-      </w:r>
-      <w:r>
-        <w:rPr>
-          <w:rFonts w:ascii="Arial" w:hAnsi="Arial" w:cs="Arial"/>
-          <w:sz w:val="20"/>
-          <w:szCs w:val="20"/>
-          <w:highlight w:val="yellow"/>
-        </w:rPr>
-        <w:t>cluster_1_TFs.xlsx</w:t>
-      </w:r>
-      <w:r>
-        <w:rPr>
-          <w:rFonts w:ascii="Arial" w:hAnsi="Arial" w:cs="Arial"/>
-          <w:sz w:val="20"/>
-          <w:szCs w:val="20"/>
-        </w:rPr>
-        <w:t>)</w:t>
-      </w:r>
-      <w:r>
-        <w:rPr>
-          <w:rFonts w:ascii="Arial" w:hAnsi="Arial" w:cs="Arial"/>
-          <w:sz w:val="20"/>
-          <w:szCs w:val="20"/>
-        </w:rPr>
-        <w:t xml:space="preserve">, whereas 6_POA_Mixed contained </w:t>
-      </w:r>
-      <w:r>
-        <w:rPr>
-          <w:rFonts w:ascii="Arial" w:hAnsi="Arial" w:cs="Arial"/>
-          <w:sz w:val="20"/>
-          <w:szCs w:val="20"/>
-        </w:rPr>
-        <w:lastRenderedPageBreak/>
-        <w:t>a more restricted set of accessibility-coupled modules</w:t>
-      </w:r>
-      <w:r>
-        <w:rPr>
-          <w:rFonts w:ascii="Arial" w:hAnsi="Arial" w:cs="Arial"/>
-          <w:sz w:val="20"/>
-          <w:szCs w:val="20"/>
-        </w:rPr>
-        <w:t xml:space="preserve"> (</w:t>
-      </w:r>
-      <w:r>
-        <w:rPr>
-          <w:rFonts w:ascii="Arial" w:hAnsi="Arial" w:cs="Arial"/>
-          <w:sz w:val="20"/>
-          <w:szCs w:val="20"/>
-          <w:highlight w:val="yellow"/>
-        </w:rPr>
-        <w:t>xx</w:t>
-      </w:r>
-      <w:r>
-        <w:rPr>
-          <w:rFonts w:ascii="Arial" w:hAnsi="Arial" w:cs="Arial"/>
-          <w:sz w:val="20"/>
-          <w:szCs w:val="20"/>
-          <w:highlight w:val="yellow"/>
-        </w:rPr>
-        <w:t>Supplementary excel file called</w:t>
-      </w:r>
-      <w:r>
-        <w:rPr>
-          <w:rFonts w:ascii="Arial" w:hAnsi="Arial" w:cs="Arial"/>
-          <w:highlight w:val="yellow"/>
-        </w:rPr>
-        <w:t xml:space="preserve"> “</w:t>
-      </w:r>
-      <w:r>
-        <w:rPr>
-          <w:rFonts w:ascii="Arial" w:hAnsi="Arial" w:cs="Arial"/>
-          <w:sz w:val="20"/>
-          <w:szCs w:val="20"/>
-          <w:highlight w:val="yellow"/>
-        </w:rPr>
-        <w:t>cluster_6_TFs.xlsx”</w:t>
+        <w:t>Appendix S14</w:t>
       </w:r>
       <w:r>
         <w:rPr>
@@ -15663,7 +15602,15 @@
           <w:szCs w:val="20"/>
           <w:highlight w:val="yellow"/>
         </w:rPr>
-        <w:t xml:space="preserve">Fig. S11A ; </w:t>
+        <w:t>Fig. S11A ;</w:t>
+      </w:r>
+      <w:r>
+        <w:rPr>
+          <w:rFonts w:ascii="Arial" w:hAnsi="Arial" w:cs="Arial"/>
+          <w:sz w:val="20"/>
+          <w:szCs w:val="20"/>
+        </w:rPr>
+        <w:t xml:space="preserve"> </w:t>
       </w:r>
       <w:r>
         <w:rPr>
@@ -15672,68 +15619,7 @@
           <w:szCs w:val="20"/>
           <w:highlight w:val="yellow"/>
         </w:rPr>
-        <w:t>xx</w:t>
-      </w:r>
-      <w:r>
-        <w:rPr>
-          <w:rFonts w:ascii="Arial" w:hAnsi="Arial" w:cs="Arial"/>
-          <w:sz w:val="20"/>
-          <w:szCs w:val="20"/>
-          <w:highlight w:val="yellow"/>
-        </w:rPr>
-        <w:t xml:space="preserve">Supplementary </w:t>
-      </w:r>
-      <w:r>
-        <w:rPr>
-          <w:rFonts w:ascii="Arial" w:hAnsi="Arial" w:cs="Arial"/>
-          <w:sz w:val="20"/>
-          <w:szCs w:val="20"/>
-          <w:highlight w:val="yellow"/>
-        </w:rPr>
-        <w:t>excel</w:t>
-      </w:r>
-      <w:r>
-        <w:rPr>
-          <w:rFonts w:ascii="Arial" w:hAnsi="Arial" w:cs="Arial"/>
-          <w:sz w:val="20"/>
-          <w:szCs w:val="20"/>
-          <w:highlight w:val="yellow"/>
-        </w:rPr>
-        <w:t xml:space="preserve"> file</w:t>
-      </w:r>
-      <w:r>
-        <w:rPr>
-          <w:rFonts w:ascii="Arial" w:hAnsi="Arial" w:cs="Arial"/>
-          <w:sz w:val="20"/>
-          <w:szCs w:val="20"/>
-          <w:highlight w:val="yellow"/>
-        </w:rPr>
-        <w:t>A</w:t>
-      </w:r>
-      <w:r>
-        <w:rPr>
-          <w:rFonts w:ascii="Arial" w:hAnsi="Arial" w:cs="Arial"/>
-          <w:sz w:val="20"/>
-          <w:szCs w:val="20"/>
-          <w:highlight w:val="yellow"/>
-        </w:rPr>
-        <w:t xml:space="preserve"> called</w:t>
-      </w:r>
-      <w:r>
-        <w:rPr>
-          <w:rFonts w:ascii="Arial" w:hAnsi="Arial" w:cs="Arial"/>
-          <w:highlight w:val="yellow"/>
-        </w:rPr>
-        <w:t xml:space="preserve"> “</w:t>
-      </w:r>
-      <w:r>
-        <w:rPr>
-          <w:rFonts w:ascii="Arial" w:hAnsi="Arial" w:cs="Arial"/>
-          <w:sz w:val="20"/>
-          <w:szCs w:val="20"/>
-          <w:highlight w:val="yellow"/>
-        </w:rPr>
-        <w:t>cluster_1_TFs.xlsx”</w:t>
+        <w:t>Appendix S13</w:t>
       </w:r>
       <w:r>
         <w:rPr>
@@ -15946,7 +15832,15 @@
           <w:szCs w:val="20"/>
           <w:highlight w:val="yellow"/>
         </w:rPr>
-        <w:t xml:space="preserve">Fig. S11B; </w:t>
+        <w:t>Fig. S11B</w:t>
+      </w:r>
+      <w:r>
+        <w:rPr>
+          <w:rFonts w:ascii="Arial" w:hAnsi="Arial" w:cs="Arial"/>
+          <w:sz w:val="20"/>
+          <w:szCs w:val="20"/>
+        </w:rPr>
+        <w:t xml:space="preserve">; </w:t>
       </w:r>
       <w:r>
         <w:rPr>
@@ -15955,79 +15849,7 @@
           <w:szCs w:val="20"/>
           <w:highlight w:val="yellow"/>
         </w:rPr>
-        <w:t>xx</w:t>
-      </w:r>
-      <w:r>
-        <w:rPr>
-          <w:rFonts w:ascii="Arial" w:hAnsi="Arial" w:cs="Arial"/>
-          <w:sz w:val="20"/>
-          <w:szCs w:val="20"/>
-          <w:highlight w:val="yellow"/>
-        </w:rPr>
-        <w:t xml:space="preserve">Supplementary </w:t>
-      </w:r>
-      <w:r>
-        <w:rPr>
-          <w:rFonts w:ascii="Arial" w:hAnsi="Arial" w:cs="Arial"/>
-          <w:sz w:val="20"/>
-          <w:szCs w:val="20"/>
-          <w:highlight w:val="yellow"/>
-        </w:rPr>
-        <w:t>excel</w:t>
-      </w:r>
-      <w:r>
-        <w:rPr>
-          <w:rFonts w:ascii="Arial" w:hAnsi="Arial" w:cs="Arial"/>
-          <w:sz w:val="20"/>
-          <w:szCs w:val="20"/>
-          <w:highlight w:val="yellow"/>
-        </w:rPr>
-        <w:t xml:space="preserve"> file</w:t>
-      </w:r>
-      <w:r>
-        <w:rPr>
-          <w:rFonts w:ascii="Arial" w:hAnsi="Arial" w:cs="Arial"/>
-          <w:sz w:val="20"/>
-          <w:szCs w:val="20"/>
-          <w:highlight w:val="yellow"/>
-        </w:rPr>
-        <w:t>B</w:t>
-      </w:r>
-      <w:r>
-        <w:rPr>
-          <w:rFonts w:ascii="Arial" w:hAnsi="Arial" w:cs="Arial"/>
-          <w:sz w:val="20"/>
-          <w:szCs w:val="20"/>
-          <w:highlight w:val="yellow"/>
-        </w:rPr>
-        <w:t xml:space="preserve"> </w:t>
-      </w:r>
-      <w:r>
-        <w:rPr>
-          <w:rFonts w:ascii="Arial" w:hAnsi="Arial" w:cs="Arial"/>
-          <w:sz w:val="20"/>
-          <w:szCs w:val="20"/>
-          <w:highlight w:val="yellow"/>
-        </w:rPr>
-        <w:t>called “</w:t>
-      </w:r>
-      <w:r>
-        <w:rPr>
-          <w:rFonts w:ascii="Arial" w:hAnsi="Arial" w:cs="Arial"/>
-          <w:sz w:val="20"/>
-          <w:szCs w:val="20"/>
-          <w:highlight w:val="yellow"/>
-        </w:rPr>
-        <w:t>cluster_6_combined_reproductive_regulatory_network_edges.csv</w:t>
-      </w:r>
-      <w:r>
-        <w:rPr>
-          <w:rFonts w:ascii="Arial" w:hAnsi="Arial" w:cs="Arial"/>
-          <w:sz w:val="20"/>
-          <w:szCs w:val="20"/>
-          <w:highlight w:val="yellow"/>
-        </w:rPr>
-        <w:t>”</w:t>
+        <w:t>Appendix S15</w:t>
       </w:r>
       <w:r>
         <w:rPr>
@@ -16169,7 +15991,7 @@
           <w:szCs w:val="20"/>
           <w:highlight w:val="yellow"/>
         </w:rPr>
-        <w:t xml:space="preserve">Fig. S11B; </w:t>
+        <w:t>Fig. S11B</w:t>
       </w:r>
       <w:r>
         <w:rPr>
@@ -16178,7 +16000,7 @@
           <w:szCs w:val="20"/>
           <w:highlight w:val="yellow"/>
         </w:rPr>
-        <w:t>xx</w:t>
+        <w:t xml:space="preserve">; </w:t>
       </w:r>
       <w:r>
         <w:rPr>
@@ -16187,7 +16009,15 @@
           <w:szCs w:val="20"/>
           <w:highlight w:val="yellow"/>
         </w:rPr>
-        <w:t>Supplementary excel fileB called “cluster_6_combined_reproductive_regulatory_network_edges.csv”</w:t>
+        <w:t>Appendix S15</w:t>
+      </w:r>
+      <w:r>
+        <w:rPr>
+          <w:rFonts w:ascii="Arial" w:hAnsi="Arial" w:cs="Arial"/>
+          <w:sz w:val="20"/>
+          <w:szCs w:val="20"/>
+        </w:rPr>
+        <w:t>)</w:t>
       </w:r>
       <w:r>
         <w:rPr>
@@ -16762,7 +16592,7 @@
         </w:rPr>
         <w:t>Given the identification of sex steroid receptors as candidate regulators of transcriptional changes in 6_POA_Mixed, we next asked how steroid receptor-associated transcription changed across sex change. We examined expression of genes associated with ESR2B, AR, or PGR binding motifs and separately tested whether chromatin accessibility at regions containing these motifs changed across sex change (Methods). ESR2B-associated gene expression increased gradually across sex change and differed significantly between males and females, with intermediates exhibiting intermediate values (</w:t>
       </w:r>
-      <w:commentRangeStart w:id="5"/>
+      <w:commentRangeStart w:id="4"/>
       <w:r>
         <w:rPr>
           <w:rFonts w:ascii="Arial" w:hAnsi="Arial" w:cs="Arial"/>
@@ -16771,7 +16601,7 @@
         </w:rPr>
         <w:t xml:space="preserve">Hedges’ g = 1.52; F(2,16) </w:t>
       </w:r>
-      <w:commentRangeEnd w:id="5"/>
+      <w:commentRangeEnd w:id="4"/>
       <w:r>
         <w:rPr>
           <w:rStyle w:val="CommentReference"/>
@@ -16779,7 +16609,7 @@
           <w:sz w:val="20"/>
           <w:szCs w:val="20"/>
         </w:rPr>
-        <w:commentReference w:id="5"/>
+        <w:commentReference w:id="4"/>
       </w:r>
       <w:r>
         <w:rPr>
@@ -16822,16 +16652,16 @@
           <w:sz w:val="20"/>
           <w:szCs w:val="20"/>
         </w:rPr>
-        <w:t xml:space="preserve">). Importantly, accessibility of ESR2B-binding regions also increased significantly in females relative to males and intermediates, which did not differ from each </w:t>
-      </w:r>
-      <w:r>
-        <w:rPr>
-          <w:rFonts w:ascii="Arial" w:hAnsi="Arial" w:cs="Arial"/>
-          <w:sz w:val="20"/>
-          <w:szCs w:val="20"/>
-        </w:rPr>
-        <w:lastRenderedPageBreak/>
-        <w:t xml:space="preserve">other (Hedges’ g = 0.79; F(2,16) = 4.5, </w:t>
+        <w:t xml:space="preserve">). </w:t>
+      </w:r>
+      <w:commentRangeStart w:id="5"/>
+      <w:r>
+        <w:rPr>
+          <w:rFonts w:ascii="Arial" w:hAnsi="Arial" w:cs="Arial"/>
+          <w:sz w:val="20"/>
+          <w:szCs w:val="20"/>
+        </w:rPr>
+        <w:t xml:space="preserve">Importantly, accessibility of ESR2B-binding regions also increased significantly in females relative to males and intermediates, which did not differ from each other (Hedges’ g = 0.79; F(2,16) = 4.5, </w:t>
       </w:r>
       <w:r>
         <w:rPr>
@@ -16869,6 +16699,16 @@
         </w:rPr>
         <w:t>XX</w:t>
       </w:r>
+      <w:commentRangeEnd w:id="5"/>
+      <w:r>
+        <w:rPr>
+          <w:rStyle w:val="CommentReference"/>
+          <w:rFonts w:ascii="Arial" w:hAnsi="Arial" w:cs="Arial"/>
+          <w:sz w:val="20"/>
+          <w:szCs w:val="20"/>
+        </w:rPr>
+        <w:commentReference w:id="5"/>
+      </w:r>
       <w:r>
         <w:rPr>
           <w:rFonts w:ascii="Arial" w:hAnsi="Arial" w:cs="Arial"/>
@@ -16924,7 +16764,15 @@
           <w:szCs w:val="20"/>
           <w:highlight w:val="yellow"/>
         </w:rPr>
-        <w:t>xx</w:t>
+        <w:t>Fig.</w:t>
+      </w:r>
+      <w:r>
+        <w:rPr>
+          <w:rFonts w:ascii="Arial" w:hAnsi="Arial" w:cs="Arial"/>
+          <w:sz w:val="20"/>
+          <w:szCs w:val="20"/>
+        </w:rPr>
+        <w:t xml:space="preserve"> </w:t>
       </w:r>
       <w:r>
         <w:rPr>
@@ -16933,16 +16781,7 @@
           <w:szCs w:val="20"/>
           <w:highlight w:val="yellow"/>
         </w:rPr>
-        <w:t>Fig.</w:t>
-      </w:r>
-      <w:r>
-        <w:rPr>
-          <w:rFonts w:ascii="Arial" w:hAnsi="Arial" w:cs="Arial"/>
-          <w:sz w:val="20"/>
-          <w:szCs w:val="20"/>
-          <w:highlight w:val="yellow"/>
-        </w:rPr>
-        <w:t>xx</w:t>
+        <w:t>4A</w:t>
       </w:r>
       <w:r>
         <w:rPr>
@@ -16985,6 +16824,7 @@
           <w:sz w:val="20"/>
           <w:szCs w:val="20"/>
         </w:rPr>
+        <w:lastRenderedPageBreak/>
         <w:tab/>
         <w:t>In contrast, AR-associated gene expression and accessibility remained stable across sex change (</w:t>
       </w:r>
@@ -17063,7 +16903,16 @@
           <w:sz w:val="20"/>
           <w:szCs w:val="20"/>
         </w:rPr>
-        <w:t>). However, unlike ESR2B, accessibility of PGR-binding regions remained stable across sex change</w:t>
+        <w:t xml:space="preserve">). </w:t>
+      </w:r>
+      <w:commentRangeStart w:id="6"/>
+      <w:r>
+        <w:rPr>
+          <w:rFonts w:ascii="Arial" w:hAnsi="Arial" w:cs="Arial"/>
+          <w:sz w:val="20"/>
+          <w:szCs w:val="20"/>
+        </w:rPr>
+        <w:t>However, unlike ESR2B, accessibility of PGR-binding regions remained stable across sex change</w:t>
       </w:r>
       <w:r>
         <w:rPr>
@@ -17105,7 +16954,25 @@
           <w:sz w:val="20"/>
           <w:szCs w:val="20"/>
         </w:rPr>
-        <w:t xml:space="preserve">. Together with the transient decrease in </w:t>
+        <w:t xml:space="preserve">. </w:t>
+      </w:r>
+      <w:commentRangeEnd w:id="6"/>
+      <w:r>
+        <w:rPr>
+          <w:rStyle w:val="CommentReference"/>
+          <w:rFonts w:ascii="Arial" w:hAnsi="Arial" w:cs="Arial"/>
+          <w:sz w:val="20"/>
+          <w:szCs w:val="20"/>
+        </w:rPr>
+        <w:commentReference w:id="6"/>
+      </w:r>
+      <w:r>
+        <w:rPr>
+          <w:rFonts w:ascii="Arial" w:hAnsi="Arial" w:cs="Arial"/>
+          <w:sz w:val="20"/>
+          <w:szCs w:val="20"/>
+        </w:rPr>
+        <w:t xml:space="preserve">Together with the transient decrease in </w:t>
       </w:r>
       <w:r>
         <w:rPr>
@@ -17524,7 +17391,7 @@
         </w:rPr>
         <w:t xml:space="preserve"> </w:t>
       </w:r>
-      <w:commentRangeStart w:id="6"/>
+      <w:commentRangeStart w:id="7"/>
       <w:r>
         <w:rPr>
           <w:rFonts w:ascii="Arial" w:hAnsi="Arial" w:cs="Arial"/>
@@ -17605,7 +17472,7 @@
         </w:rPr>
         <w:t xml:space="preserve"> </w:t>
       </w:r>
-      <w:commentRangeEnd w:id="6"/>
+      <w:commentRangeEnd w:id="7"/>
       <w:r>
         <w:rPr>
           <w:rStyle w:val="CommentReference"/>
@@ -17613,9 +17480,9 @@
           <w:sz w:val="20"/>
           <w:szCs w:val="20"/>
         </w:rPr>
-        <w:commentReference w:id="6"/>
-      </w:r>
-      <w:commentRangeStart w:id="7"/>
+        <w:commentReference w:id="7"/>
+      </w:r>
+      <w:commentRangeStart w:id="8"/>
       <w:r>
         <w:rPr>
           <w:rFonts w:ascii="Arial" w:hAnsi="Arial" w:cs="Arial"/>
@@ -17690,7 +17557,7 @@
         </w:rPr>
         <w:t>.</w:t>
       </w:r>
-      <w:commentRangeStart w:id="8"/>
+      <w:commentRangeStart w:id="9"/>
       <w:r>
         <w:rPr>
           <w:rFonts w:ascii="Arial" w:hAnsi="Arial" w:cs="Arial"/>
@@ -17755,6 +17622,24 @@
         </w:rPr>
         <w:t>that occur during final feminization rather than the product of local E2 production</w:t>
       </w:r>
+      <w:commentRangeEnd w:id="9"/>
+      <w:r>
+        <w:rPr>
+          <w:rStyle w:val="CommentReference"/>
+          <w:rFonts w:ascii="Arial" w:hAnsi="Arial" w:cs="Arial"/>
+          <w:sz w:val="20"/>
+          <w:szCs w:val="20"/>
+        </w:rPr>
+        <w:commentReference w:id="9"/>
+      </w:r>
+      <w:r>
+        <w:rPr>
+          <w:rFonts w:ascii="Arial" w:hAnsi="Arial" w:cs="Arial"/>
+          <w:sz w:val="20"/>
+          <w:szCs w:val="20"/>
+        </w:rPr>
+        <w:t>. Thus, the transient reduction in brain aromatase appears to be u</w:t>
+      </w:r>
       <w:commentRangeEnd w:id="8"/>
       <w:r>
         <w:rPr>
@@ -17764,24 +17649,6 @@
           <w:szCs w:val="20"/>
         </w:rPr>
         <w:commentReference w:id="8"/>
-      </w:r>
-      <w:r>
-        <w:rPr>
-          <w:rFonts w:ascii="Arial" w:hAnsi="Arial" w:cs="Arial"/>
-          <w:sz w:val="20"/>
-          <w:szCs w:val="20"/>
-        </w:rPr>
-        <w:t>. Thus, the transient reduction in brain aromatase appears to be u</w:t>
-      </w:r>
-      <w:commentRangeEnd w:id="7"/>
-      <w:r>
-        <w:rPr>
-          <w:rStyle w:val="CommentReference"/>
-          <w:rFonts w:ascii="Arial" w:hAnsi="Arial" w:cs="Arial"/>
-          <w:sz w:val="20"/>
-          <w:szCs w:val="20"/>
-        </w:rPr>
-        <w:commentReference w:id="7"/>
       </w:r>
       <w:r>
         <w:rPr>
@@ -18073,16 +17940,7 @@
           <w:sz w:val="20"/>
           <w:szCs w:val="20"/>
         </w:rPr>
-        <w:t xml:space="preserve">+ neurons in the POA may </w:t>
-      </w:r>
-      <w:r>
-        <w:rPr>
-          <w:rFonts w:ascii="Arial" w:hAnsi="Arial" w:cs="Arial"/>
-          <w:sz w:val="20"/>
-          <w:szCs w:val="20"/>
-        </w:rPr>
-        <w:lastRenderedPageBreak/>
-        <w:t>contribute to neuroendocrine regulation of ovarian development, potentially through modulation of pituitary FSH release.</w:t>
+        <w:t>+ neurons in the POA may contribute to neuroendocrine regulation of ovarian development, potentially through modulation of pituitary FSH release.</w:t>
       </w:r>
     </w:p>
     <w:p>
@@ -18176,7 +18034,16 @@
           <w:sz w:val="20"/>
           <w:szCs w:val="20"/>
         </w:rPr>
-        <w:t xml:space="preserve">. In teleosts, neuropeptide Y (NPY) and neurokinin B (encoded by </w:t>
+        <w:t xml:space="preserve">. In teleosts, neuropeptide </w:t>
+      </w:r>
+      <w:r>
+        <w:rPr>
+          <w:rFonts w:ascii="Arial" w:hAnsi="Arial" w:cs="Arial"/>
+          <w:sz w:val="20"/>
+          <w:szCs w:val="20"/>
+        </w:rPr>
+        <w:lastRenderedPageBreak/>
+        <w:t xml:space="preserve">Y (NPY) and neurokinin B (encoded by </w:t>
       </w:r>
       <w:r>
         <w:rPr>
@@ -19981,7 +19848,6 @@
           <w:sz w:val="20"/>
           <w:szCs w:val="20"/>
         </w:rPr>
-        <w:lastRenderedPageBreak/>
         <w:t xml:space="preserve">Materials and </w:t>
       </w:r>
       <w:r>
@@ -20069,7 +19935,19 @@
           <w:lang w:eastAsia="ja-JP"/>
           <w14:ligatures w14:val="none"/>
         </w:rPr>
-        <w:t>) used in this study were first- or second-generation descendants of fish obtained from Oceans, Reefs, and Aquariums (Fort Pierce, FL). Fish were housed in either 20-gallon tall (24 × 12 × 16 in.) or 25-gallon cube (18 × 18 × 18 in.) centrally filtered aquariums, each containing a 6-in. terra cotta pot that served as a nest site and spawning substrate. Salinity was maintained at a specific gravity of 1.026, temperature at 26–28°C, and pH between 8.0 and 8.4. Tanks were illuminated with fluorescent and LED lighting on a 12:12 h light cycle (lights on at 07:00 h and off at 19:00 h). Fish were fed twice daily with Reef Nutrition TDO Chroma Boost pellets (Reed Mariculture Inc., Campbell, CA).</w:t>
+        <w:t xml:space="preserve">) used in this study were first- or second-generation descendants of fish obtained from Oceans, Reefs, and Aquariums (Fort Pierce, FL). Fish were housed in </w:t>
+      </w:r>
+      <w:r>
+        <w:rPr>
+          <w:rFonts w:ascii="Arial" w:eastAsia="Malgun Gothic" w:hAnsi="Arial" w:cs="Arial"/>
+          <w:kern w:val="0"/>
+          <w:sz w:val="20"/>
+          <w:szCs w:val="20"/>
+          <w:lang w:eastAsia="ja-JP"/>
+          <w14:ligatures w14:val="none"/>
+        </w:rPr>
+        <w:lastRenderedPageBreak/>
+        <w:t>either 20-gallon tall (24 × 12 × 16 in.) or 25-gallon cube (18 × 18 × 18 in.) centrally filtered aquariums, each containing a 6-in. terra cotta pot that served as a nest site and spawning substrate. Salinity was maintained at a specific gravity of 1.026, temperature at 26–28°C, and pH between 8.0 and 8.4. Tanks were illuminated with fluorescent and LED lighting on a 12:12 h light cycle (lights on at 07:00 h and off at 19:00 h). Fish were fed twice daily with Reef Nutrition TDO Chroma Boost pellets (Reed Mariculture Inc., Campbell, CA).</w:t>
       </w:r>
     </w:p>
     <w:p>
@@ -21002,19 +20880,7 @@
           <w:lang w:eastAsia="ja-JP"/>
           <w14:ligatures w14:val="none"/>
         </w:rPr>
-        <w:t xml:space="preserve">. We then allowed 24 </w:t>
-      </w:r>
-      <w:r>
-        <w:rPr>
-          <w:rFonts w:ascii="Arial" w:eastAsia="Malgun Gothic" w:hAnsi="Arial" w:cs="Arial"/>
-          <w:kern w:val="0"/>
-          <w:sz w:val="20"/>
-          <w:szCs w:val="20"/>
-          <w:lang w:eastAsia="ja-JP"/>
-          <w14:ligatures w14:val="none"/>
-        </w:rPr>
-        <w:lastRenderedPageBreak/>
-        <w:t>hours for the fish to acclimate to the new pot. One hour prior to recording, we placed a camera in front of the tank to allow acclimation. We then recorded parental care behaviors</w:t>
+        <w:t>. We then allowed 24 hours for the fish to acclimate to the new pot. One hour prior to recording, we placed a camera in front of the tank to allow acclimation. We then recorded parental care behaviors</w:t>
       </w:r>
       <w:r>
         <w:rPr>
@@ -21078,10 +20944,11 @@
           <w:kern w:val="0"/>
           <w:sz w:val="20"/>
           <w:szCs w:val="20"/>
+          <w:highlight w:val="yellow"/>
           <w:lang w:eastAsia="ja-JP"/>
           <w14:ligatures w14:val="none"/>
         </w:rPr>
-        <w:t>13</w:t>
+        <w:t>1</w:t>
       </w:r>
       <w:r>
         <w:rPr>
@@ -21089,10 +20956,11 @@
           <w:kern w:val="0"/>
           <w:sz w:val="20"/>
           <w:szCs w:val="20"/>
+          <w:highlight w:val="yellow"/>
           <w:lang w:eastAsia="ja-JP"/>
           <w14:ligatures w14:val="none"/>
         </w:rPr>
-        <w:t>)</w:t>
+        <w:t>6</w:t>
       </w:r>
       <w:r>
         <w:rPr>
@@ -21103,7 +20971,30 @@
           <w:lang w:eastAsia="ja-JP"/>
           <w14:ligatures w14:val="none"/>
         </w:rPr>
-        <w:t>. We analyzed these data using two linear regressions, one fitting the time spent in the nest to phase, and another fitting the sum of parental care behaviors to phase.</w:t>
+        <w:t>)</w:t>
+      </w:r>
+      <w:r>
+        <w:rPr>
+          <w:rFonts w:ascii="Arial" w:eastAsia="Malgun Gothic" w:hAnsi="Arial" w:cs="Arial"/>
+          <w:kern w:val="0"/>
+          <w:sz w:val="20"/>
+          <w:szCs w:val="20"/>
+          <w:lang w:eastAsia="ja-JP"/>
+          <w14:ligatures w14:val="none"/>
+        </w:rPr>
+        <w:t xml:space="preserve">. We analyzed these data using two </w:t>
+      </w:r>
+      <w:r>
+        <w:rPr>
+          <w:rFonts w:ascii="Arial" w:eastAsia="Malgun Gothic" w:hAnsi="Arial" w:cs="Arial"/>
+          <w:kern w:val="0"/>
+          <w:sz w:val="20"/>
+          <w:szCs w:val="20"/>
+          <w:lang w:eastAsia="ja-JP"/>
+          <w14:ligatures w14:val="none"/>
+        </w:rPr>
+        <w:lastRenderedPageBreak/>
+        <w:t>linear regressions, one fitting the time spent in the nest to phase, and another fitting the sum of parental care behaviors to phase.</w:t>
       </w:r>
     </w:p>
     <w:p>
@@ -21597,8 +21488,593 @@
           <w:sz w:val="20"/>
           <w:szCs w:val="20"/>
         </w:rPr>
+        <w:tab/>
+      </w:r>
+      <w:r>
+        <w:rPr>
+          <w:rFonts w:ascii="Arial" w:hAnsi="Arial" w:cs="Arial"/>
+          <w:color w:val="000000" w:themeColor="text1"/>
+          <w:sz w:val="20"/>
+          <w:szCs w:val="20"/>
+        </w:rPr>
+        <w:t xml:space="preserve">Nuclei isolation was adapted from the 10x Genomics Isolation of Nuclei for Single Cell Multiome ATAC + Gene Expression Demonstrated Protocol. Frozen specimens were thawed in 500 μL of 0.1× Lysis Buffer, partially homogenized by pipetting, and incubated for 10 min on an orbital shaker at 4°C. </w:t>
+      </w:r>
+      <w:r>
+        <w:rPr>
+          <w:rFonts w:ascii="Arial" w:hAnsi="Arial" w:cs="Arial"/>
+          <w:color w:val="000000" w:themeColor="text1"/>
+          <w:sz w:val="20"/>
+          <w:szCs w:val="20"/>
+        </w:rPr>
+        <w:lastRenderedPageBreak/>
+        <w:t>Following incubation, 500 μL of wash buffer was added, and samples were aspirated using a fire-polished, silanized pipette and mixed until complete homogenization was achieved. Samples were passed through a 70 μm cell strainer and centrifuged at 500 × g for 8 min at 4°C. The supernatant was discarded, and the pellet was resuspended in 1 mL of wash buffer.</w:t>
+      </w:r>
+    </w:p>
+    <w:p>
+      <w:pPr>
+        <w:pStyle w:val="Default"/>
+        <w:rPr>
+          <w:rFonts w:ascii="Arial" w:hAnsi="Arial" w:cs="Arial"/>
+          <w:color w:val="000000" w:themeColor="text1"/>
+          <w:sz w:val="20"/>
+          <w:szCs w:val="20"/>
+        </w:rPr>
+      </w:pPr>
+    </w:p>
+    <w:p>
+      <w:pPr>
+        <w:pStyle w:val="Default"/>
+        <w:rPr>
+          <w:rFonts w:ascii="Arial" w:hAnsi="Arial" w:cs="Arial"/>
+          <w:color w:val="000000" w:themeColor="text1"/>
+          <w:sz w:val="20"/>
+          <w:szCs w:val="20"/>
+        </w:rPr>
+      </w:pPr>
+      <w:r>
+        <w:rPr>
+          <w:rFonts w:ascii="Arial" w:hAnsi="Arial" w:cs="Arial"/>
+          <w:color w:val="000000" w:themeColor="text1"/>
+          <w:sz w:val="20"/>
+          <w:szCs w:val="20"/>
+        </w:rPr>
+        <w:tab/>
+        <w:t>All subsequent steps were performed at 4°C. Samples were mixed, passed through a 30 μm cell strainer, rinsed with 200 μL of wash buffer, and centrifuged at 500 × g for 5 min. The supernatant was discarded, and the pellet was resuspended in 1 mL of wash buffer. This wash and centrifugation step was repeated twice. Samples were then passed through a chilled 20 μm cell strainer and centrifuged at 500 × g for 5 min. The supernatant was discarded, and the pellet was resuspended in 500 μL of final resuspension buffer. Samples were filtered once more through a 20 μm cell strainer and gently mixed by repeated aspiration and dispensing. Ten microliters of each final nuclei suspension was mixed with 10 μL of 0.4% Trypan Blue. Nuclei were visualized using a hemocytometer at 10×, 20×, and 40× magnification and assessed for blebbing and debris. Final nuclei concentrations ranged from 3,230 to 8,060 nuclei/μL.</w:t>
+      </w:r>
+    </w:p>
+    <w:p>
+      <w:pPr>
+        <w:pStyle w:val="Default"/>
+        <w:rPr>
+          <w:rFonts w:ascii="Arial" w:hAnsi="Arial" w:cs="Arial"/>
+          <w:color w:val="000000" w:themeColor="text1"/>
+          <w:sz w:val="20"/>
+          <w:szCs w:val="20"/>
+        </w:rPr>
+      </w:pPr>
+    </w:p>
+    <w:p>
+      <w:pPr>
+        <w:rPr>
+          <w:rFonts w:ascii="Arial" w:hAnsi="Arial" w:cs="Arial"/>
+          <w:sz w:val="20"/>
+          <w:szCs w:val="20"/>
+          <w:u w:val="single"/>
+        </w:rPr>
+      </w:pPr>
+      <w:r>
+        <w:rPr>
+          <w:rFonts w:ascii="Arial" w:hAnsi="Arial" w:cs="Arial"/>
+          <w:sz w:val="20"/>
+          <w:szCs w:val="20"/>
+          <w:u w:val="single"/>
+        </w:rPr>
+        <w:t>Library Construction, Sequencing, and Demultiplexing</w:t>
+      </w:r>
+    </w:p>
+    <w:p>
+      <w:pPr>
+        <w:ind w:firstLine="720"/>
+        <w:rPr>
+          <w:rFonts w:ascii="Arial" w:hAnsi="Arial" w:cs="Arial"/>
+          <w:sz w:val="20"/>
+          <w:szCs w:val="20"/>
+        </w:rPr>
+      </w:pPr>
+      <w:r>
+        <w:rPr>
+          <w:rFonts w:ascii="Arial" w:hAnsi="Arial" w:cs="Arial"/>
+          <w:sz w:val="20"/>
+          <w:szCs w:val="20"/>
+        </w:rPr>
+        <w:t xml:space="preserve">Droplet-based barcoding, library preparation, and sequencing were performed at the Georgia Institute of Technology Parker H. Petit Institute for Bioengineering and Bioscience Genome Analysis Core using the 10x Genomics platform. Samples were sequenced on an Illumina NovaSeq 6000 S4 (Illumina Inc., San Diego, CA) to a depth of approximately 110,000 reads per nucleus for the GEX and ATAC modalities. Reads were aligned to the </w:t>
+      </w:r>
+      <w:r>
+        <w:rPr>
+          <w:rFonts w:ascii="Arial" w:hAnsi="Arial" w:cs="Arial"/>
+          <w:i/>
+          <w:iCs/>
+          <w:sz w:val="20"/>
+          <w:szCs w:val="20"/>
+        </w:rPr>
+        <w:t>Amphiprion ocellaris</w:t>
+      </w:r>
+      <w:r>
+        <w:rPr>
+          <w:rFonts w:ascii="Arial" w:hAnsi="Arial" w:cs="Arial"/>
+          <w:sz w:val="20"/>
+          <w:szCs w:val="20"/>
+        </w:rPr>
+        <w:t xml:space="preserve"> RefSeq genome assembly (GCF_022539595.1).</w:t>
+      </w:r>
+    </w:p>
+    <w:p>
+      <w:pPr>
+        <w:ind w:firstLine="720"/>
+        <w:rPr>
+          <w:rFonts w:ascii="Arial" w:hAnsi="Arial" w:cs="Arial"/>
+          <w:sz w:val="20"/>
+          <w:szCs w:val="20"/>
+        </w:rPr>
+      </w:pPr>
+    </w:p>
+    <w:p>
+      <w:pPr>
+        <w:ind w:firstLine="720"/>
+        <w:rPr>
+          <w:rFonts w:ascii="Arial" w:hAnsi="Arial" w:cs="Arial"/>
+          <w:sz w:val="20"/>
+          <w:szCs w:val="20"/>
+        </w:rPr>
+      </w:pPr>
+      <w:r>
+        <w:rPr>
+          <w:rFonts w:ascii="Arial" w:hAnsi="Arial" w:cs="Arial"/>
+          <w:sz w:val="20"/>
+          <w:szCs w:val="20"/>
+        </w:rPr>
+        <w:t>To enable assignment of nuclei to individual fish, we also sequenced genomic DNA from each individual. DNA was extracted from fin tissue using the DNeasy Blood &amp; Tissue Kit (Qiagen, catalog no. 69504; Qiagen, Valencia, CA) and sequenced at the University of Illinois Roy J. Carver Biotechnology Center using an Illumina NovaSeq X Plus (Illumina Inc., San Diego, CA) with a 10B flow cell. BAM files were generated from each individual’s genomic DNA sequence data, and variants identified from genomic DNA and nuclear RNA were used to assign nuclei to individuals using a combination of Demuxlet</w:t>
+      </w:r>
+      <w:r>
+        <w:rPr>
+          <w:rFonts w:ascii="Arial" w:hAnsi="Arial" w:cs="Arial"/>
+          <w:sz w:val="20"/>
+          <w:szCs w:val="20"/>
+        </w:rPr>
+        <w:t xml:space="preserve"> </w:t>
+      </w:r>
+      <w:r>
+        <w:rPr>
+          <w:rFonts w:ascii="Arial" w:hAnsi="Arial" w:cs="Arial"/>
+          <w:sz w:val="20"/>
+          <w:szCs w:val="20"/>
+        </w:rPr>
+        <w:fldChar w:fldCharType="begin"/>
+      </w:r>
+      <w:r>
+        <w:rPr>
+          <w:rFonts w:ascii="Arial" w:hAnsi="Arial" w:cs="Arial"/>
+          <w:sz w:val="20"/>
+          <w:szCs w:val="20"/>
+        </w:rPr>
+        <w:instrText xml:space="preserve"> ADDIN ZOTERO_ITEM CSL_CITATION {"citationID":"xArGHkso","properties":{"unsorted":false,"formattedCitation":"(60)","plainCitation":"(60)","noteIndex":0},"citationItems":[{"id":3487,"uris":["http://zotero.org/users/11313215/items/68FTNPIR"],"itemData":{"id":3487,"type":"article-journal","abstract":"Droplet single-cell RNA-seq is applied to large numbers of pooled samples from unrelated individuals.","container-title":"Nature Biotechnology","DOI":"10.1038/nbt.4042","ISSN":"1546-1696","issue":"1","journalAbbreviation":"Nat Biotechnol","language":"en","license":"2017 Springer Nature America, Inc.","page":"89-94","publisher":"Nature Publishing Group","source":"www.nature.com","title":"Multiplexed droplet single-cell RNA-sequencing using natural genetic variation","volume":"36","author":[{"family":"Kang","given":"Hyun Min"},{"family":"Subramaniam","given":"Meena"},{"family":"Targ","given":"Sasha"},{"family":"Nguyen","given":"Michelle"},{"family":"Maliskova","given":"Lenka"},{"family":"McCarthy","given":"Elizabeth"},{"family":"Wan","given":"Eunice"},{"family":"Wong","given":"Simon"},{"family":"Byrnes","given":"Lauren"},{"family":"Lanata","given":"Cristina M."},{"family":"Gate","given":"Rachel E."},{"family":"Mostafavi","given":"Sara"},{"family":"Marson","given":"Alexander"},{"family":"Zaitlen","given":"Noah"},{"family":"Criswell","given":"Lindsey A."},{"family":"Ye","given":"Chun Jimmie"}],"issued":{"date-parts":[["2018",1]]}}}],"schema":"https://github.com/citation-style-language/schema/raw/master/csl-citation.json"} </w:instrText>
+      </w:r>
+      <w:r>
+        <w:rPr>
+          <w:rFonts w:ascii="Arial" w:hAnsi="Arial" w:cs="Arial"/>
+          <w:sz w:val="20"/>
+          <w:szCs w:val="20"/>
+        </w:rPr>
+        <w:fldChar w:fldCharType="separate"/>
+      </w:r>
+      <w:r>
+        <w:rPr>
+          <w:rFonts w:ascii="Arial" w:hAnsi="Arial" w:cs="Arial"/>
+          <w:noProof/>
+          <w:sz w:val="20"/>
+          <w:szCs w:val="20"/>
+        </w:rPr>
+        <w:t>(60)</w:t>
+      </w:r>
+      <w:r>
+        <w:rPr>
+          <w:rFonts w:ascii="Arial" w:hAnsi="Arial" w:cs="Arial"/>
+          <w:sz w:val="20"/>
+          <w:szCs w:val="20"/>
+        </w:rPr>
+        <w:fldChar w:fldCharType="end"/>
+      </w:r>
+      <w:r>
+        <w:rPr>
+          <w:rFonts w:ascii="Arial" w:hAnsi="Arial" w:cs="Arial"/>
+          <w:sz w:val="20"/>
+          <w:szCs w:val="20"/>
+        </w:rPr>
+        <w:t xml:space="preserve"> </w:t>
+      </w:r>
+      <w:r>
+        <w:rPr>
+          <w:rFonts w:ascii="Arial" w:hAnsi="Arial" w:cs="Arial"/>
+          <w:sz w:val="20"/>
+          <w:szCs w:val="20"/>
+        </w:rPr>
+        <w:t>and Souporcell</w:t>
+      </w:r>
+      <w:r>
+        <w:rPr>
+          <w:rFonts w:ascii="Arial" w:hAnsi="Arial" w:cs="Arial"/>
+          <w:sz w:val="20"/>
+          <w:szCs w:val="20"/>
+        </w:rPr>
+        <w:fldChar w:fldCharType="begin"/>
+      </w:r>
+      <w:r>
+        <w:rPr>
+          <w:rFonts w:ascii="Arial" w:hAnsi="Arial" w:cs="Arial"/>
+          <w:sz w:val="20"/>
+          <w:szCs w:val="20"/>
+        </w:rPr>
+        <w:instrText xml:space="preserve"> ADDIN ZOTERO_ITEM CSL_CITATION {"citationID":"xBZXVSII","properties":{"unsorted":false,"formattedCitation":"(61)","plainCitation":"(61)","noteIndex":0},"citationItems":[{"id":3486,"uris":["http://zotero.org/users/11313215/items/SQPJSPNF"],"itemData":{"id":3486,"type":"article-journal","abstract":"Methods to deconvolve single-cell RNA-sequencing (scRNA-seq) data are necessary for samples containing a mixture of genotypes, whether they are natural or experimentally combined. Multiplexing across donors is a popular experimental design that can avoid batch effects, reduce costs and improve doublet detection. By using variants detected in scRNA-seq reads, it is possible to assign cells to their donor of origin and identify cross-genotype doublets that may have highly similar transcriptional profiles, precluding detection by transcriptional profile. More subtle cross-genotype variant contamination can be used to estimate the amount of ambient RNA. Ambient RNA is caused by cell lysis before droplet partitioning and is an important confounder of scRNA-seq analysis. Here we develop souporcell, a method to cluster cells using the genetic variants detected within the scRNA-seq reads. We show that it achieves high accuracy on genotype clustering, doublet detection and ambient RNA estimation, as demonstrated across a range of challenging scenarios.","container-title":"Nature Methods","DOI":"10.1038/s41592-020-0820-1","ISSN":"1548-7105","issue":"6","journalAbbreviation":"Nat Methods","language":"en","license":"2020 The Author(s), under exclusive licence to Springer Nature America, Inc.","page":"615-620","publisher":"Nature Publishing Group","source":"www.nature.com","title":"Souporcell: robust clustering of single-cell RNA-seq data by genotype without reference genotypes","title-short":"Souporcell","volume":"17","author":[{"family":"Heaton","given":"Haynes"},{"family":"Talman","given":"Arthur M."},{"family":"Knights","given":"Andrew"},{"family":"Imaz","given":"Maria"},{"family":"Gaffney","given":"Daniel J."},{"family":"Durbin","given":"Richard"},{"family":"Hemberg","given":"Martin"},{"family":"Lawniczak","given":"Mara K. N."}],"issued":{"date-parts":[["2020",6]]}}}],"schema":"https://github.com/citation-style-language/schema/raw/master/csl-citation.json"} </w:instrText>
+      </w:r>
+      <w:r>
+        <w:rPr>
+          <w:rFonts w:ascii="Arial" w:hAnsi="Arial" w:cs="Arial"/>
+          <w:sz w:val="20"/>
+          <w:szCs w:val="20"/>
+        </w:rPr>
+        <w:fldChar w:fldCharType="separate"/>
+      </w:r>
+      <w:r>
+        <w:rPr>
+          <w:rFonts w:ascii="Arial" w:hAnsi="Arial" w:cs="Arial"/>
+          <w:noProof/>
+          <w:sz w:val="20"/>
+          <w:szCs w:val="20"/>
+        </w:rPr>
+        <w:t>(61)</w:t>
+      </w:r>
+      <w:r>
+        <w:rPr>
+          <w:rFonts w:ascii="Arial" w:hAnsi="Arial" w:cs="Arial"/>
+          <w:sz w:val="20"/>
+          <w:szCs w:val="20"/>
+        </w:rPr>
+        <w:fldChar w:fldCharType="end"/>
+      </w:r>
+      <w:r>
+        <w:rPr>
+          <w:rFonts w:ascii="Arial" w:hAnsi="Arial" w:cs="Arial"/>
+          <w:sz w:val="20"/>
+          <w:szCs w:val="20"/>
+        </w:rPr>
+        <w:t>.</w:t>
+      </w:r>
+    </w:p>
+    <w:p>
+      <w:pPr>
+        <w:ind w:firstLine="720"/>
+        <w:rPr>
+          <w:rFonts w:ascii="Arial" w:hAnsi="Arial" w:cs="Arial"/>
+          <w:sz w:val="20"/>
+          <w:szCs w:val="20"/>
+        </w:rPr>
+      </w:pPr>
+    </w:p>
+    <w:p>
+      <w:pPr>
+        <w:ind w:firstLine="720"/>
+        <w:rPr>
+          <w:rFonts w:ascii="Arial" w:hAnsi="Arial" w:cs="Arial"/>
+          <w:sz w:val="20"/>
+          <w:szCs w:val="20"/>
+        </w:rPr>
+      </w:pPr>
+      <w:r>
+        <w:rPr>
+          <w:rFonts w:ascii="Arial" w:hAnsi="Arial" w:cs="Arial"/>
+          <w:sz w:val="20"/>
+          <w:szCs w:val="20"/>
+        </w:rPr>
+        <w:t>Cell Ranger ARC was used to demultiplex sequencing BCL files and generate FASTQ files for GEX and ATAC reads, create the reference genome package, perform cell calling for both modalities, and align reads to the reference genome. EmptyDropsMultiome</w:t>
+      </w:r>
+      <w:r>
+        <w:rPr>
+          <w:rFonts w:ascii="Arial" w:hAnsi="Arial" w:cs="Arial"/>
+          <w:sz w:val="20"/>
+          <w:szCs w:val="20"/>
+        </w:rPr>
+        <w:t xml:space="preserve"> </w:t>
+      </w:r>
+      <w:r>
+        <w:rPr>
+          <w:rFonts w:ascii="Arial" w:hAnsi="Arial" w:cs="Arial"/>
+          <w:sz w:val="20"/>
+          <w:szCs w:val="20"/>
+        </w:rPr>
+        <w:fldChar w:fldCharType="begin"/>
+      </w:r>
+      <w:r>
+        <w:rPr>
+          <w:rFonts w:ascii="Arial" w:hAnsi="Arial" w:cs="Arial"/>
+          <w:sz w:val="20"/>
+          <w:szCs w:val="20"/>
+        </w:rPr>
+        <w:instrText xml:space="preserve"> ADDIN ZOTERO_ITEM CSL_CITATION {"citationID":"9TcRkEOW","properties":{"unsorted":false,"formattedCitation":"(62)","plainCitation":"(62)","noteIndex":0},"citationItems":[{"id":3471,"uris":["http://zotero.org/users/11313215/items/S6LZL9KP"],"itemData":{"id":3471,"type":"article-journal","abstract":"Multiomic droplet-based technologies allow different molecular modalities, such as chromatin accessibility and gene expression (scATAC-seq and scRNA-seq), to be probed in the same nucleus. We develop EmptyDropsMultiome, an approach that distinguishes true nuclei-containing droplets from background. Using simulations, we show that EmptyDropsMultiome has higher statistical power and accuracy than existing approaches, including CellRanger-arc and EmptyDrops. On real datasets, we observe that CellRanger-arc misses more than half of the nuclei identified by EmptyDropsMultiome and, moreover, is biased against certain cell types, some of which have a retrieval rate lower than 20%.","container-title":"Genome Biology","DOI":"10.1186/s13059-024-03259-x","ISSN":"1474-760X","issue":"1","journalAbbreviation":"Genome Biology","page":"121","source":"BioMed Central","title":"EmptyDropsMultiome discriminates real cells from background in single-cell multiomics assays","volume":"25","author":[{"family":"Megas","given":"Stathis"},{"family":"Lorenzi","given":"Valentina"},{"family":"Marioni","given":"John C."}],"issued":{"date-parts":[["2024",5,13]]}}}],"schema":"https://github.com/citation-style-language/schema/raw/master/csl-citation.json"} </w:instrText>
+      </w:r>
+      <w:r>
+        <w:rPr>
+          <w:rFonts w:ascii="Arial" w:hAnsi="Arial" w:cs="Arial"/>
+          <w:sz w:val="20"/>
+          <w:szCs w:val="20"/>
+        </w:rPr>
+        <w:fldChar w:fldCharType="separate"/>
+      </w:r>
+      <w:r>
+        <w:rPr>
+          <w:rFonts w:ascii="Arial" w:hAnsi="Arial" w:cs="Arial"/>
+          <w:noProof/>
+          <w:sz w:val="20"/>
+          <w:szCs w:val="20"/>
+        </w:rPr>
+        <w:t>(62)</w:t>
+      </w:r>
+      <w:r>
+        <w:rPr>
+          <w:rFonts w:ascii="Arial" w:hAnsi="Arial" w:cs="Arial"/>
+          <w:sz w:val="20"/>
+          <w:szCs w:val="20"/>
+        </w:rPr>
+        <w:fldChar w:fldCharType="end"/>
+      </w:r>
+      <w:r>
+        <w:rPr>
+          <w:rFonts w:ascii="Arial" w:hAnsi="Arial" w:cs="Arial"/>
+          <w:sz w:val="20"/>
+          <w:szCs w:val="20"/>
+        </w:rPr>
+        <w:t xml:space="preserve"> was then used to distinguish nuclei-containing droplets from empty droplets and identify background, ambient RNA, and multiplets. Souporcell was additionally used to validate singlets and multiplets identified by EmptyDropsMultiome.</w:t>
+      </w:r>
+    </w:p>
+    <w:p>
+      <w:pPr>
+        <w:ind w:firstLine="720"/>
+        <w:rPr>
+          <w:rFonts w:ascii="Arial" w:hAnsi="Arial" w:cs="Arial"/>
+          <w:sz w:val="20"/>
+          <w:szCs w:val="20"/>
+        </w:rPr>
+      </w:pPr>
+    </w:p>
+    <w:p>
+      <w:pPr>
+        <w:ind w:firstLine="720"/>
+        <w:rPr>
+          <w:rFonts w:ascii="Arial" w:hAnsi="Arial" w:cs="Arial"/>
+          <w:sz w:val="20"/>
+          <w:szCs w:val="20"/>
+        </w:rPr>
+      </w:pPr>
+      <w:r>
+        <w:rPr>
+          <w:rFonts w:ascii="Arial" w:hAnsi="Arial" w:cs="Arial"/>
+          <w:sz w:val="20"/>
+          <w:szCs w:val="20"/>
+        </w:rPr>
+        <w:t>Finally, we used MACS3 for ATAC-seq peak calling in place of the default Cell Ranger ARC peak calls because Cell Ranger ARC can merge distinct peaks located in close genomic proximity. MACS3 was also used to generate a unified peak set across all pooled samples.</w:t>
+      </w:r>
+    </w:p>
+    <w:p>
+      <w:pPr>
+        <w:rPr>
+          <w:rFonts w:ascii="Arial" w:hAnsi="Arial" w:cs="Arial"/>
+          <w:sz w:val="20"/>
+          <w:szCs w:val="20"/>
+        </w:rPr>
+      </w:pPr>
+    </w:p>
+    <w:p>
+      <w:pPr>
+        <w:pStyle w:val="Default"/>
+        <w:rPr>
+          <w:rFonts w:ascii="Arial" w:hAnsi="Arial" w:cs="Arial"/>
+          <w:color w:val="000000" w:themeColor="text1"/>
+          <w:sz w:val="20"/>
+          <w:szCs w:val="20"/>
+          <w:u w:val="single"/>
+        </w:rPr>
+      </w:pPr>
+      <w:r>
+        <w:rPr>
+          <w:rFonts w:ascii="Arial" w:hAnsi="Arial" w:cs="Arial"/>
+          <w:color w:val="000000" w:themeColor="text1"/>
+          <w:sz w:val="20"/>
+          <w:szCs w:val="20"/>
+          <w:u w:val="single"/>
+        </w:rPr>
+        <w:t xml:space="preserve">Quality Control </w:t>
+      </w:r>
+    </w:p>
+    <w:p>
+      <w:pPr>
+        <w:pStyle w:val="Default"/>
+        <w:rPr>
+          <w:rFonts w:ascii="Arial" w:hAnsi="Arial" w:cs="Arial"/>
+          <w:color w:val="000000" w:themeColor="text1"/>
+          <w:sz w:val="20"/>
+          <w:szCs w:val="20"/>
+        </w:rPr>
+      </w:pPr>
+      <w:r>
+        <w:rPr>
+          <w:rFonts w:ascii="Arial" w:hAnsi="Arial" w:cs="Arial"/>
+          <w:color w:val="000000" w:themeColor="text1"/>
+          <w:sz w:val="20"/>
+          <w:szCs w:val="20"/>
+        </w:rPr>
+        <w:t>Quality control was initially performed separately for each pool to identify high-quality nuclei and remove low-quality barcodes. Variable feature analysis was used to identify nuclei with low gene expression variability. On</w:t>
+      </w:r>
+      <w:commentRangeStart w:id="10"/>
+      <w:commentRangeStart w:id="11"/>
+      <w:r>
+        <w:rPr>
+          <w:rFonts w:ascii="Arial" w:hAnsi="Arial" w:cs="Arial"/>
+          <w:color w:val="000000" w:themeColor="text1"/>
+          <w:sz w:val="20"/>
+          <w:szCs w:val="20"/>
+        </w:rPr>
+        <w:t>ly barcodes containing at least 55% of highly variable genes were retained. In</w:t>
+      </w:r>
+      <w:commentRangeEnd w:id="10"/>
+      <w:r>
+        <w:rPr>
+          <w:rStyle w:val="CommentReference"/>
+          <w:rFonts w:ascii="Arial" w:hAnsi="Arial" w:cs="Arial"/>
+          <w:color w:val="000000" w:themeColor="text1"/>
+          <w:sz w:val="20"/>
+          <w:szCs w:val="20"/>
+        </w:rPr>
+        <w:commentReference w:id="10"/>
+      </w:r>
+      <w:commentRangeEnd w:id="11"/>
+      <w:r>
+        <w:rPr>
+          <w:rStyle w:val="CommentReference"/>
+          <w:rFonts w:ascii="Arial" w:hAnsi="Arial" w:cs="Arial"/>
+          <w:color w:val="000000" w:themeColor="text1"/>
+          <w:sz w:val="20"/>
+          <w:szCs w:val="20"/>
+        </w:rPr>
+        <w:commentReference w:id="11"/>
+      </w:r>
+      <w:r>
+        <w:rPr>
+          <w:rFonts w:ascii="Arial" w:hAnsi="Arial" w:cs="Arial"/>
+          <w:color w:val="000000" w:themeColor="text1"/>
+          <w:sz w:val="20"/>
+          <w:szCs w:val="20"/>
+        </w:rPr>
+        <w:t xml:space="preserve"> addition, barcodes in which the top 50 or top 100 most highly expressed genes accounted for more than 50% or 60% of total gene expression, respectively, were removed.</w:t>
+      </w:r>
+    </w:p>
+    <w:p>
+      <w:pPr>
+        <w:pStyle w:val="Default"/>
+        <w:rPr>
+          <w:rFonts w:ascii="Arial" w:hAnsi="Arial" w:cs="Arial"/>
+          <w:color w:val="000000" w:themeColor="text1"/>
+          <w:sz w:val="20"/>
+          <w:szCs w:val="20"/>
+        </w:rPr>
+      </w:pPr>
+    </w:p>
+    <w:p>
+      <w:pPr>
+        <w:pStyle w:val="Default"/>
+        <w:rPr>
+          <w:rFonts w:ascii="Arial" w:hAnsi="Arial" w:cs="Arial"/>
+          <w:color w:val="000000" w:themeColor="text1"/>
+          <w:sz w:val="20"/>
+          <w:szCs w:val="20"/>
+        </w:rPr>
+      </w:pPr>
+      <w:commentRangeStart w:id="12"/>
+      <w:commentRangeStart w:id="13"/>
+      <w:r>
+        <w:rPr>
+          <w:rFonts w:ascii="Arial" w:hAnsi="Arial" w:cs="Arial"/>
+          <w:color w:val="000000" w:themeColor="text1"/>
+          <w:sz w:val="20"/>
+          <w:szCs w:val="20"/>
+        </w:rPr>
+        <w:t>Following pool-level quality control, samples were merged and additional filtering was performed on the combined dataset. Nuclei were retained if they met the following criteria: 200 &lt; nCount_RNA &lt; 25,000; 200 &lt; nFeature_RNA &lt; 9,000; nCount_ATAC &lt; 25,000; nFeature_ATAC &lt; 16,000; mitochondrial reads &lt; 12%; protein-coding reads &gt; 85%; ribosomal reads &lt; 3%; TSS enrichment &gt; 0.8; and nucleosome signal &lt; 2.</w:t>
+      </w:r>
+      <w:commentRangeEnd w:id="12"/>
+      <w:r>
+        <w:rPr>
+          <w:rStyle w:val="CommentReference"/>
+          <w:rFonts w:ascii="Arial" w:hAnsi="Arial" w:cs="Arial"/>
+          <w:color w:val="000000" w:themeColor="text1"/>
+          <w:sz w:val="20"/>
+          <w:szCs w:val="20"/>
+        </w:rPr>
+        <w:commentReference w:id="12"/>
+      </w:r>
+      <w:commentRangeEnd w:id="13"/>
+      <w:r>
+        <w:rPr>
+          <w:rStyle w:val="CommentReference"/>
+          <w:rFonts w:ascii="Arial" w:hAnsi="Arial" w:cs="Arial"/>
+          <w:color w:val="000000" w:themeColor="text1"/>
+          <w:sz w:val="20"/>
+          <w:szCs w:val="20"/>
+        </w:rPr>
+        <w:commentReference w:id="13"/>
+      </w:r>
+    </w:p>
+    <w:p>
+      <w:pPr>
+        <w:rPr>
+          <w:rFonts w:ascii="Arial" w:hAnsi="Arial" w:cs="Arial"/>
+          <w:sz w:val="20"/>
+          <w:szCs w:val="20"/>
+          <w:u w:val="single"/>
+        </w:rPr>
+      </w:pPr>
+    </w:p>
+    <w:p>
+      <w:pPr>
+        <w:pStyle w:val="Default"/>
+        <w:rPr>
+          <w:rFonts w:ascii="Arial" w:hAnsi="Arial" w:cs="Arial"/>
+          <w:color w:val="000000" w:themeColor="text1"/>
+          <w:sz w:val="20"/>
+          <w:szCs w:val="20"/>
+          <w:u w:val="single"/>
+        </w:rPr>
+      </w:pPr>
+      <w:r>
+        <w:rPr>
+          <w:rFonts w:ascii="Arial" w:hAnsi="Arial" w:cs="Arial"/>
+          <w:color w:val="000000" w:themeColor="text1"/>
+          <w:sz w:val="20"/>
+          <w:szCs w:val="20"/>
+          <w:u w:val="single"/>
+        </w:rPr>
+        <w:t xml:space="preserve">Normalization and Initial Clustering </w:t>
+      </w:r>
+    </w:p>
+    <w:p>
+      <w:pPr>
+        <w:pStyle w:val="Default"/>
+        <w:rPr>
+          <w:rFonts w:ascii="Arial" w:hAnsi="Arial" w:cs="Arial"/>
+          <w:color w:val="000000" w:themeColor="text1"/>
+          <w:sz w:val="20"/>
+          <w:szCs w:val="20"/>
+          <w:u w:val="single"/>
+        </w:rPr>
+      </w:pPr>
+    </w:p>
+    <w:p>
+      <w:pPr>
+        <w:pStyle w:val="Default"/>
+        <w:rPr>
+          <w:rFonts w:ascii="Arial" w:hAnsi="Arial" w:cs="Arial"/>
+          <w:color w:val="000000" w:themeColor="text1"/>
+          <w:sz w:val="20"/>
+          <w:szCs w:val="20"/>
+        </w:rPr>
+      </w:pPr>
+      <w:r>
+        <w:rPr>
+          <w:rFonts w:ascii="Arial" w:hAnsi="Arial" w:cs="Arial"/>
+          <w:color w:val="000000" w:themeColor="text1"/>
+          <w:sz w:val="20"/>
+          <w:szCs w:val="20"/>
+        </w:rPr>
         <w:lastRenderedPageBreak/>
         <w:tab/>
+        <w:t xml:space="preserve">Clustering was performed broadly following a standard Seurat pipeline. For the RNA modality, raw counts were normalized using LogNormalize() in Seurat. The top variable features were identified using FindVariableFeatures() (nfeatures = 4,000), and data were scaled using ScaleData() (scale.max = 50). Dimensionality reduction was then performed using RunPCA() (npcs = 50), followed by integration using IntegrateLayers() with HarmonyIntegration() </w:t>
       </w:r>
       <w:r>
         <w:rPr>
@@ -21607,7 +22083,53 @@
           <w:sz w:val="20"/>
           <w:szCs w:val="20"/>
         </w:rPr>
-        <w:t>Nuclei isolation was adapted from the 10x Genomics Isolation of Nuclei for Single Cell Multiome ATAC + Gene Expression Demonstrated Protocol. Frozen specimens were thawed in 500 μL of 0.1× Lysis Buffer, partially homogenized by pipetting, and incubated for 10 min on an orbital shaker at 4°C. Following incubation, 500 μL of wash buffer was added, and samples were aspirated using a fire-polished, silanized pipette and mixed until complete homogenization was achieved. Samples were passed through a 70 μm cell strainer and centrifuged at 500 × g for 8 min at 4°C. The supernatant was discarded, and the pellet was resuspended in 1 mL of wash buffer.</w:t>
+        <w:fldChar w:fldCharType="begin"/>
+      </w:r>
+      <w:r>
+        <w:rPr>
+          <w:rFonts w:ascii="Arial" w:hAnsi="Arial" w:cs="Arial"/>
+          <w:color w:val="000000" w:themeColor="text1"/>
+          <w:sz w:val="20"/>
+          <w:szCs w:val="20"/>
+        </w:rPr>
+        <w:instrText xml:space="preserve"> ADDIN ZOTERO_ITEM CSL_CITATION {"citationID":"HuavlTFa","properties":{"unsorted":false,"formattedCitation":"(63)","plainCitation":"(63)","noteIndex":0},"citationItems":[{"id":3208,"uris":["http://zotero.org/users/11313215/items/LZ5PT7U5"],"itemData":{"id":3208,"type":"article-journal","abstract":"The emerging diversity of single cell RNAseq datasets allows for the full transcriptional characterization of cell types across a wide variety of biological and clinical conditions. However, it is challenging to analyze them together, particularly when datasets are assayed with different technologies. Here, real biological differences are interspersed with technical differences. We present Harmony, an algorithm that projects cells into a shared embedding in which cells group by cell type rather than dataset-specific conditions. Harmony simultaneously accounts for multiple experimental and biological factors. In six analyses, we demonstrate the superior performance of Harmony to previously published algorithms. We show that Harmony requires dramatically fewer computational resources. It is the only currently available algorithm that makes the integration of ~106 cells feasible on a personal computer. We apply Harmony to PBMCs from datasets with large experimental differences, 5 studies of pancreatic islet cells, mouse embryogenesis datasets, and cross-modality spatial integration.","container-title":"Nature methods","DOI":"10.1038/s41592-019-0619-0","ISSN":"1548-7091","issue":"12","journalAbbreviation":"Nat Methods","page":"1289-1296","PMID":"31740819","PMCID":"PMC6884693","source":"PubMed Central","title":"Fast, sensitive, and accurate integration of single cell data with Harmony","volume":"16","author":[{"family":"Korsunsky","given":"Ilya"},{"family":"Millard","given":"Nghia"},{"family":"Fan","given":"Jean"},{"family":"Slowikowski","given":"Kamil"},{"family":"Zhang","given":"Fan"},{"family":"Wei","given":"Kevin"},{"family":"Baglaenko","given":"Yuriy"},{"family":"Brenner","given":"Michael"},{"family":"Loh","given":"Po-ru"},{"family":"Raychaudhuri","given":"Soumya"}],"issued":{"date-parts":[["2019",12]]}}}],"schema":"https://github.com/citation-style-language/schema/raw/master/csl-citation.json"} </w:instrText>
+      </w:r>
+      <w:r>
+        <w:rPr>
+          <w:rFonts w:ascii="Arial" w:hAnsi="Arial" w:cs="Arial"/>
+          <w:color w:val="000000" w:themeColor="text1"/>
+          <w:sz w:val="20"/>
+          <w:szCs w:val="20"/>
+        </w:rPr>
+        <w:fldChar w:fldCharType="separate"/>
+      </w:r>
+      <w:r>
+        <w:rPr>
+          <w:rFonts w:ascii="Arial" w:hAnsi="Arial" w:cs="Arial"/>
+          <w:noProof/>
+          <w:color w:val="000000" w:themeColor="text1"/>
+          <w:sz w:val="20"/>
+          <w:szCs w:val="20"/>
+        </w:rPr>
+        <w:t>(63)</w:t>
+      </w:r>
+      <w:r>
+        <w:rPr>
+          <w:rFonts w:ascii="Arial" w:hAnsi="Arial" w:cs="Arial"/>
+          <w:color w:val="000000" w:themeColor="text1"/>
+          <w:sz w:val="20"/>
+          <w:szCs w:val="20"/>
+        </w:rPr>
+        <w:fldChar w:fldCharType="end"/>
+      </w:r>
+      <w:r>
+        <w:rPr>
+          <w:rFonts w:ascii="Arial" w:hAnsi="Arial" w:cs="Arial"/>
+          <w:color w:val="000000" w:themeColor="text1"/>
+          <w:sz w:val="20"/>
+          <w:szCs w:val="20"/>
+        </w:rPr>
+        <w:t>.</w:t>
       </w:r>
     </w:p>
     <w:p>
@@ -21638,16 +22160,197 @@
           <w:sz w:val="20"/>
           <w:szCs w:val="20"/>
         </w:rPr>
+        <w:t>For the ATAC modality, the top features within each sequencing pool were identified using FindTopFeatures() (min.cutoff = 10). Term frequency–inverse document frequency (TF-IDF) normalization was performed using RunTFIDF(), followed by singular value decomposition using RunSVD() (n = 50) with features identified by FindTopFeatures(). Pools were then merged, and the same processing steps were applied to the combined dataset. Integration anchors were identified using FindIntegrationAnchors() (anchor.features = VariableFeatures, dims = 2:30, n.trees = 100, l2.norm = FALSE, scale = FALSE, max.features = 500). IntegrateEmbeddings() was then used with these anchors to generate a unified latent semantic indexing (LSI) reduction.</w:t>
+      </w:r>
+    </w:p>
+    <w:p>
+      <w:pPr>
+        <w:pStyle w:val="Default"/>
+        <w:rPr>
+          <w:rFonts w:ascii="Arial" w:hAnsi="Arial" w:cs="Arial"/>
+          <w:color w:val="000000" w:themeColor="text1"/>
+          <w:sz w:val="20"/>
+          <w:szCs w:val="20"/>
+        </w:rPr>
+      </w:pPr>
+    </w:p>
+    <w:p>
+      <w:pPr>
+        <w:pStyle w:val="Default"/>
+        <w:rPr>
+          <w:rFonts w:ascii="Arial" w:hAnsi="Arial" w:cs="Arial"/>
+          <w:color w:val="000000" w:themeColor="text1"/>
+          <w:sz w:val="20"/>
+          <w:szCs w:val="20"/>
+        </w:rPr>
+      </w:pPr>
+      <w:r>
+        <w:rPr>
+          <w:rFonts w:ascii="Arial" w:hAnsi="Arial" w:cs="Arial"/>
+          <w:color w:val="000000" w:themeColor="text1"/>
+          <w:sz w:val="20"/>
+          <w:szCs w:val="20"/>
+        </w:rPr>
+        <w:t xml:space="preserve">A weighted nearest-neighbor graph integrating both modalities was constructed using FindMultiModalNeighbors() (RNA dimensions = 1:50; ATAC dimensions = 2:50; prune.SNN = 0), using the RNA Harmony and ATAC LSI reductions. A uniform manifold approximation and projection (UMAP) was generated using RunUMAP() (min.dist = 0.4, metric = "euclidean"), and clusters were identified using FindClusters() (algorithm = 3, resolution = 0.4). An initial clustering resolution of 0.4 was selected based on the method described by Bai and Chu (2024) </w:t>
+      </w:r>
+      <w:r>
+        <w:rPr>
+          <w:rFonts w:ascii="Arial" w:hAnsi="Arial" w:cs="Arial"/>
+          <w:color w:val="000000" w:themeColor="text1"/>
+          <w:sz w:val="20"/>
+          <w:szCs w:val="20"/>
+        </w:rPr>
+        <w:fldChar w:fldCharType="begin"/>
+      </w:r>
+      <w:r>
+        <w:rPr>
+          <w:rFonts w:ascii="Arial" w:hAnsi="Arial" w:cs="Arial"/>
+          <w:color w:val="000000" w:themeColor="text1"/>
+          <w:sz w:val="20"/>
+          <w:szCs w:val="20"/>
+        </w:rPr>
+        <w:instrText xml:space="preserve"> ADDIN ZOTERO_ITEM CSL_CITATION {"citationID":"gGtPOlyE","properties":{"unsorted":false,"formattedCitation":"(64)","plainCitation":"(64)","noteIndex":0},"citationItems":[{"id":3490,"uris":["http://zotero.org/users/11313215/items/8DNNEG88"],"itemData":{"id":3490,"type":"article","abstract":"We consider the problem of estimating the number of clusters (k) in a dataset. We propose a non-parametric approach to the problem that utilizes similarity graphs to construct a robust statistic that effectively captures similarity information among observations. This graph-based statistic is applicable to datasets of any dimension, is computationally efficient to obtain, and can be paired with any kind of clustering technique. Asymptotic theory is developed to establish the selection consistency of the proposed approach. Simulation studies demonstrate that the graph-based statistic outperforms existing methods for estimating k, especially in the high-dimensional setting. We illustrate its utility on an imaging dataset and an RNA-seq dataset.","DOI":"10.48550/arXiv.2402.15600","note":"arXiv:2402.15600 [stat]","number":"arXiv:2402.15600","publisher":"arXiv","source":"arXiv.org","title":"A Graph-based Approach to Estimating the Number of Clusters","URL":"http://arxiv.org/abs/2402.15600","author":[{"family":"Bai","given":"Yichuan"},{"family":"Chu","given":"Lynna"}],"accessed":{"date-parts":[["2025",3,11]]},"issued":{"date-parts":[["2024",11,5]]}}}],"schema":"https://github.com/citation-style-language/schema/raw/master/csl-citation.json"} </w:instrText>
+      </w:r>
+      <w:r>
+        <w:rPr>
+          <w:rFonts w:ascii="Arial" w:hAnsi="Arial" w:cs="Arial"/>
+          <w:color w:val="000000" w:themeColor="text1"/>
+          <w:sz w:val="20"/>
+          <w:szCs w:val="20"/>
+        </w:rPr>
+        <w:fldChar w:fldCharType="separate"/>
+      </w:r>
+      <w:r>
+        <w:rPr>
+          <w:rFonts w:ascii="Arial" w:hAnsi="Arial" w:cs="Arial"/>
+          <w:noProof/>
+          <w:color w:val="000000" w:themeColor="text1"/>
+          <w:sz w:val="20"/>
+          <w:szCs w:val="20"/>
+        </w:rPr>
+        <w:t>(64)</w:t>
+      </w:r>
+      <w:r>
+        <w:rPr>
+          <w:rFonts w:ascii="Arial" w:hAnsi="Arial" w:cs="Arial"/>
+          <w:color w:val="000000" w:themeColor="text1"/>
+          <w:sz w:val="20"/>
+          <w:szCs w:val="20"/>
+        </w:rPr>
+        <w:fldChar w:fldCharType="end"/>
+      </w:r>
+      <w:r>
+        <w:rPr>
+          <w:rFonts w:ascii="Arial" w:hAnsi="Arial" w:cs="Arial"/>
+          <w:color w:val="000000" w:themeColor="text1"/>
+          <w:sz w:val="20"/>
+          <w:szCs w:val="20"/>
+        </w:rPr>
+        <w:t>.</w:t>
+      </w:r>
+    </w:p>
+    <w:p>
+      <w:pPr>
+        <w:rPr>
+          <w:rFonts w:ascii="Arial" w:hAnsi="Arial" w:cs="Arial"/>
+          <w:sz w:val="20"/>
+          <w:szCs w:val="20"/>
+        </w:rPr>
+      </w:pPr>
+    </w:p>
+    <w:p>
+      <w:pPr>
+        <w:rPr>
+          <w:rFonts w:ascii="Arial" w:hAnsi="Arial" w:cs="Arial"/>
+          <w:sz w:val="20"/>
+          <w:szCs w:val="20"/>
+          <w:u w:val="single"/>
+        </w:rPr>
+      </w:pPr>
+      <w:r>
+        <w:rPr>
+          <w:rFonts w:ascii="Arial" w:hAnsi="Arial" w:cs="Arial"/>
+          <w:sz w:val="20"/>
+          <w:szCs w:val="20"/>
+          <w:u w:val="single"/>
+        </w:rPr>
+        <w:t xml:space="preserve">Removal of </w:t>
+      </w:r>
+      <w:r>
+        <w:rPr>
+          <w:rFonts w:ascii="Arial" w:hAnsi="Arial" w:cs="Arial"/>
+          <w:sz w:val="20"/>
+          <w:szCs w:val="20"/>
+          <w:u w:val="single"/>
+        </w:rPr>
+        <w:t>D</w:t>
+      </w:r>
+      <w:r>
+        <w:rPr>
+          <w:rFonts w:ascii="Arial" w:hAnsi="Arial" w:cs="Arial"/>
+          <w:sz w:val="20"/>
+          <w:szCs w:val="20"/>
+          <w:u w:val="single"/>
+        </w:rPr>
+        <w:t xml:space="preserve">issection </w:t>
+      </w:r>
+      <w:r>
+        <w:rPr>
+          <w:rFonts w:ascii="Arial" w:hAnsi="Arial" w:cs="Arial"/>
+          <w:sz w:val="20"/>
+          <w:szCs w:val="20"/>
+          <w:u w:val="single"/>
+        </w:rPr>
+        <w:t>E</w:t>
+      </w:r>
+      <w:r>
+        <w:rPr>
+          <w:rFonts w:ascii="Arial" w:hAnsi="Arial" w:cs="Arial"/>
+          <w:sz w:val="20"/>
+          <w:szCs w:val="20"/>
+          <w:u w:val="single"/>
+        </w:rPr>
+        <w:t>rrors</w:t>
+      </w:r>
+    </w:p>
+    <w:p>
+      <w:pPr>
+        <w:rPr>
+          <w:rFonts w:ascii="Arial" w:hAnsi="Arial" w:cs="Arial"/>
+          <w:sz w:val="20"/>
+          <w:szCs w:val="20"/>
+        </w:rPr>
+      </w:pPr>
+      <w:r>
+        <w:rPr>
+          <w:rFonts w:ascii="Arial" w:hAnsi="Arial" w:cs="Arial"/>
+          <w:sz w:val="20"/>
+          <w:szCs w:val="20"/>
+        </w:rPr>
         <w:tab/>
-        <w:t>All subsequent steps were performed at 4°C. Samples were mixed, passed through a 30 μm cell strainer, rinsed with 200 μL of wash buffer, and centrifuged at 500 × g for 5 min. The supernatant was discarded, and the pellet was resuspended in 1 mL of wash buffer. This wash and centrifugation step was repeated twice. Samples were then passed through a chilled 20 μm cell strainer and centrifuged at 500 × g for 5 min. The supernatant was discarded, and the pellet was resuspended in 500 μL of final resuspension buffer. Samples were filtered once more through a 20 μm cell strainer and gently mixed by repeated aspiration and dispensing. Ten microliters of each final nuclei suspension was mixed with 10 μL of 0.4% Trypan Blue. Nuclei were visualized using a hemocytometer at 10×, 20×, and 40× magnification and assessed for blebbing and debris. Final nuclei concentrations ranged from 3,230 to 8,060 nuclei/μL.</w:t>
-      </w:r>
-    </w:p>
-    <w:p>
-      <w:pPr>
-        <w:pStyle w:val="Default"/>
-        <w:rPr>
-          <w:rFonts w:ascii="Arial" w:hAnsi="Arial" w:cs="Arial"/>
-          <w:color w:val="000000" w:themeColor="text1"/>
+        <w:t xml:space="preserve">To remove clusters likely the result of </w:t>
+      </w:r>
+      <w:r>
+        <w:rPr>
+          <w:rFonts w:ascii="Arial" w:hAnsi="Arial" w:cs="Arial"/>
+          <w:sz w:val="20"/>
+          <w:szCs w:val="20"/>
+        </w:rPr>
+        <w:t>dissection errors, we first excluded any clusters that appeared in. &lt; 90% of individuals. Next, we calculated the coefficient of variation (CV) for each clusters relative abundance across all individuals and excluded any clusters with a CV higher than</w:t>
+      </w:r>
+      <w:r>
+        <w:rPr>
+          <w:rFonts w:ascii="Arial" w:hAnsi="Arial" w:cs="Arial"/>
+          <w:sz w:val="20"/>
+          <w:szCs w:val="20"/>
+        </w:rPr>
+        <w:t xml:space="preserve"> 50. </w:t>
+      </w:r>
+    </w:p>
+    <w:p>
+      <w:pPr>
+        <w:rPr>
+          <w:rFonts w:ascii="Arial" w:hAnsi="Arial" w:cs="Arial"/>
           <w:sz w:val="20"/>
           <w:szCs w:val="20"/>
         </w:rPr>
@@ -21669,8 +22372,332 @@
           <w:szCs w:val="20"/>
           <w:u w:val="single"/>
         </w:rPr>
-        <w:t>Library Construction, Sequencing, and Demultiplexing</w:t>
-      </w:r>
+        <w:t>Final</w:t>
+      </w:r>
+      <w:r>
+        <w:rPr>
+          <w:rFonts w:ascii="Arial" w:hAnsi="Arial" w:cs="Arial"/>
+          <w:sz w:val="20"/>
+          <w:szCs w:val="20"/>
+          <w:u w:val="single"/>
+        </w:rPr>
+        <w:t xml:space="preserve"> Clustering</w:t>
+      </w:r>
+    </w:p>
+    <w:p>
+      <w:pPr>
+        <w:rPr>
+          <w:rFonts w:ascii="Arial" w:hAnsi="Arial" w:cs="Arial"/>
+          <w:sz w:val="20"/>
+          <w:szCs w:val="20"/>
+        </w:rPr>
+      </w:pPr>
+      <w:r>
+        <w:rPr>
+          <w:rFonts w:ascii="Arial" w:hAnsi="Arial" w:cs="Arial"/>
+          <w:sz w:val="20"/>
+          <w:szCs w:val="20"/>
+        </w:rPr>
+        <w:tab/>
+        <w:t xml:space="preserve">In order to find the optimal set of parameters for </w:t>
+      </w:r>
+      <w:r>
+        <w:rPr>
+          <w:rFonts w:ascii="Arial" w:hAnsi="Arial" w:cs="Arial"/>
+          <w:sz w:val="20"/>
+          <w:szCs w:val="20"/>
+        </w:rPr>
+        <w:t xml:space="preserve">WNN clustering, we next performed a parameter sweep across RNA principal </w:t>
+      </w:r>
+      <w:r>
+        <w:rPr>
+          <w:rFonts w:ascii="Arial" w:hAnsi="Arial" w:cs="Arial"/>
+          <w:sz w:val="20"/>
+          <w:szCs w:val="20"/>
+        </w:rPr>
+        <w:t>componen</w:t>
+      </w:r>
+      <w:r>
+        <w:rPr>
+          <w:rFonts w:ascii="Arial" w:hAnsi="Arial" w:cs="Arial"/>
+          <w:sz w:val="20"/>
+          <w:szCs w:val="20"/>
+        </w:rPr>
+        <w:t>ts (30-50), ATAC LSI com</w:t>
+      </w:r>
+      <w:r>
+        <w:rPr>
+          <w:rFonts w:ascii="Arial" w:hAnsi="Arial" w:cs="Arial"/>
+          <w:sz w:val="20"/>
+          <w:szCs w:val="20"/>
+        </w:rPr>
+        <w:t>po</w:t>
+      </w:r>
+      <w:r>
+        <w:rPr>
+          <w:rFonts w:ascii="Arial" w:hAnsi="Arial" w:cs="Arial"/>
+          <w:sz w:val="20"/>
+          <w:szCs w:val="20"/>
+        </w:rPr>
+        <w:t>nents (2-50), k-nearest neighbors (30, 40, 50), and Leiden clustering resolution (0.4-1.5). We then selected the combination with the highest mean pairwise Adjusted Rand Index, resulting in our final clustering resolution for downstream analysis being composed of 40 RNA principal components, 45 ATAC LSI components, and 0.8 clustering resolution.</w:t>
+      </w:r>
+    </w:p>
+    <w:p>
+      <w:pPr>
+        <w:rPr>
+          <w:rFonts w:ascii="Arial" w:hAnsi="Arial" w:cs="Arial"/>
+          <w:sz w:val="20"/>
+          <w:szCs w:val="20"/>
+        </w:rPr>
+      </w:pPr>
+    </w:p>
+    <w:p>
+      <w:pPr>
+        <w:rPr>
+          <w:rFonts w:ascii="Arial" w:hAnsi="Arial" w:cs="Arial"/>
+          <w:b/>
+          <w:bCs/>
+          <w:sz w:val="20"/>
+          <w:szCs w:val="20"/>
+        </w:rPr>
+      </w:pPr>
+      <w:r>
+        <w:rPr>
+          <w:rFonts w:ascii="Arial" w:hAnsi="Arial" w:cs="Arial"/>
+          <w:b/>
+          <w:bCs/>
+          <w:sz w:val="20"/>
+          <w:szCs w:val="20"/>
+        </w:rPr>
+        <w:t>Spatial Transcriptomics</w:t>
+      </w:r>
+    </w:p>
+    <w:p>
+      <w:pPr>
+        <w:rPr>
+          <w:rFonts w:ascii="Arial" w:hAnsi="Arial" w:cs="Arial"/>
+          <w:sz w:val="20"/>
+          <w:szCs w:val="20"/>
+          <w:u w:val="single"/>
+        </w:rPr>
+      </w:pPr>
+    </w:p>
+    <w:p>
+      <w:pPr>
+        <w:rPr>
+          <w:rFonts w:ascii="Arial" w:hAnsi="Arial" w:cs="Arial"/>
+          <w:sz w:val="20"/>
+          <w:szCs w:val="20"/>
+          <w:u w:val="single"/>
+        </w:rPr>
+      </w:pPr>
+      <w:r>
+        <w:rPr>
+          <w:rFonts w:ascii="Arial" w:hAnsi="Arial" w:cs="Arial"/>
+          <w:sz w:val="20"/>
+          <w:szCs w:val="20"/>
+          <w:u w:val="single"/>
+        </w:rPr>
+        <w:t>Tissue Collection and Sectioning</w:t>
+      </w:r>
+    </w:p>
+    <w:p>
+      <w:pPr>
+        <w:rPr>
+          <w:rFonts w:ascii="Arial" w:hAnsi="Arial" w:cs="Arial"/>
+          <w:sz w:val="20"/>
+          <w:szCs w:val="20"/>
+          <w:u w:val="single"/>
+        </w:rPr>
+      </w:pPr>
+    </w:p>
+    <w:p>
+      <w:pPr>
+        <w:rPr>
+          <w:rFonts w:ascii="Arial" w:hAnsi="Arial" w:cs="Arial"/>
+          <w:sz w:val="20"/>
+          <w:szCs w:val="20"/>
+        </w:rPr>
+      </w:pPr>
+      <w:r>
+        <w:rPr>
+          <w:rFonts w:ascii="Arial" w:hAnsi="Arial" w:cs="Arial"/>
+          <w:sz w:val="20"/>
+          <w:szCs w:val="20"/>
+        </w:rPr>
+        <w:t>Six males and six females from six tanks containing established male–female reproductive pairs were sampled (12 fish total</w:t>
+      </w:r>
+      <w:commentRangeStart w:id="14"/>
+      <w:r>
+        <w:rPr>
+          <w:rFonts w:ascii="Arial" w:hAnsi="Arial" w:cs="Arial"/>
+          <w:sz w:val="20"/>
+          <w:szCs w:val="20"/>
+        </w:rPr>
+        <w:t xml:space="preserve">; </w:t>
+      </w:r>
+      <w:r>
+        <w:rPr>
+          <w:rFonts w:ascii="Arial" w:hAnsi="Arial" w:cs="Arial"/>
+          <w:sz w:val="20"/>
+          <w:szCs w:val="20"/>
+          <w:highlight w:val="yellow"/>
+        </w:rPr>
+        <w:t xml:space="preserve">see Supplementary Table </w:t>
+      </w:r>
+      <w:r>
+        <w:rPr>
+          <w:rFonts w:ascii="Arial" w:hAnsi="Arial" w:cs="Arial"/>
+          <w:sz w:val="20"/>
+          <w:szCs w:val="20"/>
+          <w:highlight w:val="yellow"/>
+        </w:rPr>
+        <w:t>xx</w:t>
+      </w:r>
+      <w:r>
+        <w:rPr>
+          <w:rFonts w:ascii="Arial" w:hAnsi="Arial" w:cs="Arial"/>
+          <w:sz w:val="20"/>
+          <w:szCs w:val="20"/>
+          <w:highlight w:val="yellow"/>
+        </w:rPr>
+        <w:t xml:space="preserve"> for lengths and weights</w:t>
+      </w:r>
+      <w:commentRangeEnd w:id="14"/>
+      <w:r>
+        <w:rPr>
+          <w:rStyle w:val="CommentReference"/>
+          <w:rFonts w:ascii="Arial" w:hAnsi="Arial" w:cs="Arial"/>
+          <w:sz w:val="20"/>
+          <w:szCs w:val="20"/>
+        </w:rPr>
+        <w:commentReference w:id="14"/>
+      </w:r>
+      <w:r>
+        <w:rPr>
+          <w:rFonts w:ascii="Arial" w:hAnsi="Arial" w:cs="Arial"/>
+          <w:sz w:val="20"/>
+          <w:szCs w:val="20"/>
+        </w:rPr>
+        <w:t>). Fish were decapitated, and brains were rapidly removed and placed in molds containing chilled OCT maintained at wet-ice temperature. Each mold contained four brains representing two reproductive pairs from two tanks (two males and two females). Brains were arranged with the anterior end facing down and the spinal cord facing up, with the two female brains positioned in the top row and the two male brains in the bottom row. This arrangement was designed to maximize the amount of brain tissue that could be accommodated within the capture area of each Visium HD slide.</w:t>
+      </w:r>
+    </w:p>
+    <w:p>
+      <w:pPr>
+        <w:rPr>
+          <w:rFonts w:ascii="Arial" w:hAnsi="Arial" w:cs="Arial"/>
+          <w:sz w:val="20"/>
+          <w:szCs w:val="20"/>
+        </w:rPr>
+      </w:pPr>
+    </w:p>
+    <w:p>
+      <w:pPr>
+        <w:rPr>
+          <w:rFonts w:ascii="Arial" w:hAnsi="Arial" w:cs="Arial"/>
+          <w:sz w:val="20"/>
+          <w:szCs w:val="20"/>
+        </w:rPr>
+      </w:pPr>
+      <w:r>
+        <w:rPr>
+          <w:rFonts w:ascii="Arial" w:hAnsi="Arial" w:cs="Arial"/>
+          <w:sz w:val="20"/>
+          <w:szCs w:val="20"/>
+        </w:rPr>
+        <w:t>Following embedding, molds were frozen at −80°C and transferred directly to a cryostat for fresh-frozen sectioning. Brains were sectioned at 10 μm, and sections were selected for Visium HD based on tissue quality and anatomical coverage, with the goal of maximizing the brain area represented and sampling across the rostrocaudal extent of the dissected regions. Four sections were placed on each Visium HD slide, with each section containing tissue from four fish representing two tanks. Four Visium HD slides were prepared. Two slides contained sections from the same four fish (two reproductive pairs), whereas the remaining two slides contained sections from the other eight fish (four reproductive pairs). Thus, all 12 fish were represented across the four slides, with four fish represented on two slides.</w:t>
+      </w:r>
+    </w:p>
+    <w:p>
+      <w:pPr>
+        <w:rPr>
+          <w:rFonts w:ascii="Arial" w:hAnsi="Arial" w:cs="Arial"/>
+          <w:sz w:val="20"/>
+          <w:szCs w:val="20"/>
+        </w:rPr>
+      </w:pPr>
+    </w:p>
+    <w:p>
+      <w:pPr>
+        <w:rPr>
+          <w:rFonts w:ascii="Arial" w:hAnsi="Arial" w:cs="Arial"/>
+          <w:sz w:val="20"/>
+          <w:szCs w:val="20"/>
+        </w:rPr>
+      </w:pPr>
+      <w:r>
+        <w:rPr>
+          <w:rFonts w:ascii="Arial" w:hAnsi="Arial" w:cs="Arial"/>
+          <w:sz w:val="20"/>
+          <w:szCs w:val="20"/>
+        </w:rPr>
+        <w:t>Sections were briefly thawed to promote adherence to the slide and then immediately returned to frozen conditions on dry ice or at −80°C until Visium HD processing. Although every effort was made to maintain a consistent plane of section, some brains were sectioned at slightly oblique angles.</w:t>
+      </w:r>
+    </w:p>
+    <w:p>
+      <w:pPr>
+        <w:rPr>
+          <w:rFonts w:ascii="Arial" w:hAnsi="Arial" w:cs="Arial"/>
+          <w:sz w:val="20"/>
+          <w:szCs w:val="20"/>
+        </w:rPr>
+      </w:pPr>
+    </w:p>
+    <w:p>
+      <w:pPr>
+        <w:rPr>
+          <w:rFonts w:ascii="Arial" w:hAnsi="Arial" w:cs="Arial"/>
+          <w:sz w:val="20"/>
+          <w:szCs w:val="20"/>
+          <w:u w:val="single"/>
+        </w:rPr>
+      </w:pPr>
+      <w:commentRangeStart w:id="15"/>
+      <w:r>
+        <w:rPr>
+          <w:rFonts w:ascii="Arial" w:hAnsi="Arial" w:cs="Arial"/>
+          <w:sz w:val="20"/>
+          <w:szCs w:val="20"/>
+          <w:u w:val="single"/>
+        </w:rPr>
+        <w:t>Visium HD</w:t>
+      </w:r>
+      <w:r>
+        <w:rPr>
+          <w:rFonts w:ascii="Arial" w:hAnsi="Arial" w:cs="Arial"/>
+          <w:sz w:val="20"/>
+          <w:szCs w:val="20"/>
+          <w:u w:val="single"/>
+        </w:rPr>
+        <w:t xml:space="preserve"> </w:t>
+      </w:r>
+      <w:r>
+        <w:rPr>
+          <w:rFonts w:ascii="Arial" w:hAnsi="Arial" w:cs="Arial"/>
+          <w:sz w:val="20"/>
+          <w:szCs w:val="20"/>
+          <w:u w:val="single"/>
+        </w:rPr>
+        <w:t>3’ Spatial transcriptomic</w:t>
+      </w:r>
+      <w:r>
+        <w:rPr>
+          <w:rFonts w:ascii="Arial" w:hAnsi="Arial" w:cs="Arial"/>
+          <w:sz w:val="20"/>
+          <w:szCs w:val="20"/>
+          <w:u w:val="single"/>
+        </w:rPr>
+        <w:t>s</w:t>
+      </w:r>
+    </w:p>
+    <w:p>
+      <w:pPr>
+        <w:rPr>
+          <w:rFonts w:ascii="Arial" w:hAnsi="Arial" w:cs="Arial"/>
+          <w:sz w:val="20"/>
+          <w:szCs w:val="20"/>
+        </w:rPr>
+      </w:pPr>
     </w:p>
     <w:p>
       <w:pPr>
@@ -21687,7 +22714,309 @@
           <w:sz w:val="20"/>
           <w:szCs w:val="20"/>
         </w:rPr>
-        <w:t xml:space="preserve">Droplet-based barcoding, library preparation, and sequencing were performed at the Georgia Institute of Technology Parker H. Petit Institute for Bioengineering and Bioscience Genome Analysis Core using the 10x Genomics platform. Samples were sequenced on an Illumina NovaSeq 6000 S4 (Illumina Inc., San Diego, CA) to a depth of approximately 110,000 reads per nucleus for the GEX and ATAC modalities. Reads were aligned to the </w:t>
+        <w:t>For Visium HD 3′ Spatial Gene Expression analysis, fresh frozen tissue sections were prepared according to the manufacturer's recommended tissue preparation workflow (CG000804, Rev B, 10x Genomics, USA). The workflow includes tissue sectioning, fixation, hematoxylin and eosin (H&amp;E) staining, and imaging. Visium HD 3′ is designed specifically for fresh frozen tissue and uses polyadenylated RNA for whole transcriptome capture. Following tissue fixation, sections were stained with H&amp;E to visualize tissue morphology. The stained tissue sections were imaged using a high-resolution microscope, generating a brightfield image for subsequent spatial registration and analysis. Following imaging, (Visium HD 3' Spatial Gene Expression, CG000805, Rev B) the tissue slide was aligned with the Visium HD 3′ spatial capture slide using the Visium CytAssist instrument. The CytAssist system positions the tissue section relative to the spatially barcoded capture surface. The tissue was subsequently processed to allow release of cellular RNA. Polyadenylated RNA molecules released from the tissue were captured by oligonucleotides containing spatial barcodes, unique molecular identifiers (UMIs), and poly(dT) sequences. The poly(dT) sequences hybridize to the poly(A) tails of mRNA molecules. This results in each captured transcript being associated with a spatial barcode corresponding to its original location in the tissue. Captured RNA was subjected to reverse transcription to generate spatially barcoded cDNA. During this process, the spatial barcode and UMI information become associated with the resulting cDNA molecules.</w:t>
+      </w:r>
+      <w:commentRangeEnd w:id="15"/>
+      <w:r>
+        <w:rPr>
+          <w:rStyle w:val="CommentReference"/>
+          <w:rFonts w:ascii="Arial" w:hAnsi="Arial" w:cs="Arial"/>
+          <w:sz w:val="20"/>
+          <w:szCs w:val="20"/>
+        </w:rPr>
+        <w:commentReference w:id="15"/>
+      </w:r>
+    </w:p>
+    <w:p>
+      <w:pPr>
+        <w:rPr>
+          <w:rFonts w:ascii="Arial" w:hAnsi="Arial" w:cs="Arial"/>
+          <w:sz w:val="20"/>
+          <w:szCs w:val="20"/>
+        </w:rPr>
+      </w:pPr>
+    </w:p>
+    <w:p>
+      <w:pPr>
+        <w:rPr>
+          <w:rFonts w:ascii="Arial" w:hAnsi="Arial" w:cs="Arial"/>
+          <w:sz w:val="20"/>
+          <w:szCs w:val="20"/>
+          <w:u w:val="single"/>
+        </w:rPr>
+      </w:pPr>
+      <w:r>
+        <w:rPr>
+          <w:rFonts w:ascii="Arial" w:hAnsi="Arial" w:cs="Arial"/>
+          <w:sz w:val="20"/>
+          <w:szCs w:val="20"/>
+          <w:u w:val="single"/>
+        </w:rPr>
+        <w:t>Final construction and sequencing of 10x Visium libraries</w:t>
+      </w:r>
+    </w:p>
+    <w:p>
+      <w:pPr>
+        <w:rPr>
+          <w:rFonts w:ascii="Arial" w:hAnsi="Arial" w:cs="Arial"/>
+          <w:sz w:val="20"/>
+          <w:szCs w:val="20"/>
+        </w:rPr>
+      </w:pPr>
+    </w:p>
+    <w:p>
+      <w:pPr>
+        <w:ind w:firstLine="720"/>
+        <w:rPr>
+          <w:rFonts w:ascii="Arial" w:hAnsi="Arial" w:cs="Arial"/>
+          <w:sz w:val="20"/>
+          <w:szCs w:val="20"/>
+        </w:rPr>
+      </w:pPr>
+      <w:r>
+        <w:rPr>
+          <w:rFonts w:ascii="Arial" w:hAnsi="Arial" w:cs="Arial"/>
+          <w:sz w:val="20"/>
+          <w:szCs w:val="20"/>
+        </w:rPr>
+        <w:t xml:space="preserve">Spatially barcoded cDNAs were immediately brought to the </w:t>
+      </w:r>
+      <w:r>
+        <w:rPr>
+          <w:rFonts w:ascii="Arial" w:hAnsi="Arial" w:cs="Arial"/>
+          <w:sz w:val="20"/>
+          <w:szCs w:val="20"/>
+        </w:rPr>
+        <w:t xml:space="preserve">UIUC Carver Biotech </w:t>
+      </w:r>
+      <w:r>
+        <w:rPr>
+          <w:rFonts w:ascii="Arial" w:hAnsi="Arial" w:cs="Arial"/>
+          <w:sz w:val="20"/>
+          <w:szCs w:val="20"/>
+        </w:rPr>
+        <w:t>DNA Services Core for amplification, strictly following the 10x Genomics Visium HD 3’ Fresh Frozen protocol. The amplified cDNAs were enzymatically fragmented and converted into sequencing-ready, dual-indexed libraries through standard end-repair, A-tailing, adaptor ligation, and PCR. The final libraries were quantitated on Qubit (Life Technologies, Grand Island, NY) and the average size determined on the Fragment Analyzer (Agilent Technologies, Santa Clara, CA). The libraries were pooled by calculated capture spot coverage via Loupe Browser and the pool diluted to 5nM concentration, then further quantitated by qPCR on a Bio-Rad CFX Connect Real-Time System (Bio-Rad Laboratories, Inc. CA). The final pool was sequenced on one lane of 25B flowcell on an Illumina NovaSeq X Plus (Illumina, San Diego, CA) to a length of 43nt (read 1, contains the spot barcode and unique molecular identifier used for removing PCR duplicates), 10nt for each index (libraries contain unique dual indexes to prevent index switching) and 75nt for read 2 (the cDNA read). Fastq.gz files were generated and demultiplexed with bcl-convert v4.3.6 Conversion Software (Illumina).</w:t>
+      </w:r>
+    </w:p>
+    <w:p>
+      <w:pPr>
+        <w:rPr>
+          <w:rFonts w:ascii="Arial" w:hAnsi="Arial" w:cs="Arial"/>
+          <w:sz w:val="20"/>
+          <w:szCs w:val="20"/>
+          <w:u w:val="single"/>
+        </w:rPr>
+      </w:pPr>
+    </w:p>
+    <w:p>
+      <w:pPr>
+        <w:rPr>
+          <w:rFonts w:ascii="Arial" w:hAnsi="Arial" w:cs="Arial"/>
+          <w:sz w:val="20"/>
+          <w:szCs w:val="20"/>
+          <w:u w:val="single"/>
+        </w:rPr>
+      </w:pPr>
+      <w:r>
+        <w:rPr>
+          <w:rFonts w:ascii="Arial" w:hAnsi="Arial" w:cs="Arial"/>
+          <w:sz w:val="20"/>
+          <w:szCs w:val="20"/>
+          <w:u w:val="single"/>
+        </w:rPr>
+        <w:t>Read Alignment</w:t>
+      </w:r>
+    </w:p>
+    <w:p>
+      <w:pPr>
+        <w:rPr>
+          <w:rFonts w:ascii="Arial" w:hAnsi="Arial" w:cs="Arial"/>
+          <w:sz w:val="20"/>
+          <w:szCs w:val="20"/>
+        </w:rPr>
+      </w:pPr>
+      <w:r>
+        <w:rPr>
+          <w:rFonts w:ascii="Arial" w:hAnsi="Arial" w:cs="Arial"/>
+          <w:sz w:val="20"/>
+          <w:szCs w:val="20"/>
+        </w:rPr>
+        <w:tab/>
+      </w:r>
+      <w:commentRangeStart w:id="16"/>
+      <w:r>
+        <w:rPr>
+          <w:rFonts w:ascii="Arial" w:hAnsi="Arial" w:cs="Arial"/>
+          <w:sz w:val="20"/>
+          <w:szCs w:val="20"/>
+        </w:rPr>
+        <w:t xml:space="preserve">Reads were aligned using space ranger version </w:t>
+      </w:r>
+      <w:r>
+        <w:rPr>
+          <w:rFonts w:ascii="Arial" w:hAnsi="Arial" w:cs="Arial"/>
+          <w:sz w:val="20"/>
+          <w:szCs w:val="20"/>
+          <w:highlight w:val="yellow"/>
+        </w:rPr>
+        <w:t>xx</w:t>
+      </w:r>
+      <w:commentRangeEnd w:id="16"/>
+      <w:r>
+        <w:rPr>
+          <w:rStyle w:val="CommentReference"/>
+          <w:rFonts w:ascii="Arial" w:hAnsi="Arial" w:cs="Arial"/>
+          <w:sz w:val="20"/>
+          <w:szCs w:val="20"/>
+        </w:rPr>
+        <w:commentReference w:id="16"/>
+      </w:r>
+      <w:r>
+        <w:rPr>
+          <w:rFonts w:ascii="Arial" w:hAnsi="Arial" w:cs="Arial"/>
+          <w:sz w:val="20"/>
+          <w:szCs w:val="20"/>
+        </w:rPr>
+        <w:t>Jenny</w:t>
+      </w:r>
+    </w:p>
+    <w:p>
+      <w:pPr>
+        <w:rPr>
+          <w:rFonts w:ascii="Arial" w:hAnsi="Arial" w:cs="Arial"/>
+          <w:b/>
+          <w:bCs/>
+          <w:sz w:val="20"/>
+          <w:szCs w:val="20"/>
+        </w:rPr>
+      </w:pPr>
+    </w:p>
+    <w:p>
+      <w:pPr>
+        <w:rPr>
+          <w:rFonts w:ascii="Arial" w:hAnsi="Arial" w:cs="Arial"/>
+          <w:sz w:val="20"/>
+          <w:szCs w:val="20"/>
+          <w:u w:val="single"/>
+        </w:rPr>
+      </w:pPr>
+      <w:r>
+        <w:rPr>
+          <w:rFonts w:ascii="Arial" w:hAnsi="Arial" w:cs="Arial"/>
+          <w:sz w:val="20"/>
+          <w:szCs w:val="20"/>
+          <w:u w:val="single"/>
+        </w:rPr>
+        <w:t>Quality Control</w:t>
+      </w:r>
+      <w:r>
+        <w:rPr>
+          <w:rFonts w:ascii="Arial" w:hAnsi="Arial" w:cs="Arial"/>
+          <w:sz w:val="20"/>
+          <w:szCs w:val="20"/>
+          <w:u w:val="single"/>
+        </w:rPr>
+        <w:t xml:space="preserve"> </w:t>
+      </w:r>
+      <w:r>
+        <w:rPr>
+          <w:rFonts w:ascii="Arial" w:hAnsi="Arial" w:cs="Arial"/>
+          <w:sz w:val="20"/>
+          <w:szCs w:val="20"/>
+          <w:u w:val="single"/>
+        </w:rPr>
+        <w:t>and Sketching</w:t>
+      </w:r>
+      <w:r>
+        <w:rPr>
+          <w:rFonts w:ascii="Arial" w:hAnsi="Arial" w:cs="Arial"/>
+          <w:sz w:val="20"/>
+          <w:szCs w:val="20"/>
+          <w:u w:val="single"/>
+        </w:rPr>
+        <w:t xml:space="preserve"> </w:t>
+      </w:r>
+    </w:p>
+    <w:p>
+      <w:pPr>
+        <w:rPr>
+          <w:rFonts w:ascii="Arial" w:hAnsi="Arial" w:cs="Arial"/>
+          <w:sz w:val="20"/>
+          <w:szCs w:val="20"/>
+        </w:rPr>
+      </w:pPr>
+      <w:r>
+        <w:rPr>
+          <w:rFonts w:ascii="Arial" w:hAnsi="Arial" w:cs="Arial"/>
+          <w:sz w:val="20"/>
+          <w:szCs w:val="20"/>
+        </w:rPr>
+        <w:tab/>
+        <w:t>All four capture areas were merged resulting in 463,466 total spots. Spots with &lt;25 UMIs or ≥50% mitochondrial reads were discarded, resulting in 433,999 spots for downstream analysis. Spot feature counts were then normalized (NormalizeData) and variable features were computed (FindVariableFeatures). For computational efficiency, we then created a SketchData assay (ncells = 50000, method = “LeverageScore”, features = VariableFeatures</w:t>
+      </w:r>
+      <w:r>
+        <w:rPr>
+          <w:rFonts w:ascii="Arial" w:hAnsi="Arial" w:cs="Arial"/>
+          <w:sz w:val="20"/>
+          <w:szCs w:val="20"/>
+        </w:rPr>
+        <w:t xml:space="preserve">) which was used for downstream analyses. </w:t>
+      </w:r>
+    </w:p>
+    <w:p>
+      <w:pPr>
+        <w:rPr>
+          <w:rFonts w:ascii="Arial" w:hAnsi="Arial" w:cs="Arial"/>
+          <w:sz w:val="20"/>
+          <w:szCs w:val="20"/>
+        </w:rPr>
+      </w:pPr>
+    </w:p>
+    <w:p>
+      <w:pPr>
+        <w:rPr>
+          <w:rFonts w:ascii="Arial" w:hAnsi="Arial" w:cs="Arial"/>
+          <w:b/>
+          <w:bCs/>
+          <w:sz w:val="20"/>
+          <w:szCs w:val="20"/>
+        </w:rPr>
+      </w:pPr>
+      <w:r>
+        <w:rPr>
+          <w:rFonts w:ascii="Arial" w:hAnsi="Arial" w:cs="Arial"/>
+          <w:b/>
+          <w:bCs/>
+          <w:sz w:val="20"/>
+          <w:szCs w:val="20"/>
+        </w:rPr>
+        <w:t>Neuroanatomical Annotation</w:t>
+      </w:r>
+    </w:p>
+    <w:p>
+      <w:pPr>
+        <w:ind w:firstLine="720"/>
+        <w:rPr>
+          <w:rFonts w:ascii="Arial" w:hAnsi="Arial" w:cs="Arial"/>
+          <w:sz w:val="20"/>
+          <w:szCs w:val="20"/>
+        </w:rPr>
+      </w:pPr>
+      <w:r>
+        <w:rPr>
+          <w:rFonts w:ascii="Arial" w:hAnsi="Arial" w:cs="Arial"/>
+          <w:sz w:val="20"/>
+          <w:szCs w:val="20"/>
+        </w:rPr>
+        <w:t xml:space="preserve">Because there is no published atlas for any anemonefish brain, we relied </w:t>
+      </w:r>
+      <w:r>
+        <w:rPr>
+          <w:rFonts w:ascii="Arial" w:hAnsi="Arial" w:cs="Arial"/>
+          <w:sz w:val="20"/>
+          <w:szCs w:val="20"/>
+        </w:rPr>
+        <w:t xml:space="preserve">on a published atlas from </w:t>
       </w:r>
       <w:r>
         <w:rPr>
@@ -21697,43 +23026,7 @@
           <w:sz w:val="20"/>
           <w:szCs w:val="20"/>
         </w:rPr>
-        <w:t>Amphiprion ocellaris</w:t>
-      </w:r>
-      <w:r>
-        <w:rPr>
-          <w:rFonts w:ascii="Arial" w:hAnsi="Arial" w:cs="Arial"/>
-          <w:sz w:val="20"/>
-          <w:szCs w:val="20"/>
-        </w:rPr>
-        <w:t xml:space="preserve"> RefSeq genome assembly (GCF_022539595.1).</w:t>
-      </w:r>
-    </w:p>
-    <w:p>
-      <w:pPr>
-        <w:ind w:firstLine="720"/>
-        <w:rPr>
-          <w:rFonts w:ascii="Arial" w:hAnsi="Arial" w:cs="Arial"/>
-          <w:sz w:val="20"/>
-          <w:szCs w:val="20"/>
-        </w:rPr>
-      </w:pPr>
-    </w:p>
-    <w:p>
-      <w:pPr>
-        <w:ind w:firstLine="720"/>
-        <w:rPr>
-          <w:rFonts w:ascii="Arial" w:hAnsi="Arial" w:cs="Arial"/>
-          <w:sz w:val="20"/>
-          <w:szCs w:val="20"/>
-        </w:rPr>
-      </w:pPr>
-      <w:r>
-        <w:rPr>
-          <w:rFonts w:ascii="Arial" w:hAnsi="Arial" w:cs="Arial"/>
-          <w:sz w:val="20"/>
-          <w:szCs w:val="20"/>
-        </w:rPr>
-        <w:t>To enable assignment of nuclei to individual fish, we also sequenced genomic DNA from each individual. DNA was extracted from fin tissue using the DNeasy Blood &amp; Tissue Kit (Qiagen, catalog no. 69504; Qiagen, Valencia, CA) and sequenced at the University of Illinois Roy J. Carver Biotechnology Center using an Illumina NovaSeq X Plus (Illumina Inc., San Diego, CA) with a 10B flow cell. BAM files were generated from each individual’s genomic DNA sequence data, and variants identified from genomic DNA and nuclear RNA were used to assign nuclei to individuals using a combination of Demuxlet</w:t>
+        <w:t>Astatotilapia burtoni</w:t>
       </w:r>
       <w:r>
         <w:rPr>
@@ -21757,7 +23050,7 @@
           <w:sz w:val="20"/>
           <w:szCs w:val="20"/>
         </w:rPr>
-        <w:instrText xml:space="preserve"> ADDIN ZOTERO_ITEM CSL_CITATION {"citationID":"xArGHkso","properties":{"unsorted":false,"formattedCitation":"(60)","plainCitation":"(60)","noteIndex":0},"citationItems":[{"id":3487,"uris":["http://zotero.org/users/11313215/items/68FTNPIR"],"itemData":{"id":3487,"type":"article-journal","abstract":"Droplet single-cell RNA-seq is applied to large numbers of pooled samples from unrelated individuals.","container-title":"Nature Biotechnology","DOI":"10.1038/nbt.4042","ISSN":"1546-1696","issue":"1","journalAbbreviation":"Nat Biotechnol","language":"en","license":"2017 Springer Nature America, Inc.","page":"89-94","publisher":"Nature Publishing Group","source":"www.nature.com","title":"Multiplexed droplet single-cell RNA-sequencing using natural genetic variation","volume":"36","author":[{"family":"Kang","given":"Hyun Min"},{"family":"Subramaniam","given":"Meena"},{"family":"Targ","given":"Sasha"},{"family":"Nguyen","given":"Michelle"},{"family":"Maliskova","given":"Lenka"},{"family":"McCarthy","given":"Elizabeth"},{"family":"Wan","given":"Eunice"},{"family":"Wong","given":"Simon"},{"family":"Byrnes","given":"Lauren"},{"family":"Lanata","given":"Cristina M."},{"family":"Gate","given":"Rachel E."},{"family":"Mostafavi","given":"Sara"},{"family":"Marson","given":"Alexander"},{"family":"Zaitlen","given":"Noah"},{"family":"Criswell","given":"Lindsey A."},{"family":"Ye","given":"Chun Jimmie"}],"issued":{"date-parts":[["2018",1]]}}}],"schema":"https://github.com/citation-style-language/schema/raw/master/csl-citation.json"} </w:instrText>
+        <w:instrText xml:space="preserve"> ADDIN ZOTERO_ITEM CSL_CITATION {"citationID":"pOiFwZiB","properties":{"unsorted":false,"formattedCitation":"(65)","plainCitation":"(65)","noteIndex":0},"citationItems":[{"id":6395,"uris":["http://zotero.org/users/11313215/items/QTQQG9ZG"],"itemData":{"id":6395,"type":"article-journal","abstract":"Neural communication depends on release and reception of different neurotransmitters within complex circuits that ultimately mediate basic biological functions. We mapped the distribution of glutamatergic, GABAergic, and cholinergic neurons in the brain of the African cichlid fish Astatotilapia burtoni using in situ hybridization to label vesicular glutamate transporters (vglut1, vglut2.1, vglut3), glutamate decarboxylases (gad1, gad2), and choline acetyltransferase (chat). Cells expressing the glutamatergic markers vgluts 1-3 show primarily nonoverlapping distribution patterns, with the most widespread expression observed for vglut2.1, and more restricted expression of vglut1 and vglut3. vglut1 is prominent in granular layers of the cerebellum, habenula, preglomerular nuclei, and several other diencephalic, mesencephalic, and rhombencephalic regions. vglut2.1 is widely expressed in many nuclei from the olfactory bulbs to the hindbrain, while vglut3 is restricted to the hypothalamus and hindbrain. GABAergic cells show largely overlapping gad1 and gad2 expression in most brain regions. GABAergic expression dominates nuclei of the subpallial ventral telencephalon, while glutamatergic expression dominates nuclei of the pallial dorsal telencephalon. chat-expressing cells are prominent in motor cranial nerve nuclei, and some scattered cells lie in the preoptic area and ventral part of the ventral telencephalon. A localization summary of these markers within regions of the conserved social decision-making network reveals a predominance of either GABAergic or glutamatergic cells within individual nuclei. The neurotransmitter distributions described here in the brain of a single fish species provide an important resource for identification of brain nuclei in other fishes, as well as future comparative studies on circuit organization and function. J. Comp. Neurol. 525:610-638, 2017. © 2016 Wiley Periodicals, Inc.","container-title":"The Journal of Comparative Neurology","DOI":"10.1002/cne.24092","ISSN":"1096-9861","issue":"3","journalAbbreviation":"J Comp Neurol","language":"eng","page":"610-638","PMID":"27507772","source":"PubMed","title":"Localization of glutamatergic, GABAergic, and cholinergic neurons in the brain of the African cichlid fish, Astatotilapia burtoni","volume":"525","author":[{"family":"Maruska","given":"Karen P."},{"family":"Butler","given":"Julie M."},{"family":"Field","given":"Karen E."},{"family":"Porter","given":"Danielle T."}],"issued":{"date-parts":[["2017",2,15]]}}}],"schema":"https://github.com/citation-style-language/schema/raw/master/csl-citation.json"} </w:instrText>
       </w:r>
       <w:r>
         <w:rPr>
@@ -21770,11 +23063,10 @@
       <w:r>
         <w:rPr>
           <w:rFonts w:ascii="Arial" w:hAnsi="Arial" w:cs="Arial"/>
-          <w:noProof/>
-          <w:sz w:val="20"/>
-          <w:szCs w:val="20"/>
-        </w:rPr>
-        <w:t>(60)</w:t>
+          <w:sz w:val="20"/>
+          <w:szCs w:val="20"/>
+        </w:rPr>
+        <w:t>(65)</w:t>
       </w:r>
       <w:r>
         <w:rPr>
@@ -21798,48 +23090,39 @@
           <w:sz w:val="20"/>
           <w:szCs w:val="20"/>
         </w:rPr>
-        <w:t>and Souporcell</w:t>
-      </w:r>
-      <w:r>
-        <w:rPr>
-          <w:rFonts w:ascii="Arial" w:hAnsi="Arial" w:cs="Arial"/>
-          <w:sz w:val="20"/>
-          <w:szCs w:val="20"/>
-        </w:rPr>
-        <w:fldChar w:fldCharType="begin"/>
-      </w:r>
-      <w:r>
-        <w:rPr>
-          <w:rFonts w:ascii="Arial" w:hAnsi="Arial" w:cs="Arial"/>
-          <w:sz w:val="20"/>
-          <w:szCs w:val="20"/>
-        </w:rPr>
-        <w:instrText xml:space="preserve"> ADDIN ZOTERO_ITEM CSL_CITATION {"citationID":"xBZXVSII","properties":{"unsorted":false,"formattedCitation":"(61)","plainCitation":"(61)","noteIndex":0},"citationItems":[{"id":3486,"uris":["http://zotero.org/users/11313215/items/SQPJSPNF"],"itemData":{"id":3486,"type":"article-journal","abstract":"Methods to deconvolve single-cell RNA-sequencing (scRNA-seq) data are necessary for samples containing a mixture of genotypes, whether they are natural or experimentally combined. Multiplexing across donors is a popular experimental design that can avoid batch effects, reduce costs and improve doublet detection. By using variants detected in scRNA-seq reads, it is possible to assign cells to their donor of origin and identify cross-genotype doublets that may have highly similar transcriptional profiles, precluding detection by transcriptional profile. More subtle cross-genotype variant contamination can be used to estimate the amount of ambient RNA. Ambient RNA is caused by cell lysis before droplet partitioning and is an important confounder of scRNA-seq analysis. Here we develop souporcell, a method to cluster cells using the genetic variants detected within the scRNA-seq reads. We show that it achieves high accuracy on genotype clustering, doublet detection and ambient RNA estimation, as demonstrated across a range of challenging scenarios.","container-title":"Nature Methods","DOI":"10.1038/s41592-020-0820-1","ISSN":"1548-7105","issue":"6","journalAbbreviation":"Nat Methods","language":"en","license":"2020 The Author(s), under exclusive licence to Springer Nature America, Inc.","page":"615-620","publisher":"Nature Publishing Group","source":"www.nature.com","title":"Souporcell: robust clustering of single-cell RNA-seq data by genotype without reference genotypes","title-short":"Souporcell","volume":"17","author":[{"family":"Heaton","given":"Haynes"},{"family":"Talman","given":"Arthur M."},{"family":"Knights","given":"Andrew"},{"family":"Imaz","given":"Maria"},{"family":"Gaffney","given":"Daniel J."},{"family":"Durbin","given":"Richard"},{"family":"Hemberg","given":"Martin"},{"family":"Lawniczak","given":"Mara K. N."}],"issued":{"date-parts":[["2020",6]]}}}],"schema":"https://github.com/citation-style-language/schema/raw/master/csl-citation.json"} </w:instrText>
-      </w:r>
-      <w:r>
-        <w:rPr>
-          <w:rFonts w:ascii="Arial" w:hAnsi="Arial" w:cs="Arial"/>
-          <w:sz w:val="20"/>
-          <w:szCs w:val="20"/>
-        </w:rPr>
-        <w:fldChar w:fldCharType="separate"/>
-      </w:r>
-      <w:r>
-        <w:rPr>
-          <w:rFonts w:ascii="Arial" w:hAnsi="Arial" w:cs="Arial"/>
-          <w:noProof/>
-          <w:sz w:val="20"/>
-          <w:szCs w:val="20"/>
-        </w:rPr>
-        <w:t>(61)</w:t>
-      </w:r>
-      <w:r>
-        <w:rPr>
-          <w:rFonts w:ascii="Arial" w:hAnsi="Arial" w:cs="Arial"/>
-          <w:sz w:val="20"/>
-          <w:szCs w:val="20"/>
-        </w:rPr>
-        <w:fldChar w:fldCharType="end"/>
+        <w:t xml:space="preserve">in combination with unbiased clustering and gene expression </w:t>
+      </w:r>
+      <w:r>
+        <w:rPr>
+          <w:rFonts w:ascii="Arial" w:hAnsi="Arial" w:cs="Arial"/>
+          <w:sz w:val="20"/>
+          <w:szCs w:val="20"/>
+        </w:rPr>
+        <w:t>(see “Spatial Transcriptomics”)</w:t>
+      </w:r>
+      <w:r>
+        <w:rPr>
+          <w:rFonts w:ascii="Arial" w:hAnsi="Arial" w:cs="Arial"/>
+          <w:sz w:val="20"/>
+          <w:szCs w:val="20"/>
+        </w:rPr>
+        <w:t xml:space="preserve"> </w:t>
+      </w:r>
+      <w:r>
+        <w:rPr>
+          <w:rFonts w:ascii="Arial" w:hAnsi="Arial" w:cs="Arial"/>
+          <w:sz w:val="20"/>
+          <w:szCs w:val="20"/>
+        </w:rPr>
+        <w:t xml:space="preserve">for </w:t>
+      </w:r>
+      <w:r>
+        <w:rPr>
+          <w:rFonts w:ascii="Arial" w:hAnsi="Arial" w:cs="Arial"/>
+          <w:sz w:val="20"/>
+          <w:szCs w:val="20"/>
+        </w:rPr>
+        <w:t>our annotations</w:t>
       </w:r>
       <w:r>
         <w:rPr>
@@ -21849,1292 +23132,13 @@
         </w:rPr>
         <w:t>.</w:t>
       </w:r>
-    </w:p>
-    <w:p>
-      <w:pPr>
-        <w:ind w:firstLine="720"/>
-        <w:rPr>
-          <w:rFonts w:ascii="Arial" w:hAnsi="Arial" w:cs="Arial"/>
-          <w:sz w:val="20"/>
-          <w:szCs w:val="20"/>
-        </w:rPr>
-      </w:pPr>
-    </w:p>
-    <w:p>
-      <w:pPr>
-        <w:ind w:firstLine="720"/>
-        <w:rPr>
-          <w:rFonts w:ascii="Arial" w:hAnsi="Arial" w:cs="Arial"/>
-          <w:sz w:val="20"/>
-          <w:szCs w:val="20"/>
-        </w:rPr>
-      </w:pPr>
-      <w:r>
-        <w:rPr>
-          <w:rFonts w:ascii="Arial" w:hAnsi="Arial" w:cs="Arial"/>
-          <w:sz w:val="20"/>
-          <w:szCs w:val="20"/>
-        </w:rPr>
-        <w:t>Cell Ranger ARC was used to demultiplex sequencing BCL files and generate FASTQ files for GEX and ATAC reads, create the reference genome package, perform cell calling for both modalities, and align reads to the reference genome. EmptyDropsMultiome</w:t>
-      </w:r>
-      <w:r>
-        <w:rPr>
-          <w:rFonts w:ascii="Arial" w:hAnsi="Arial" w:cs="Arial"/>
-          <w:sz w:val="20"/>
-          <w:szCs w:val="20"/>
-        </w:rPr>
-        <w:t xml:space="preserve"> </w:t>
-      </w:r>
-      <w:r>
-        <w:rPr>
-          <w:rFonts w:ascii="Arial" w:hAnsi="Arial" w:cs="Arial"/>
-          <w:sz w:val="20"/>
-          <w:szCs w:val="20"/>
-        </w:rPr>
-        <w:fldChar w:fldCharType="begin"/>
-      </w:r>
-      <w:r>
-        <w:rPr>
-          <w:rFonts w:ascii="Arial" w:hAnsi="Arial" w:cs="Arial"/>
-          <w:sz w:val="20"/>
-          <w:szCs w:val="20"/>
-        </w:rPr>
-        <w:instrText xml:space="preserve"> ADDIN ZOTERO_ITEM CSL_CITATION {"citationID":"9TcRkEOW","properties":{"unsorted":false,"formattedCitation":"(62)","plainCitation":"(62)","noteIndex":0},"citationItems":[{"id":3471,"uris":["http://zotero.org/users/11313215/items/S6LZL9KP"],"itemData":{"id":3471,"type":"article-journal","abstract":"Multiomic droplet-based technologies allow different molecular modalities, such as chromatin accessibility and gene expression (scATAC-seq and scRNA-seq), to be probed in the same nucleus. We develop EmptyDropsMultiome, an approach that distinguishes true nuclei-containing droplets from background. Using simulations, we show that EmptyDropsMultiome has higher statistical power and accuracy than existing approaches, including CellRanger-arc and EmptyDrops. On real datasets, we observe that CellRanger-arc misses more than half of the nuclei identified by EmptyDropsMultiome and, moreover, is biased against certain cell types, some of which have a retrieval rate lower than 20%.","container-title":"Genome Biology","DOI":"10.1186/s13059-024-03259-x","ISSN":"1474-760X","issue":"1","journalAbbreviation":"Genome Biology","page":"121","source":"BioMed Central","title":"EmptyDropsMultiome discriminates real cells from background in single-cell multiomics assays","volume":"25","author":[{"family":"Megas","given":"Stathis"},{"family":"Lorenzi","given":"Valentina"},{"family":"Marioni","given":"John C."}],"issued":{"date-parts":[["2024",5,13]]}}}],"schema":"https://github.com/citation-style-language/schema/raw/master/csl-citation.json"} </w:instrText>
-      </w:r>
-      <w:r>
-        <w:rPr>
-          <w:rFonts w:ascii="Arial" w:hAnsi="Arial" w:cs="Arial"/>
-          <w:sz w:val="20"/>
-          <w:szCs w:val="20"/>
-        </w:rPr>
-        <w:fldChar w:fldCharType="separate"/>
-      </w:r>
-      <w:r>
-        <w:rPr>
-          <w:rFonts w:ascii="Arial" w:hAnsi="Arial" w:cs="Arial"/>
-          <w:noProof/>
-          <w:sz w:val="20"/>
-          <w:szCs w:val="20"/>
-        </w:rPr>
-        <w:t>(62)</w:t>
-      </w:r>
-      <w:r>
-        <w:rPr>
-          <w:rFonts w:ascii="Arial" w:hAnsi="Arial" w:cs="Arial"/>
-          <w:sz w:val="20"/>
-          <w:szCs w:val="20"/>
-        </w:rPr>
-        <w:fldChar w:fldCharType="end"/>
-      </w:r>
-      <w:r>
-        <w:rPr>
-          <w:rFonts w:ascii="Arial" w:hAnsi="Arial" w:cs="Arial"/>
-          <w:sz w:val="20"/>
-          <w:szCs w:val="20"/>
-        </w:rPr>
-        <w:t xml:space="preserve"> was then used to distinguish nuclei-containing droplets from empty droplets and identify background, ambient RNA, and multiplets. Souporcell was additionally used to validate singlets and multiplets identified by EmptyDropsMultiome.</w:t>
-      </w:r>
-    </w:p>
-    <w:p>
-      <w:pPr>
-        <w:ind w:firstLine="720"/>
-        <w:rPr>
-          <w:rFonts w:ascii="Arial" w:hAnsi="Arial" w:cs="Arial"/>
-          <w:sz w:val="20"/>
-          <w:szCs w:val="20"/>
-        </w:rPr>
-      </w:pPr>
-    </w:p>
-    <w:p>
-      <w:pPr>
-        <w:ind w:firstLine="720"/>
-        <w:rPr>
-          <w:rFonts w:ascii="Arial" w:hAnsi="Arial" w:cs="Arial"/>
-          <w:sz w:val="20"/>
-          <w:szCs w:val="20"/>
-        </w:rPr>
-      </w:pPr>
-      <w:r>
-        <w:rPr>
-          <w:rFonts w:ascii="Arial" w:hAnsi="Arial" w:cs="Arial"/>
-          <w:sz w:val="20"/>
-          <w:szCs w:val="20"/>
-        </w:rPr>
-        <w:t>Finally, we used MACS3 for ATAC-seq peak calling in place of the default Cell Ranger ARC peak calls because Cell Ranger ARC can merge distinct peaks located in close genomic proximity. MACS3 was also used to generate a unified peak set across all pooled samples.</w:t>
-      </w:r>
-    </w:p>
-    <w:p>
-      <w:pPr>
-        <w:rPr>
-          <w:rFonts w:ascii="Arial" w:hAnsi="Arial" w:cs="Arial"/>
-          <w:sz w:val="20"/>
-          <w:szCs w:val="20"/>
-        </w:rPr>
-      </w:pPr>
-    </w:p>
-    <w:p>
-      <w:pPr>
-        <w:pStyle w:val="Default"/>
-        <w:rPr>
-          <w:rFonts w:ascii="Arial" w:hAnsi="Arial" w:cs="Arial"/>
-          <w:color w:val="000000" w:themeColor="text1"/>
-          <w:sz w:val="20"/>
-          <w:szCs w:val="20"/>
-          <w:u w:val="single"/>
-        </w:rPr>
-      </w:pPr>
-      <w:r>
-        <w:rPr>
-          <w:rFonts w:ascii="Arial" w:hAnsi="Arial" w:cs="Arial"/>
-          <w:color w:val="000000" w:themeColor="text1"/>
-          <w:sz w:val="20"/>
-          <w:szCs w:val="20"/>
-          <w:u w:val="single"/>
-        </w:rPr>
-        <w:t xml:space="preserve">Quality Control </w:t>
-      </w:r>
-    </w:p>
-    <w:p>
-      <w:pPr>
-        <w:pStyle w:val="Default"/>
-        <w:rPr>
-          <w:rFonts w:ascii="Arial" w:hAnsi="Arial" w:cs="Arial"/>
-          <w:color w:val="000000" w:themeColor="text1"/>
-          <w:sz w:val="20"/>
-          <w:szCs w:val="20"/>
-        </w:rPr>
-      </w:pPr>
-      <w:r>
-        <w:rPr>
-          <w:rFonts w:ascii="Arial" w:hAnsi="Arial" w:cs="Arial"/>
-          <w:color w:val="000000" w:themeColor="text1"/>
-          <w:sz w:val="20"/>
-          <w:szCs w:val="20"/>
-        </w:rPr>
-        <w:t>Quality control was initially performed separately for each pool to identify high-quality nuclei and remove low-quality barcodes. Variable feature analysis was used to identify nuclei with low gene expression variability. On</w:t>
-      </w:r>
-      <w:commentRangeStart w:id="9"/>
-      <w:commentRangeStart w:id="10"/>
-      <w:r>
-        <w:rPr>
-          <w:rFonts w:ascii="Arial" w:hAnsi="Arial" w:cs="Arial"/>
-          <w:color w:val="000000" w:themeColor="text1"/>
-          <w:sz w:val="20"/>
-          <w:szCs w:val="20"/>
-        </w:rPr>
-        <w:t>ly barcodes containing at least 55% of highly variable genes were retained. In</w:t>
-      </w:r>
-      <w:commentRangeEnd w:id="9"/>
-      <w:r>
-        <w:rPr>
-          <w:rStyle w:val="CommentReference"/>
-          <w:rFonts w:ascii="Arial" w:hAnsi="Arial" w:cs="Arial"/>
-          <w:color w:val="000000" w:themeColor="text1"/>
-          <w:sz w:val="20"/>
-          <w:szCs w:val="20"/>
-        </w:rPr>
-        <w:commentReference w:id="9"/>
-      </w:r>
-      <w:commentRangeEnd w:id="10"/>
-      <w:r>
-        <w:rPr>
-          <w:rStyle w:val="CommentReference"/>
-          <w:rFonts w:ascii="Arial" w:hAnsi="Arial" w:cs="Arial"/>
-          <w:color w:val="000000" w:themeColor="text1"/>
-          <w:sz w:val="20"/>
-          <w:szCs w:val="20"/>
-        </w:rPr>
-        <w:commentReference w:id="10"/>
-      </w:r>
-      <w:r>
-        <w:rPr>
-          <w:rFonts w:ascii="Arial" w:hAnsi="Arial" w:cs="Arial"/>
-          <w:color w:val="000000" w:themeColor="text1"/>
-          <w:sz w:val="20"/>
-          <w:szCs w:val="20"/>
-        </w:rPr>
-        <w:t xml:space="preserve"> addition, barcodes in which the top 50 or top 100 most highly expressed genes accounted for more than 50% or 60% of total gene expression, respectively, were removed.</w:t>
-      </w:r>
-    </w:p>
-    <w:p>
-      <w:pPr>
-        <w:pStyle w:val="Default"/>
-        <w:rPr>
-          <w:rFonts w:ascii="Arial" w:hAnsi="Arial" w:cs="Arial"/>
-          <w:color w:val="000000" w:themeColor="text1"/>
-          <w:sz w:val="20"/>
-          <w:szCs w:val="20"/>
-        </w:rPr>
-      </w:pPr>
-    </w:p>
-    <w:p>
-      <w:pPr>
-        <w:pStyle w:val="Default"/>
-        <w:rPr>
-          <w:rFonts w:ascii="Arial" w:hAnsi="Arial" w:cs="Arial"/>
-          <w:color w:val="000000" w:themeColor="text1"/>
-          <w:sz w:val="20"/>
-          <w:szCs w:val="20"/>
-        </w:rPr>
-      </w:pPr>
-      <w:commentRangeStart w:id="11"/>
-      <w:commentRangeStart w:id="12"/>
-      <w:r>
-        <w:rPr>
-          <w:rFonts w:ascii="Arial" w:hAnsi="Arial" w:cs="Arial"/>
-          <w:color w:val="000000" w:themeColor="text1"/>
-          <w:sz w:val="20"/>
-          <w:szCs w:val="20"/>
-        </w:rPr>
-        <w:t>Following pool-level quality control, samples were merged and additional filtering was performed on the combined dataset. Nuclei were retained if they met the following criteria: 200 &lt; nCount_RNA &lt; 25,000; 200 &lt; nFeature_RNA &lt; 9,000; nCount_ATAC &lt; 25,000; nFeature_ATAC &lt; 16,000; mitochondrial reads &lt; 12%; protein-coding reads &gt; 85%; ribosomal reads &lt; 3%; TSS enrichment &gt; 0.8; and nucleosome signal &lt; 2.</w:t>
-      </w:r>
-      <w:commentRangeEnd w:id="11"/>
-      <w:r>
-        <w:rPr>
-          <w:rStyle w:val="CommentReference"/>
-          <w:rFonts w:ascii="Arial" w:hAnsi="Arial" w:cs="Arial"/>
-          <w:color w:val="000000" w:themeColor="text1"/>
-          <w:sz w:val="20"/>
-          <w:szCs w:val="20"/>
-        </w:rPr>
-        <w:commentReference w:id="11"/>
-      </w:r>
-      <w:commentRangeEnd w:id="12"/>
-      <w:r>
-        <w:rPr>
-          <w:rStyle w:val="CommentReference"/>
-          <w:rFonts w:ascii="Arial" w:hAnsi="Arial" w:cs="Arial"/>
-          <w:color w:val="000000" w:themeColor="text1"/>
-          <w:sz w:val="20"/>
-          <w:szCs w:val="20"/>
-        </w:rPr>
-        <w:commentReference w:id="12"/>
-      </w:r>
-    </w:p>
-    <w:p>
-      <w:pPr>
-        <w:rPr>
-          <w:rFonts w:ascii="Arial" w:hAnsi="Arial" w:cs="Arial"/>
-          <w:sz w:val="20"/>
-          <w:szCs w:val="20"/>
-          <w:u w:val="single"/>
-        </w:rPr>
-      </w:pPr>
-    </w:p>
-    <w:p>
-      <w:pPr>
-        <w:pStyle w:val="Default"/>
-        <w:rPr>
-          <w:rFonts w:ascii="Arial" w:hAnsi="Arial" w:cs="Arial"/>
-          <w:color w:val="000000" w:themeColor="text1"/>
-          <w:sz w:val="20"/>
-          <w:szCs w:val="20"/>
-          <w:u w:val="single"/>
-        </w:rPr>
-      </w:pPr>
-      <w:r>
-        <w:rPr>
-          <w:rFonts w:ascii="Arial" w:hAnsi="Arial" w:cs="Arial"/>
-          <w:color w:val="000000" w:themeColor="text1"/>
-          <w:sz w:val="20"/>
-          <w:szCs w:val="20"/>
-          <w:u w:val="single"/>
-        </w:rPr>
-        <w:t xml:space="preserve">Normalization and Initial Clustering </w:t>
-      </w:r>
-    </w:p>
-    <w:p>
-      <w:pPr>
-        <w:pStyle w:val="Default"/>
-        <w:rPr>
-          <w:rFonts w:ascii="Arial" w:hAnsi="Arial" w:cs="Arial"/>
-          <w:color w:val="000000" w:themeColor="text1"/>
-          <w:sz w:val="20"/>
-          <w:szCs w:val="20"/>
-          <w:u w:val="single"/>
-        </w:rPr>
-      </w:pPr>
-    </w:p>
-    <w:p>
-      <w:pPr>
-        <w:pStyle w:val="Default"/>
-        <w:rPr>
-          <w:rFonts w:ascii="Arial" w:hAnsi="Arial" w:cs="Arial"/>
-          <w:color w:val="000000" w:themeColor="text1"/>
-          <w:sz w:val="20"/>
-          <w:szCs w:val="20"/>
-        </w:rPr>
-      </w:pPr>
-      <w:r>
-        <w:rPr>
-          <w:rFonts w:ascii="Arial" w:hAnsi="Arial" w:cs="Arial"/>
-          <w:color w:val="000000" w:themeColor="text1"/>
-          <w:sz w:val="20"/>
-          <w:szCs w:val="20"/>
-        </w:rPr>
-        <w:tab/>
-        <w:t xml:space="preserve">Clustering was performed broadly following a standard Seurat pipeline. For the RNA modality, raw counts were normalized using LogNormalize() in Seurat. The top variable features were identified using FindVariableFeatures() (nfeatures = 4,000), and data were scaled using ScaleData() (scale.max = 50). Dimensionality reduction was then performed using RunPCA() (npcs = 50), followed by integration using IntegrateLayers() with HarmonyIntegration() </w:t>
-      </w:r>
-      <w:r>
-        <w:rPr>
-          <w:rFonts w:ascii="Arial" w:hAnsi="Arial" w:cs="Arial"/>
-          <w:color w:val="000000" w:themeColor="text1"/>
-          <w:sz w:val="20"/>
-          <w:szCs w:val="20"/>
-        </w:rPr>
-        <w:fldChar w:fldCharType="begin"/>
-      </w:r>
-      <w:r>
-        <w:rPr>
-          <w:rFonts w:ascii="Arial" w:hAnsi="Arial" w:cs="Arial"/>
-          <w:color w:val="000000" w:themeColor="text1"/>
-          <w:sz w:val="20"/>
-          <w:szCs w:val="20"/>
-        </w:rPr>
-        <w:instrText xml:space="preserve"> ADDIN ZOTERO_ITEM CSL_CITATION {"citationID":"HuavlTFa","properties":{"unsorted":false,"formattedCitation":"(63)","plainCitation":"(63)","noteIndex":0},"citationItems":[{"id":3208,"uris":["http://zotero.org/users/11313215/items/LZ5PT7U5"],"itemData":{"id":3208,"type":"article-journal","abstract":"The emerging diversity of single cell RNAseq datasets allows for the full transcriptional characterization of cell types across a wide variety of biological and clinical conditions. However, it is challenging to analyze them together, particularly when datasets are assayed with different technologies. Here, real biological differences are interspersed with technical differences. We present Harmony, an algorithm that projects cells into a shared embedding in which cells group by cell type rather than dataset-specific conditions. Harmony simultaneously accounts for multiple experimental and biological factors. In six analyses, we demonstrate the superior performance of Harmony to previously published algorithms. We show that Harmony requires dramatically fewer computational resources. It is the only currently available algorithm that makes the integration of ~106 cells feasible on a personal computer. We apply Harmony to PBMCs from datasets with large experimental differences, 5 studies of pancreatic islet cells, mouse embryogenesis datasets, and cross-modality spatial integration.","container-title":"Nature methods","DOI":"10.1038/s41592-019-0619-0","ISSN":"1548-7091","issue":"12","journalAbbreviation":"Nat Methods","page":"1289-1296","PMID":"31740819","PMCID":"PMC6884693","source":"PubMed Central","title":"Fast, sensitive, and accurate integration of single cell data with Harmony","volume":"16","author":[{"family":"Korsunsky","given":"Ilya"},{"family":"Millard","given":"Nghia"},{"family":"Fan","given":"Jean"},{"family":"Slowikowski","given":"Kamil"},{"family":"Zhang","given":"Fan"},{"family":"Wei","given":"Kevin"},{"family":"Baglaenko","given":"Yuriy"},{"family":"Brenner","given":"Michael"},{"family":"Loh","given":"Po-ru"},{"family":"Raychaudhuri","given":"Soumya"}],"issued":{"date-parts":[["2019",12]]}}}],"schema":"https://github.com/citation-style-language/schema/raw/master/csl-citation.json"} </w:instrText>
-      </w:r>
-      <w:r>
-        <w:rPr>
-          <w:rFonts w:ascii="Arial" w:hAnsi="Arial" w:cs="Arial"/>
-          <w:color w:val="000000" w:themeColor="text1"/>
-          <w:sz w:val="20"/>
-          <w:szCs w:val="20"/>
-        </w:rPr>
-        <w:fldChar w:fldCharType="separate"/>
-      </w:r>
-      <w:r>
-        <w:rPr>
-          <w:rFonts w:ascii="Arial" w:hAnsi="Arial" w:cs="Arial"/>
-          <w:noProof/>
-          <w:color w:val="000000" w:themeColor="text1"/>
-          <w:sz w:val="20"/>
-          <w:szCs w:val="20"/>
-        </w:rPr>
-        <w:t>(63)</w:t>
-      </w:r>
-      <w:r>
-        <w:rPr>
-          <w:rFonts w:ascii="Arial" w:hAnsi="Arial" w:cs="Arial"/>
-          <w:color w:val="000000" w:themeColor="text1"/>
-          <w:sz w:val="20"/>
-          <w:szCs w:val="20"/>
-        </w:rPr>
-        <w:fldChar w:fldCharType="end"/>
-      </w:r>
-      <w:r>
-        <w:rPr>
-          <w:rFonts w:ascii="Arial" w:hAnsi="Arial" w:cs="Arial"/>
-          <w:color w:val="000000" w:themeColor="text1"/>
-          <w:sz w:val="20"/>
-          <w:szCs w:val="20"/>
-        </w:rPr>
-        <w:t>.</w:t>
-      </w:r>
-    </w:p>
-    <w:p>
-      <w:pPr>
-        <w:pStyle w:val="Default"/>
-        <w:rPr>
-          <w:rFonts w:ascii="Arial" w:hAnsi="Arial" w:cs="Arial"/>
-          <w:color w:val="000000" w:themeColor="text1"/>
-          <w:sz w:val="20"/>
-          <w:szCs w:val="20"/>
-        </w:rPr>
-      </w:pPr>
-    </w:p>
-    <w:p>
-      <w:pPr>
-        <w:pStyle w:val="Default"/>
-        <w:rPr>
-          <w:rFonts w:ascii="Arial" w:hAnsi="Arial" w:cs="Arial"/>
-          <w:color w:val="000000" w:themeColor="text1"/>
-          <w:sz w:val="20"/>
-          <w:szCs w:val="20"/>
-        </w:rPr>
-      </w:pPr>
-      <w:r>
-        <w:rPr>
-          <w:rFonts w:ascii="Arial" w:hAnsi="Arial" w:cs="Arial"/>
-          <w:color w:val="000000" w:themeColor="text1"/>
-          <w:sz w:val="20"/>
-          <w:szCs w:val="20"/>
-        </w:rPr>
-        <w:t>For the ATAC modality, the top features within each sequencing pool were identified using FindTopFeatures() (min.cutoff = 10). Term frequency–inverse document frequency (TF-IDF) normalization was performed using RunTFIDF(), followed by singular value decomposition using RunSVD() (n = 50) with features identified by FindTopFeatures(). Pools were then merged, and the same processing steps were applied to the combined dataset. Integration anchors were identified using FindIntegrationAnchors() (anchor.features = VariableFeatures, dims = 2:30, n.trees = 100, l2.norm = FALSE, scale = FALSE, max.features = 500). IntegrateEmbeddings() was then used with these anchors to generate a unified latent semantic indexing (LSI) reduction.</w:t>
-      </w:r>
-    </w:p>
-    <w:p>
-      <w:pPr>
-        <w:pStyle w:val="Default"/>
-        <w:rPr>
-          <w:rFonts w:ascii="Arial" w:hAnsi="Arial" w:cs="Arial"/>
-          <w:color w:val="000000" w:themeColor="text1"/>
-          <w:sz w:val="20"/>
-          <w:szCs w:val="20"/>
-        </w:rPr>
-      </w:pPr>
-    </w:p>
-    <w:p>
-      <w:pPr>
-        <w:pStyle w:val="Default"/>
-        <w:rPr>
-          <w:rFonts w:ascii="Arial" w:hAnsi="Arial" w:cs="Arial"/>
-          <w:color w:val="000000" w:themeColor="text1"/>
-          <w:sz w:val="20"/>
-          <w:szCs w:val="20"/>
-        </w:rPr>
-      </w:pPr>
-      <w:r>
-        <w:rPr>
-          <w:rFonts w:ascii="Arial" w:hAnsi="Arial" w:cs="Arial"/>
-          <w:color w:val="000000" w:themeColor="text1"/>
-          <w:sz w:val="20"/>
-          <w:szCs w:val="20"/>
-        </w:rPr>
-        <w:t xml:space="preserve">A weighted nearest-neighbor graph integrating both modalities was constructed using FindMultiModalNeighbors() (RNA dimensions = 1:50; ATAC dimensions = 2:50; prune.SNN = 0), using the RNA Harmony and ATAC LSI reductions. A uniform manifold approximation and projection (UMAP) was generated using RunUMAP() (min.dist = 0.4, metric = "euclidean"), and clusters were identified using FindClusters() (algorithm = 3, resolution = 0.4). An initial clustering resolution of 0.4 was selected based on the method described by Bai and Chu (2024) </w:t>
-      </w:r>
-      <w:r>
-        <w:rPr>
-          <w:rFonts w:ascii="Arial" w:hAnsi="Arial" w:cs="Arial"/>
-          <w:color w:val="000000" w:themeColor="text1"/>
-          <w:sz w:val="20"/>
-          <w:szCs w:val="20"/>
-        </w:rPr>
-        <w:fldChar w:fldCharType="begin"/>
-      </w:r>
-      <w:r>
-        <w:rPr>
-          <w:rFonts w:ascii="Arial" w:hAnsi="Arial" w:cs="Arial"/>
-          <w:color w:val="000000" w:themeColor="text1"/>
-          <w:sz w:val="20"/>
-          <w:szCs w:val="20"/>
-        </w:rPr>
-        <w:instrText xml:space="preserve"> ADDIN ZOTERO_ITEM CSL_CITATION {"citationID":"gGtPOlyE","properties":{"unsorted":false,"formattedCitation":"(64)","plainCitation":"(64)","noteIndex":0},"citationItems":[{"id":3490,"uris":["http://zotero.org/users/11313215/items/8DNNEG88"],"itemData":{"id":3490,"type":"article","abstract":"We consider the problem of estimating the number of clusters (k) in a dataset. We propose a non-parametric approach to the problem that utilizes similarity graphs to construct a robust statistic that effectively captures similarity information among observations. This graph-based statistic is applicable to datasets of any dimension, is computationally efficient to obtain, and can be paired with any kind of clustering technique. Asymptotic theory is developed to establish the selection consistency of the proposed approach. Simulation studies demonstrate that the graph-based statistic outperforms existing methods for estimating k, especially in the high-dimensional setting. We illustrate its utility on an imaging dataset and an RNA-seq dataset.","DOI":"10.48550/arXiv.2402.15600","note":"arXiv:2402.15600 [stat]","number":"arXiv:2402.15600","publisher":"arXiv","source":"arXiv.org","title":"A Graph-based Approach to Estimating the Number of Clusters","URL":"http://arxiv.org/abs/2402.15600","author":[{"family":"Bai","given":"Yichuan"},{"family":"Chu","given":"Lynna"}],"accessed":{"date-parts":[["2025",3,11]]},"issued":{"date-parts":[["2024",11,5]]}}}],"schema":"https://github.com/citation-style-language/schema/raw/master/csl-citation.json"} </w:instrText>
-      </w:r>
-      <w:r>
-        <w:rPr>
-          <w:rFonts w:ascii="Arial" w:hAnsi="Arial" w:cs="Arial"/>
-          <w:color w:val="000000" w:themeColor="text1"/>
-          <w:sz w:val="20"/>
-          <w:szCs w:val="20"/>
-        </w:rPr>
-        <w:fldChar w:fldCharType="separate"/>
-      </w:r>
-      <w:r>
-        <w:rPr>
-          <w:rFonts w:ascii="Arial" w:hAnsi="Arial" w:cs="Arial"/>
-          <w:noProof/>
-          <w:color w:val="000000" w:themeColor="text1"/>
-          <w:sz w:val="20"/>
-          <w:szCs w:val="20"/>
-        </w:rPr>
-        <w:t>(64)</w:t>
-      </w:r>
-      <w:r>
-        <w:rPr>
-          <w:rFonts w:ascii="Arial" w:hAnsi="Arial" w:cs="Arial"/>
-          <w:color w:val="000000" w:themeColor="text1"/>
-          <w:sz w:val="20"/>
-          <w:szCs w:val="20"/>
-        </w:rPr>
-        <w:fldChar w:fldCharType="end"/>
-      </w:r>
-      <w:r>
-        <w:rPr>
-          <w:rFonts w:ascii="Arial" w:hAnsi="Arial" w:cs="Arial"/>
-          <w:color w:val="000000" w:themeColor="text1"/>
-          <w:sz w:val="20"/>
-          <w:szCs w:val="20"/>
-        </w:rPr>
-        <w:t>.</w:t>
-      </w:r>
-    </w:p>
-    <w:p>
-      <w:pPr>
-        <w:rPr>
-          <w:rFonts w:ascii="Arial" w:hAnsi="Arial" w:cs="Arial"/>
-          <w:sz w:val="20"/>
-          <w:szCs w:val="20"/>
-        </w:rPr>
-      </w:pPr>
-    </w:p>
-    <w:p>
-      <w:pPr>
-        <w:rPr>
-          <w:rFonts w:ascii="Arial" w:hAnsi="Arial" w:cs="Arial"/>
-          <w:sz w:val="20"/>
-          <w:szCs w:val="20"/>
-          <w:u w:val="single"/>
-        </w:rPr>
-      </w:pPr>
-      <w:r>
-        <w:rPr>
-          <w:rFonts w:ascii="Arial" w:hAnsi="Arial" w:cs="Arial"/>
-          <w:sz w:val="20"/>
-          <w:szCs w:val="20"/>
-          <w:u w:val="single"/>
-        </w:rPr>
-        <w:t xml:space="preserve">Removal of </w:t>
-      </w:r>
-      <w:r>
-        <w:rPr>
-          <w:rFonts w:ascii="Arial" w:hAnsi="Arial" w:cs="Arial"/>
-          <w:sz w:val="20"/>
-          <w:szCs w:val="20"/>
-          <w:u w:val="single"/>
-        </w:rPr>
-        <w:t>D</w:t>
-      </w:r>
-      <w:r>
-        <w:rPr>
-          <w:rFonts w:ascii="Arial" w:hAnsi="Arial" w:cs="Arial"/>
-          <w:sz w:val="20"/>
-          <w:szCs w:val="20"/>
-          <w:u w:val="single"/>
-        </w:rPr>
-        <w:t xml:space="preserve">issection </w:t>
-      </w:r>
-      <w:r>
-        <w:rPr>
-          <w:rFonts w:ascii="Arial" w:hAnsi="Arial" w:cs="Arial"/>
-          <w:sz w:val="20"/>
-          <w:szCs w:val="20"/>
-          <w:u w:val="single"/>
-        </w:rPr>
-        <w:t>E</w:t>
-      </w:r>
-      <w:r>
-        <w:rPr>
-          <w:rFonts w:ascii="Arial" w:hAnsi="Arial" w:cs="Arial"/>
-          <w:sz w:val="20"/>
-          <w:szCs w:val="20"/>
-          <w:u w:val="single"/>
-        </w:rPr>
-        <w:t>rrors</w:t>
-      </w:r>
-    </w:p>
-    <w:p>
-      <w:pPr>
-        <w:rPr>
-          <w:rFonts w:ascii="Arial" w:hAnsi="Arial" w:cs="Arial"/>
-          <w:sz w:val="20"/>
-          <w:szCs w:val="20"/>
-        </w:rPr>
-      </w:pPr>
-      <w:r>
-        <w:rPr>
-          <w:rFonts w:ascii="Arial" w:hAnsi="Arial" w:cs="Arial"/>
-          <w:sz w:val="20"/>
-          <w:szCs w:val="20"/>
-        </w:rPr>
-        <w:tab/>
-        <w:t xml:space="preserve">To remove clusters likely the result of </w:t>
-      </w:r>
-      <w:r>
-        <w:rPr>
-          <w:rFonts w:ascii="Arial" w:hAnsi="Arial" w:cs="Arial"/>
-          <w:sz w:val="20"/>
-          <w:szCs w:val="20"/>
-        </w:rPr>
-        <w:t xml:space="preserve">dissection errors, we first excluded any clusters that appeared in. &lt; 90% of individuals. Next, we calculated the coefficient of variation (CV) for each clusters relative abundance across all individuals and excluded any clusters with a CV higher than </w:t>
-      </w:r>
-      <w:commentRangeStart w:id="13"/>
-      <w:r>
-        <w:rPr>
-          <w:rFonts w:ascii="Arial" w:hAnsi="Arial" w:cs="Arial"/>
-          <w:sz w:val="20"/>
-          <w:szCs w:val="20"/>
-          <w:highlight w:val="yellow"/>
-        </w:rPr>
-        <w:t>XX</w:t>
-      </w:r>
-      <w:r>
-        <w:rPr>
-          <w:rFonts w:ascii="Arial" w:hAnsi="Arial" w:cs="Arial"/>
-          <w:sz w:val="20"/>
-          <w:szCs w:val="20"/>
-        </w:rPr>
-        <w:t xml:space="preserve"> Justin</w:t>
-      </w:r>
-      <w:commentRangeEnd w:id="13"/>
-      <w:r>
-        <w:rPr>
-          <w:rStyle w:val="CommentReference"/>
-          <w:rFonts w:ascii="Arial" w:hAnsi="Arial" w:cs="Arial"/>
-          <w:sz w:val="20"/>
-          <w:szCs w:val="20"/>
-        </w:rPr>
-        <w:commentReference w:id="13"/>
-      </w:r>
-      <w:r>
-        <w:rPr>
-          <w:rFonts w:ascii="Arial" w:hAnsi="Arial" w:cs="Arial"/>
-          <w:sz w:val="20"/>
-          <w:szCs w:val="20"/>
-        </w:rPr>
-        <w:t xml:space="preserve">. </w:t>
-      </w:r>
-    </w:p>
-    <w:p>
-      <w:pPr>
-        <w:rPr>
-          <w:rFonts w:ascii="Arial" w:hAnsi="Arial" w:cs="Arial"/>
-          <w:sz w:val="20"/>
-          <w:szCs w:val="20"/>
-        </w:rPr>
-      </w:pPr>
-    </w:p>
-    <w:p>
-      <w:pPr>
-        <w:rPr>
-          <w:rFonts w:ascii="Arial" w:hAnsi="Arial" w:cs="Arial"/>
-          <w:sz w:val="20"/>
-          <w:szCs w:val="20"/>
-          <w:u w:val="single"/>
-        </w:rPr>
-      </w:pPr>
-      <w:r>
-        <w:rPr>
-          <w:rFonts w:ascii="Arial" w:hAnsi="Arial" w:cs="Arial"/>
-          <w:sz w:val="20"/>
-          <w:szCs w:val="20"/>
-          <w:u w:val="single"/>
-        </w:rPr>
-        <w:t>Final</w:t>
-      </w:r>
-      <w:r>
-        <w:rPr>
-          <w:rFonts w:ascii="Arial" w:hAnsi="Arial" w:cs="Arial"/>
-          <w:sz w:val="20"/>
-          <w:szCs w:val="20"/>
-          <w:u w:val="single"/>
-        </w:rPr>
-        <w:t xml:space="preserve"> Clustering</w:t>
-      </w:r>
-    </w:p>
-    <w:p>
-      <w:pPr>
-        <w:rPr>
-          <w:rFonts w:ascii="Arial" w:hAnsi="Arial" w:cs="Arial"/>
-          <w:sz w:val="20"/>
-          <w:szCs w:val="20"/>
-        </w:rPr>
-      </w:pPr>
-      <w:r>
-        <w:rPr>
-          <w:rFonts w:ascii="Arial" w:hAnsi="Arial" w:cs="Arial"/>
-          <w:sz w:val="20"/>
-          <w:szCs w:val="20"/>
-        </w:rPr>
-        <w:tab/>
-        <w:t xml:space="preserve">In order to find the optimal set of parameters for </w:t>
-      </w:r>
-      <w:r>
-        <w:rPr>
-          <w:rFonts w:ascii="Arial" w:hAnsi="Arial" w:cs="Arial"/>
-          <w:sz w:val="20"/>
-          <w:szCs w:val="20"/>
-        </w:rPr>
-        <w:t xml:space="preserve">WNN clustering, we next performed a parameter sweep across RNA principal </w:t>
-      </w:r>
-      <w:r>
-        <w:rPr>
-          <w:rFonts w:ascii="Arial" w:hAnsi="Arial" w:cs="Arial"/>
-          <w:sz w:val="20"/>
-          <w:szCs w:val="20"/>
-        </w:rPr>
-        <w:t>componen</w:t>
-      </w:r>
-      <w:r>
-        <w:rPr>
-          <w:rFonts w:ascii="Arial" w:hAnsi="Arial" w:cs="Arial"/>
-          <w:sz w:val="20"/>
-          <w:szCs w:val="20"/>
-        </w:rPr>
-        <w:t>ts (30-50), ATAC LSI com</w:t>
-      </w:r>
-      <w:r>
-        <w:rPr>
-          <w:rFonts w:ascii="Arial" w:hAnsi="Arial" w:cs="Arial"/>
-          <w:sz w:val="20"/>
-          <w:szCs w:val="20"/>
-        </w:rPr>
-        <w:t>po</w:t>
-      </w:r>
-      <w:r>
-        <w:rPr>
-          <w:rFonts w:ascii="Arial" w:hAnsi="Arial" w:cs="Arial"/>
-          <w:sz w:val="20"/>
-          <w:szCs w:val="20"/>
-        </w:rPr>
-        <w:t>nents (2-50), k-nearest neighbors (30, 40, 50), and Leiden clustering resolution (0.4-1.5). We then selected the combination with the highest mean pairwise Adjusted Rand Index, resulting in our final clustering resolution for downstream analysis being composed of 40 RNA principal components, 45 ATAC LSI components, and 0.8 clustering resolution.</w:t>
-      </w:r>
-    </w:p>
-    <w:p>
-      <w:pPr>
-        <w:rPr>
-          <w:rFonts w:ascii="Arial" w:hAnsi="Arial" w:cs="Arial"/>
-          <w:sz w:val="20"/>
-          <w:szCs w:val="20"/>
-        </w:rPr>
-      </w:pPr>
-    </w:p>
-    <w:p>
-      <w:pPr>
-        <w:rPr>
-          <w:rFonts w:ascii="Arial" w:hAnsi="Arial" w:cs="Arial"/>
-          <w:b/>
-          <w:bCs/>
-          <w:sz w:val="20"/>
-          <w:szCs w:val="20"/>
-        </w:rPr>
-      </w:pPr>
-      <w:r>
-        <w:rPr>
-          <w:rFonts w:ascii="Arial" w:hAnsi="Arial" w:cs="Arial"/>
-          <w:b/>
-          <w:bCs/>
-          <w:sz w:val="20"/>
-          <w:szCs w:val="20"/>
-        </w:rPr>
-        <w:t>Spatial Transcriptomics</w:t>
-      </w:r>
-    </w:p>
-    <w:p>
-      <w:pPr>
-        <w:rPr>
-          <w:rFonts w:ascii="Arial" w:hAnsi="Arial" w:cs="Arial"/>
-          <w:sz w:val="20"/>
-          <w:szCs w:val="20"/>
-          <w:u w:val="single"/>
-        </w:rPr>
-      </w:pPr>
-    </w:p>
-    <w:p>
-      <w:pPr>
-        <w:rPr>
-          <w:rFonts w:ascii="Arial" w:hAnsi="Arial" w:cs="Arial"/>
-          <w:sz w:val="20"/>
-          <w:szCs w:val="20"/>
-          <w:u w:val="single"/>
-        </w:rPr>
-      </w:pPr>
-      <w:r>
-        <w:rPr>
-          <w:rFonts w:ascii="Arial" w:hAnsi="Arial" w:cs="Arial"/>
-          <w:sz w:val="20"/>
-          <w:szCs w:val="20"/>
-          <w:u w:val="single"/>
-        </w:rPr>
-        <w:t>Tissue Collection and Sectioning</w:t>
-      </w:r>
-    </w:p>
-    <w:p>
-      <w:pPr>
-        <w:rPr>
-          <w:rFonts w:ascii="Arial" w:hAnsi="Arial" w:cs="Arial"/>
-          <w:sz w:val="20"/>
-          <w:szCs w:val="20"/>
-          <w:u w:val="single"/>
-        </w:rPr>
-      </w:pPr>
-    </w:p>
-    <w:p>
-      <w:pPr>
-        <w:rPr>
-          <w:rFonts w:ascii="Arial" w:hAnsi="Arial" w:cs="Arial"/>
-          <w:sz w:val="20"/>
-          <w:szCs w:val="20"/>
-        </w:rPr>
-      </w:pPr>
-      <w:r>
-        <w:rPr>
-          <w:rFonts w:ascii="Arial" w:hAnsi="Arial" w:cs="Arial"/>
-          <w:sz w:val="20"/>
-          <w:szCs w:val="20"/>
-        </w:rPr>
-        <w:t xml:space="preserve">Six males and six females from six tanks containing established male–female reproductive pairs were sampled (12 fish total; </w:t>
-      </w:r>
-      <w:r>
-        <w:rPr>
-          <w:rFonts w:ascii="Arial" w:hAnsi="Arial" w:cs="Arial"/>
-          <w:sz w:val="20"/>
-          <w:szCs w:val="20"/>
-          <w:highlight w:val="yellow"/>
-        </w:rPr>
-        <w:t xml:space="preserve">see Supplementary Table </w:t>
-      </w:r>
-      <w:r>
-        <w:rPr>
-          <w:rFonts w:ascii="Arial" w:hAnsi="Arial" w:cs="Arial"/>
-          <w:sz w:val="20"/>
-          <w:szCs w:val="20"/>
-          <w:highlight w:val="yellow"/>
-        </w:rPr>
-        <w:t>xx</w:t>
-      </w:r>
-      <w:r>
-        <w:rPr>
-          <w:rFonts w:ascii="Arial" w:hAnsi="Arial" w:cs="Arial"/>
-          <w:sz w:val="20"/>
-          <w:szCs w:val="20"/>
-          <w:highlight w:val="yellow"/>
-        </w:rPr>
-        <w:t xml:space="preserve"> for lengths and weights</w:t>
-      </w:r>
-      <w:r>
-        <w:rPr>
-          <w:rFonts w:ascii="Arial" w:hAnsi="Arial" w:cs="Arial"/>
-          <w:sz w:val="20"/>
-          <w:szCs w:val="20"/>
-        </w:rPr>
-        <w:t>). Fish were decapitated, and brains were rapidly removed and placed in molds containing chilled OCT maintained at wet-ice temperature. Each mold contained four brains representing two reproductive pairs from two tanks (two males and two females). Brains were arranged with the anterior end facing down and the spinal cord facing up, with the two female brains positioned in the top row and the two male brains in the bottom row. This arrangement was designed to maximize the amount of brain tissue that could be accommodated within the capture area of each Visium HD slide.</w:t>
-      </w:r>
-    </w:p>
-    <w:p>
-      <w:pPr>
-        <w:rPr>
-          <w:rFonts w:ascii="Arial" w:hAnsi="Arial" w:cs="Arial"/>
-          <w:sz w:val="20"/>
-          <w:szCs w:val="20"/>
-        </w:rPr>
-      </w:pPr>
-    </w:p>
-    <w:p>
-      <w:pPr>
-        <w:rPr>
-          <w:rFonts w:ascii="Arial" w:hAnsi="Arial" w:cs="Arial"/>
-          <w:sz w:val="20"/>
-          <w:szCs w:val="20"/>
-        </w:rPr>
-      </w:pPr>
-      <w:r>
-        <w:rPr>
-          <w:rFonts w:ascii="Arial" w:hAnsi="Arial" w:cs="Arial"/>
-          <w:sz w:val="20"/>
-          <w:szCs w:val="20"/>
-        </w:rPr>
-        <w:t xml:space="preserve">Following embedding, molds were frozen at −80°C and transferred directly to a cryostat for fresh-frozen sectioning. Brains were sectioned at 10 μm, and sections were selected for Visium HD based on tissue quality and anatomical coverage, with the goal of maximizing the brain area represented and sampling across the rostrocaudal extent of the dissected regions. Four sections were placed on each Visium HD slide, with each section containing tissue from four fish representing two tanks. Four Visium HD slides </w:t>
-      </w:r>
-      <w:r>
-        <w:rPr>
-          <w:rFonts w:ascii="Arial" w:hAnsi="Arial" w:cs="Arial"/>
-          <w:sz w:val="20"/>
-          <w:szCs w:val="20"/>
-        </w:rPr>
-        <w:lastRenderedPageBreak/>
-        <w:t>were prepared. Two slides contained sections from the same four fish (two reproductive pairs), whereas the remaining two slides contained sections from the other eight fish (four reproductive pairs). Thus, all 12 fish were represented across the four slides, with four fish represented on two slides.</w:t>
-      </w:r>
-    </w:p>
-    <w:p>
-      <w:pPr>
-        <w:rPr>
-          <w:rFonts w:ascii="Arial" w:hAnsi="Arial" w:cs="Arial"/>
-          <w:sz w:val="20"/>
-          <w:szCs w:val="20"/>
-        </w:rPr>
-      </w:pPr>
-    </w:p>
-    <w:p>
-      <w:pPr>
-        <w:rPr>
-          <w:rFonts w:ascii="Arial" w:hAnsi="Arial" w:cs="Arial"/>
-          <w:sz w:val="20"/>
-          <w:szCs w:val="20"/>
-        </w:rPr>
-      </w:pPr>
-      <w:r>
-        <w:rPr>
-          <w:rFonts w:ascii="Arial" w:hAnsi="Arial" w:cs="Arial"/>
-          <w:sz w:val="20"/>
-          <w:szCs w:val="20"/>
-        </w:rPr>
-        <w:t>Sections were briefly thawed to promote adherence to the slide and then immediately returned to frozen conditions on dry ice or at −80°C until Visium HD processing. Although every effort was made to maintain a consistent plane of section, some brains were sectioned at slightly oblique angles.</w:t>
-      </w:r>
-    </w:p>
-    <w:p>
-      <w:pPr>
-        <w:rPr>
-          <w:rFonts w:ascii="Arial" w:hAnsi="Arial" w:cs="Arial"/>
-          <w:sz w:val="20"/>
-          <w:szCs w:val="20"/>
-        </w:rPr>
-      </w:pPr>
-    </w:p>
-    <w:p>
-      <w:pPr>
-        <w:rPr>
-          <w:rFonts w:ascii="Arial" w:hAnsi="Arial" w:cs="Arial"/>
-          <w:sz w:val="20"/>
-          <w:szCs w:val="20"/>
-          <w:u w:val="single"/>
-        </w:rPr>
-      </w:pPr>
-      <w:commentRangeStart w:id="14"/>
-      <w:r>
-        <w:rPr>
-          <w:rFonts w:ascii="Arial" w:hAnsi="Arial" w:cs="Arial"/>
-          <w:sz w:val="20"/>
-          <w:szCs w:val="20"/>
-          <w:u w:val="single"/>
-        </w:rPr>
-        <w:t>Visium HD</w:t>
-      </w:r>
-      <w:r>
-        <w:rPr>
-          <w:rFonts w:ascii="Arial" w:hAnsi="Arial" w:cs="Arial"/>
-          <w:sz w:val="20"/>
-          <w:szCs w:val="20"/>
-          <w:u w:val="single"/>
-        </w:rPr>
-        <w:t xml:space="preserve"> </w:t>
-      </w:r>
-      <w:r>
-        <w:rPr>
-          <w:rFonts w:ascii="Arial" w:hAnsi="Arial" w:cs="Arial"/>
-          <w:sz w:val="20"/>
-          <w:szCs w:val="20"/>
-          <w:u w:val="single"/>
-        </w:rPr>
-        <w:t>3’ Spatial transcriptomic</w:t>
-      </w:r>
-      <w:r>
-        <w:rPr>
-          <w:rFonts w:ascii="Arial" w:hAnsi="Arial" w:cs="Arial"/>
-          <w:sz w:val="20"/>
-          <w:szCs w:val="20"/>
-          <w:u w:val="single"/>
-        </w:rPr>
-        <w:t>s</w:t>
-      </w:r>
-    </w:p>
-    <w:p>
-      <w:pPr>
-        <w:rPr>
-          <w:rFonts w:ascii="Arial" w:hAnsi="Arial" w:cs="Arial"/>
-          <w:sz w:val="20"/>
-          <w:szCs w:val="20"/>
-        </w:rPr>
-      </w:pPr>
-    </w:p>
-    <w:p>
-      <w:pPr>
-        <w:ind w:firstLine="720"/>
-        <w:rPr>
-          <w:rFonts w:ascii="Arial" w:hAnsi="Arial" w:cs="Arial"/>
-          <w:sz w:val="20"/>
-          <w:szCs w:val="20"/>
-        </w:rPr>
-      </w:pPr>
-      <w:r>
-        <w:rPr>
-          <w:rFonts w:ascii="Arial" w:hAnsi="Arial" w:cs="Arial"/>
-          <w:sz w:val="20"/>
-          <w:szCs w:val="20"/>
-        </w:rPr>
-        <w:t>For Visium HD 3′ Spatial Gene Expression analysis, fresh frozen tissue sections were prepared according to the manufacturer's recommended tissue preparation workflow (CG000804, Rev B, 10x Genomics, USA). The workflow includes tissue sectioning, fixation, hematoxylin and eosin (H&amp;E) staining, and imaging. Visium HD 3′ is designed specifically for fresh frozen tissue and uses polyadenylated RNA for whole transcriptome capture. Following tissue fixation, sections were stained with H&amp;E to visualize tissue morphology. The stained tissue sections were imaged using a high-resolution microscope, generating a brightfield image for subsequent spatial registration and analysis. Following imaging, (Visium HD 3' Spatial Gene Expression, CG000805, Rev B) the tissue slide was aligned with the Visium HD 3′ spatial capture slide using the Visium CytAssist instrument. The CytAssist system positions the tissue section relative to the spatially barcoded capture surface. The tissue was subsequently processed to allow release of cellular RNA. Polyadenylated RNA molecules released from the tissue were captured by oligonucleotides containing spatial barcodes, unique molecular identifiers (UMIs), and poly(dT) sequences. The poly(dT) sequences hybridize to the poly(A) tails of mRNA molecules. This results in each captured transcript being associated with a spatial barcode corresponding to its original location in the tissue. Captured RNA was subjected to reverse transcription to generate spatially barcoded cDNA. During this process, the spatial barcode and UMI information become associated with the resulting cDNA molecules.</w:t>
-      </w:r>
-      <w:commentRangeEnd w:id="14"/>
-      <w:r>
-        <w:rPr>
-          <w:rStyle w:val="CommentReference"/>
-          <w:rFonts w:ascii="Arial" w:hAnsi="Arial" w:cs="Arial"/>
-          <w:sz w:val="20"/>
-          <w:szCs w:val="20"/>
-        </w:rPr>
-        <w:commentReference w:id="14"/>
-      </w:r>
-    </w:p>
-    <w:p>
-      <w:pPr>
-        <w:rPr>
-          <w:rFonts w:ascii="Arial" w:hAnsi="Arial" w:cs="Arial"/>
-          <w:sz w:val="20"/>
-          <w:szCs w:val="20"/>
-        </w:rPr>
-      </w:pPr>
-    </w:p>
-    <w:p>
-      <w:pPr>
-        <w:rPr>
-          <w:rFonts w:ascii="Arial" w:hAnsi="Arial" w:cs="Arial"/>
-          <w:sz w:val="20"/>
-          <w:szCs w:val="20"/>
-          <w:u w:val="single"/>
-        </w:rPr>
-      </w:pPr>
-      <w:r>
-        <w:rPr>
-          <w:rFonts w:ascii="Arial" w:hAnsi="Arial" w:cs="Arial"/>
-          <w:sz w:val="20"/>
-          <w:szCs w:val="20"/>
-          <w:u w:val="single"/>
-        </w:rPr>
-        <w:t>Final construction and sequencing of 10x Visium libraries</w:t>
-      </w:r>
-    </w:p>
-    <w:p>
-      <w:pPr>
-        <w:rPr>
-          <w:rFonts w:ascii="Arial" w:hAnsi="Arial" w:cs="Arial"/>
-          <w:sz w:val="20"/>
-          <w:szCs w:val="20"/>
-        </w:rPr>
-      </w:pPr>
-    </w:p>
-    <w:p>
-      <w:pPr>
-        <w:ind w:firstLine="720"/>
-        <w:rPr>
-          <w:rFonts w:ascii="Arial" w:hAnsi="Arial" w:cs="Arial"/>
-          <w:sz w:val="20"/>
-          <w:szCs w:val="20"/>
-        </w:rPr>
-      </w:pPr>
-      <w:r>
-        <w:rPr>
-          <w:rFonts w:ascii="Arial" w:hAnsi="Arial" w:cs="Arial"/>
-          <w:sz w:val="20"/>
-          <w:szCs w:val="20"/>
-        </w:rPr>
-        <w:t xml:space="preserve">Spatially barcoded cDNAs were immediately brought to the </w:t>
-      </w:r>
-      <w:r>
-        <w:rPr>
-          <w:rFonts w:ascii="Arial" w:hAnsi="Arial" w:cs="Arial"/>
-          <w:sz w:val="20"/>
-          <w:szCs w:val="20"/>
-        </w:rPr>
-        <w:t xml:space="preserve">UIUC Carver Biotech </w:t>
-      </w:r>
-      <w:r>
-        <w:rPr>
-          <w:rFonts w:ascii="Arial" w:hAnsi="Arial" w:cs="Arial"/>
-          <w:sz w:val="20"/>
-          <w:szCs w:val="20"/>
-        </w:rPr>
-        <w:t>DNA Services Core for amplification, strictly following the 10x Genomics Visium HD 3’ Fresh Frozen protocol. The amplified cDNAs were enzymatically fragmented and converted into sequencing-ready, dual-indexed libraries through standard end-repair, A-tailing, adaptor ligation, and PCR. The final libraries were quantitated on Qubit (Life Technologies, Grand Island, NY) and the average size determined on the Fragment Analyzer (Agilent Technologies, Santa Clara, CA). The libraries were pooled by calculated capture spot coverage via Loupe Browser and the pool diluted to 5nM concentration, then further quantitated by qPCR on a Bio-Rad CFX Connect Real-Time System (Bio-Rad Laboratories, Inc. CA). The final pool was sequenced on one lane of 25B flowcell on an Illumina NovaSeq X Plus (Illumina, San Diego, CA) to a length of 43nt (read 1, contains the spot barcode and unique molecular identifier used for removing PCR duplicates), 10nt for each index (libraries contain unique dual indexes to prevent index switching) and 75nt for read 2 (the cDNA read). Fastq.gz files were generated and demultiplexed with bcl-convert v4.3.6 Conversion Software (Illumina).</w:t>
-      </w:r>
-    </w:p>
-    <w:p>
-      <w:pPr>
-        <w:rPr>
-          <w:rFonts w:ascii="Arial" w:hAnsi="Arial" w:cs="Arial"/>
-          <w:sz w:val="20"/>
-          <w:szCs w:val="20"/>
-          <w:u w:val="single"/>
-        </w:rPr>
-      </w:pPr>
-    </w:p>
-    <w:p>
-      <w:pPr>
-        <w:rPr>
-          <w:rFonts w:ascii="Arial" w:hAnsi="Arial" w:cs="Arial"/>
-          <w:sz w:val="20"/>
-          <w:szCs w:val="20"/>
-          <w:u w:val="single"/>
-        </w:rPr>
-      </w:pPr>
-      <w:r>
-        <w:rPr>
-          <w:rFonts w:ascii="Arial" w:hAnsi="Arial" w:cs="Arial"/>
-          <w:sz w:val="20"/>
-          <w:szCs w:val="20"/>
-          <w:u w:val="single"/>
-        </w:rPr>
-        <w:t>Read Alignment</w:t>
-      </w:r>
-    </w:p>
-    <w:p>
-      <w:pPr>
-        <w:rPr>
-          <w:rFonts w:ascii="Arial" w:hAnsi="Arial" w:cs="Arial"/>
-          <w:sz w:val="20"/>
-          <w:szCs w:val="20"/>
-        </w:rPr>
-      </w:pPr>
-      <w:r>
-        <w:rPr>
-          <w:rFonts w:ascii="Arial" w:hAnsi="Arial" w:cs="Arial"/>
-          <w:sz w:val="20"/>
-          <w:szCs w:val="20"/>
-        </w:rPr>
-        <w:tab/>
-      </w:r>
-      <w:commentRangeStart w:id="15"/>
-      <w:r>
-        <w:rPr>
-          <w:rFonts w:ascii="Arial" w:hAnsi="Arial" w:cs="Arial"/>
-          <w:sz w:val="20"/>
-          <w:szCs w:val="20"/>
-        </w:rPr>
-        <w:t xml:space="preserve">Reads were aligned using space ranger version </w:t>
-      </w:r>
-      <w:r>
-        <w:rPr>
-          <w:rFonts w:ascii="Arial" w:hAnsi="Arial" w:cs="Arial"/>
-          <w:sz w:val="20"/>
-          <w:szCs w:val="20"/>
-          <w:highlight w:val="yellow"/>
-        </w:rPr>
-        <w:t>xx</w:t>
-      </w:r>
-      <w:commentRangeEnd w:id="15"/>
-      <w:r>
-        <w:rPr>
-          <w:rStyle w:val="CommentReference"/>
-          <w:rFonts w:ascii="Arial" w:hAnsi="Arial" w:cs="Arial"/>
-          <w:sz w:val="20"/>
-          <w:szCs w:val="20"/>
-        </w:rPr>
-        <w:commentReference w:id="15"/>
-      </w:r>
-      <w:r>
-        <w:rPr>
-          <w:rFonts w:ascii="Arial" w:hAnsi="Arial" w:cs="Arial"/>
-          <w:sz w:val="20"/>
-          <w:szCs w:val="20"/>
-        </w:rPr>
-        <w:t>Jenny</w:t>
-      </w:r>
-    </w:p>
-    <w:p>
-      <w:pPr>
-        <w:rPr>
-          <w:rFonts w:ascii="Arial" w:hAnsi="Arial" w:cs="Arial"/>
-          <w:b/>
-          <w:bCs/>
-          <w:sz w:val="20"/>
-          <w:szCs w:val="20"/>
-        </w:rPr>
-      </w:pPr>
-    </w:p>
-    <w:p>
-      <w:pPr>
-        <w:rPr>
-          <w:rFonts w:ascii="Arial" w:hAnsi="Arial" w:cs="Arial"/>
-          <w:sz w:val="20"/>
-          <w:szCs w:val="20"/>
-          <w:u w:val="single"/>
-        </w:rPr>
-      </w:pPr>
-      <w:r>
-        <w:rPr>
-          <w:rFonts w:ascii="Arial" w:hAnsi="Arial" w:cs="Arial"/>
-          <w:sz w:val="20"/>
-          <w:szCs w:val="20"/>
-          <w:u w:val="single"/>
-        </w:rPr>
-        <w:t>Quality Control</w:t>
-      </w:r>
-      <w:r>
-        <w:rPr>
-          <w:rFonts w:ascii="Arial" w:hAnsi="Arial" w:cs="Arial"/>
-          <w:sz w:val="20"/>
-          <w:szCs w:val="20"/>
-          <w:u w:val="single"/>
-        </w:rPr>
-        <w:t xml:space="preserve"> </w:t>
-      </w:r>
-      <w:r>
-        <w:rPr>
-          <w:rFonts w:ascii="Arial" w:hAnsi="Arial" w:cs="Arial"/>
-          <w:sz w:val="20"/>
-          <w:szCs w:val="20"/>
-          <w:u w:val="single"/>
-        </w:rPr>
-        <w:t>and Sketching</w:t>
-      </w:r>
-      <w:r>
-        <w:rPr>
-          <w:rFonts w:ascii="Arial" w:hAnsi="Arial" w:cs="Arial"/>
-          <w:sz w:val="20"/>
-          <w:szCs w:val="20"/>
-          <w:u w:val="single"/>
-        </w:rPr>
-        <w:t xml:space="preserve"> </w:t>
-      </w:r>
-    </w:p>
-    <w:p>
-      <w:pPr>
-        <w:rPr>
-          <w:rFonts w:ascii="Arial" w:hAnsi="Arial" w:cs="Arial"/>
-          <w:sz w:val="20"/>
-          <w:szCs w:val="20"/>
-        </w:rPr>
-      </w:pPr>
-      <w:r>
-        <w:rPr>
-          <w:rFonts w:ascii="Arial" w:hAnsi="Arial" w:cs="Arial"/>
-          <w:sz w:val="20"/>
-          <w:szCs w:val="20"/>
-        </w:rPr>
-        <w:tab/>
-        <w:t>All four capture areas were merged resulting in 463,466 total spots. Spots with &lt;25 UMIs or ≥50% mitochondrial reads were discarded, resulting in 433,999 spots for downstream analysis. Spot feature counts were then normalized (NormalizeData) and variable features were computed (FindVariableFeatures). For computational efficiency, we then created a SketchData assay (ncells = 50000, method = “LeverageScore”, features = VariableFeatures</w:t>
-      </w:r>
-      <w:r>
-        <w:rPr>
-          <w:rFonts w:ascii="Arial" w:hAnsi="Arial" w:cs="Arial"/>
-          <w:sz w:val="20"/>
-          <w:szCs w:val="20"/>
-        </w:rPr>
-        <w:t xml:space="preserve">) which was used for downstream analyses. </w:t>
-      </w:r>
-    </w:p>
-    <w:p>
-      <w:pPr>
-        <w:rPr>
-          <w:rFonts w:ascii="Arial" w:hAnsi="Arial" w:cs="Arial"/>
-          <w:sz w:val="20"/>
-          <w:szCs w:val="20"/>
-        </w:rPr>
-      </w:pPr>
-    </w:p>
-    <w:p>
-      <w:pPr>
-        <w:rPr>
-          <w:rFonts w:ascii="Arial" w:hAnsi="Arial" w:cs="Arial"/>
-          <w:b/>
-          <w:bCs/>
-          <w:sz w:val="20"/>
-          <w:szCs w:val="20"/>
-        </w:rPr>
-      </w:pPr>
-      <w:r>
-        <w:rPr>
-          <w:rFonts w:ascii="Arial" w:hAnsi="Arial" w:cs="Arial"/>
-          <w:b/>
-          <w:bCs/>
-          <w:sz w:val="20"/>
-          <w:szCs w:val="20"/>
-        </w:rPr>
-        <w:t>Neuroanatomical Annotation</w:t>
-      </w:r>
-    </w:p>
-    <w:p>
-      <w:pPr>
-        <w:ind w:firstLine="720"/>
-        <w:rPr>
-          <w:rFonts w:ascii="Arial" w:hAnsi="Arial" w:cs="Arial"/>
-          <w:sz w:val="20"/>
-          <w:szCs w:val="20"/>
-        </w:rPr>
-      </w:pPr>
-      <w:r>
-        <w:rPr>
-          <w:rFonts w:ascii="Arial" w:hAnsi="Arial" w:cs="Arial"/>
-          <w:sz w:val="20"/>
-          <w:szCs w:val="20"/>
-        </w:rPr>
-        <w:lastRenderedPageBreak/>
-        <w:t xml:space="preserve">Because there is no published atlas for any anemonefish brain, we relied </w:t>
-      </w:r>
-      <w:r>
-        <w:rPr>
-          <w:rFonts w:ascii="Arial" w:hAnsi="Arial" w:cs="Arial"/>
-          <w:sz w:val="20"/>
-          <w:szCs w:val="20"/>
-        </w:rPr>
-        <w:t xml:space="preserve">on a published atlas from </w:t>
+      <w:r>
+        <w:rPr>
+          <w:rFonts w:ascii="Arial" w:hAnsi="Arial" w:cs="Arial"/>
+          <w:sz w:val="20"/>
+          <w:szCs w:val="20"/>
+        </w:rPr>
+        <w:t xml:space="preserve"> Interestingly, we noted a few differences between the </w:t>
       </w:r>
       <w:r>
         <w:rPr>
@@ -23144,128 +23148,6 @@
           <w:sz w:val="20"/>
           <w:szCs w:val="20"/>
         </w:rPr>
-        <w:t>Astatotilapia burtoni</w:t>
-      </w:r>
-      <w:r>
-        <w:rPr>
-          <w:rFonts w:ascii="Arial" w:hAnsi="Arial" w:cs="Arial"/>
-          <w:sz w:val="20"/>
-          <w:szCs w:val="20"/>
-        </w:rPr>
-        <w:t xml:space="preserve"> </w:t>
-      </w:r>
-      <w:r>
-        <w:rPr>
-          <w:rFonts w:ascii="Arial" w:hAnsi="Arial" w:cs="Arial"/>
-          <w:sz w:val="20"/>
-          <w:szCs w:val="20"/>
-        </w:rPr>
-        <w:fldChar w:fldCharType="begin"/>
-      </w:r>
-      <w:r>
-        <w:rPr>
-          <w:rFonts w:ascii="Arial" w:hAnsi="Arial" w:cs="Arial"/>
-          <w:sz w:val="20"/>
-          <w:szCs w:val="20"/>
-        </w:rPr>
-        <w:instrText xml:space="preserve"> ADDIN ZOTERO_ITEM CSL_CITATION {"citationID":"pOiFwZiB","properties":{"unsorted":false,"formattedCitation":"(65)","plainCitation":"(65)","noteIndex":0},"citationItems":[{"id":6395,"uris":["http://zotero.org/users/11313215/items/QTQQG9ZG"],"itemData":{"id":6395,"type":"article-journal","abstract":"Neural communication depends on release and reception of different neurotransmitters within complex circuits that ultimately mediate basic biological functions. We mapped the distribution of glutamatergic, GABAergic, and cholinergic neurons in the brain of the African cichlid fish Astatotilapia burtoni using in situ hybridization to label vesicular glutamate transporters (vglut1, vglut2.1, vglut3), glutamate decarboxylases (gad1, gad2), and choline acetyltransferase (chat). Cells expressing the glutamatergic markers vgluts 1-3 show primarily nonoverlapping distribution patterns, with the most widespread expression observed for vglut2.1, and more restricted expression of vglut1 and vglut3. vglut1 is prominent in granular layers of the cerebellum, habenula, preglomerular nuclei, and several other diencephalic, mesencephalic, and rhombencephalic regions. vglut2.1 is widely expressed in many nuclei from the olfactory bulbs to the hindbrain, while vglut3 is restricted to the hypothalamus and hindbrain. GABAergic cells show largely overlapping gad1 and gad2 expression in most brain regions. GABAergic expression dominates nuclei of the subpallial ventral telencephalon, while glutamatergic expression dominates nuclei of the pallial dorsal telencephalon. chat-expressing cells are prominent in motor cranial nerve nuclei, and some scattered cells lie in the preoptic area and ventral part of the ventral telencephalon. A localization summary of these markers within regions of the conserved social decision-making network reveals a predominance of either GABAergic or glutamatergic cells within individual nuclei. The neurotransmitter distributions described here in the brain of a single fish species provide an important resource for identification of brain nuclei in other fishes, as well as future comparative studies on circuit organization and function. J. Comp. Neurol. 525:610-638, 2017. © 2016 Wiley Periodicals, Inc.","container-title":"The Journal of Comparative Neurology","DOI":"10.1002/cne.24092","ISSN":"1096-9861","issue":"3","journalAbbreviation":"J Comp Neurol","language":"eng","page":"610-638","PMID":"27507772","source":"PubMed","title":"Localization of glutamatergic, GABAergic, and cholinergic neurons in the brain of the African cichlid fish, Astatotilapia burtoni","volume":"525","author":[{"family":"Maruska","given":"Karen P."},{"family":"Butler","given":"Julie M."},{"family":"Field","given":"Karen E."},{"family":"Porter","given":"Danielle T."}],"issued":{"date-parts":[["2017",2,15]]}}}],"schema":"https://github.com/citation-style-language/schema/raw/master/csl-citation.json"} </w:instrText>
-      </w:r>
-      <w:r>
-        <w:rPr>
-          <w:rFonts w:ascii="Arial" w:hAnsi="Arial" w:cs="Arial"/>
-          <w:sz w:val="20"/>
-          <w:szCs w:val="20"/>
-        </w:rPr>
-        <w:fldChar w:fldCharType="separate"/>
-      </w:r>
-      <w:r>
-        <w:rPr>
-          <w:rFonts w:ascii="Arial" w:hAnsi="Arial" w:cs="Arial"/>
-          <w:sz w:val="20"/>
-          <w:szCs w:val="20"/>
-        </w:rPr>
-        <w:t>(65)</w:t>
-      </w:r>
-      <w:r>
-        <w:rPr>
-          <w:rFonts w:ascii="Arial" w:hAnsi="Arial" w:cs="Arial"/>
-          <w:sz w:val="20"/>
-          <w:szCs w:val="20"/>
-        </w:rPr>
-        <w:fldChar w:fldCharType="end"/>
-      </w:r>
-      <w:r>
-        <w:rPr>
-          <w:rFonts w:ascii="Arial" w:hAnsi="Arial" w:cs="Arial"/>
-          <w:sz w:val="20"/>
-          <w:szCs w:val="20"/>
-        </w:rPr>
-        <w:t xml:space="preserve"> </w:t>
-      </w:r>
-      <w:r>
-        <w:rPr>
-          <w:rFonts w:ascii="Arial" w:hAnsi="Arial" w:cs="Arial"/>
-          <w:sz w:val="20"/>
-          <w:szCs w:val="20"/>
-        </w:rPr>
-        <w:t xml:space="preserve">in combination with unbiased clustering and gene expression </w:t>
-      </w:r>
-      <w:r>
-        <w:rPr>
-          <w:rFonts w:ascii="Arial" w:hAnsi="Arial" w:cs="Arial"/>
-          <w:sz w:val="20"/>
-          <w:szCs w:val="20"/>
-        </w:rPr>
-        <w:t>(see “Spatial Transcriptomics”)</w:t>
-      </w:r>
-      <w:r>
-        <w:rPr>
-          <w:rFonts w:ascii="Arial" w:hAnsi="Arial" w:cs="Arial"/>
-          <w:sz w:val="20"/>
-          <w:szCs w:val="20"/>
-        </w:rPr>
-        <w:t xml:space="preserve"> </w:t>
-      </w:r>
-      <w:r>
-        <w:rPr>
-          <w:rFonts w:ascii="Arial" w:hAnsi="Arial" w:cs="Arial"/>
-          <w:sz w:val="20"/>
-          <w:szCs w:val="20"/>
-        </w:rPr>
-        <w:t xml:space="preserve">for </w:t>
-      </w:r>
-      <w:r>
-        <w:rPr>
-          <w:rFonts w:ascii="Arial" w:hAnsi="Arial" w:cs="Arial"/>
-          <w:sz w:val="20"/>
-          <w:szCs w:val="20"/>
-        </w:rPr>
-        <w:t>our annotations</w:t>
-      </w:r>
-      <w:r>
-        <w:rPr>
-          <w:rFonts w:ascii="Arial" w:hAnsi="Arial" w:cs="Arial"/>
-          <w:sz w:val="20"/>
-          <w:szCs w:val="20"/>
-        </w:rPr>
-        <w:t>.</w:t>
-      </w:r>
-      <w:r>
-        <w:rPr>
-          <w:rFonts w:ascii="Arial" w:hAnsi="Arial" w:cs="Arial"/>
-          <w:sz w:val="20"/>
-          <w:szCs w:val="20"/>
-        </w:rPr>
-        <w:t xml:space="preserve"> Interestingly, we noted a few differences between the </w:t>
-      </w:r>
-      <w:r>
-        <w:rPr>
-          <w:rFonts w:ascii="Arial" w:hAnsi="Arial" w:cs="Arial"/>
-          <w:i/>
-          <w:iCs/>
-          <w:sz w:val="20"/>
-          <w:szCs w:val="20"/>
-        </w:rPr>
         <w:t xml:space="preserve">A. ocellaris </w:t>
       </w:r>
       <w:r>
@@ -23274,6 +23156,7 @@
           <w:sz w:val="20"/>
           <w:szCs w:val="20"/>
         </w:rPr>
+        <w:lastRenderedPageBreak/>
         <w:t xml:space="preserve">and </w:t>
       </w:r>
       <w:r>
@@ -24333,7 +24216,7 @@
           <w:lang w:eastAsia="ja-JP"/>
           <w14:ligatures w14:val="none"/>
         </w:rPr>
-        <w:t xml:space="preserve">). Features that differed between males and intermediates but not females were classified as “Early”, whereas those differing between intermediates and females but </w:t>
+        <w:t xml:space="preserve">). Features that differed between males and intermediates but not females were classified as “Early”, whereas those differing between intermediates and females but not males were classified as “Late”. Features with intermediate values between males and females were classified as “Progressive”, whereas those uniquely elevated or reduced in intermediates were classified </w:t>
       </w:r>
       <w:r>
         <w:rPr>
@@ -24345,7 +24228,7 @@
           <w14:ligatures w14:val="none"/>
         </w:rPr>
         <w:lastRenderedPageBreak/>
-        <w:t>not males were classified as “Late”. Features with intermediate values between males and females were classified as “Progressive”, whereas those uniquely elevated or reduced in intermediates were classified as “Transient”. Directionality (Upregulated or Downregulated) was assigned according to whether expression or accessibility increased or decreased during sex change.</w:t>
+        <w:t>as “Transient”. Directionality (Upregulated or Downregulated) was assigned according to whether expression or accessibility increased or decreased during sex change.</w:t>
       </w:r>
     </w:p>
     <w:p>
@@ -25573,7 +25456,6 @@
           <w:lang w:eastAsia="ja-JP"/>
           <w14:ligatures w14:val="none"/>
         </w:rPr>
-        <w:lastRenderedPageBreak/>
         <w:t>Differentially Accessible Region (DAR) Analysis</w:t>
       </w:r>
     </w:p>
@@ -25599,6 +25481,7 @@
           <w:lang w:eastAsia="ja-JP"/>
           <w14:ligatures w14:val="none"/>
         </w:rPr>
+        <w:lastRenderedPageBreak/>
         <w:t xml:space="preserve">Differentially accessible regions (DARs) were identified independently within each cluster using a pseudobulk approach implemented in edgeR. ATAC fragment counts were summed across nuclei from each individual to generate one pseudobulk accessibility profile per individual. Peaks detected in fewer than 10 individuals or with fewer than 80 total counts were excluded from analysis. Library sizes were normalized using the trimmed mean of M-values (TMM) method, dispersions were estimated with estimateDisp(), and quasi-likelihood generalized linear models were fit using glmQLFit(). Pairwise contrasts (M vs. F, M vs. </w:t>
       </w:r>
       <w:r>
@@ -26060,19 +25943,7 @@
           <w:lang w:eastAsia="ja-JP"/>
           <w14:ligatures w14:val="none"/>
         </w:rPr>
-        <w:t xml:space="preserve"> to score each cell between 0 (most mature) and 1 (most immature) based on the diversity of its normalized RNA expression </w:t>
-      </w:r>
-      <w:r>
-        <w:rPr>
-          <w:rFonts w:ascii="Arial" w:eastAsia="Malgun Gothic" w:hAnsi="Arial" w:cs="Arial"/>
-          <w:kern w:val="0"/>
-          <w:sz w:val="20"/>
-          <w:szCs w:val="20"/>
-          <w:lang w:eastAsia="ja-JP"/>
-          <w14:ligatures w14:val="none"/>
-        </w:rPr>
-        <w:lastRenderedPageBreak/>
-        <w:t xml:space="preserve">matrix. To assess differences in cellular maturity in </w:t>
+        <w:t xml:space="preserve"> to score each cell between 0 (most mature) and 1 (most immature) based on the diversity of its normalized RNA expression matrix. To assess differences in cellular maturity in </w:t>
       </w:r>
       <w:r>
         <w:rPr>
@@ -26095,7 +25966,19 @@
           <w:lang w:eastAsia="ja-JP"/>
           <w14:ligatures w14:val="none"/>
         </w:rPr>
-        <w:t xml:space="preserve">, we calculated the mean CytoTRACE score for each individual within each subcluster and used a fixed-effects linear model to fit CytoTRACE score by subcluster. Similarly, for </w:t>
+        <w:t xml:space="preserve">, we calculated the mean CytoTRACE score for each individual within each subcluster and used a fixed-effects linear model to fit CytoTRACE </w:t>
+      </w:r>
+      <w:r>
+        <w:rPr>
+          <w:rFonts w:ascii="Arial" w:eastAsia="Malgun Gothic" w:hAnsi="Arial" w:cs="Arial"/>
+          <w:kern w:val="0"/>
+          <w:sz w:val="20"/>
+          <w:szCs w:val="20"/>
+          <w:lang w:eastAsia="ja-JP"/>
+          <w14:ligatures w14:val="none"/>
+        </w:rPr>
+        <w:lastRenderedPageBreak/>
+        <w:t xml:space="preserve">score by subcluster. Similarly, for </w:t>
       </w:r>
       <w:r>
         <w:rPr>
@@ -26849,34 +26732,34 @@
           <w:szCs w:val="20"/>
           <w:u w:val="single"/>
         </w:rPr>
+        <w:t>Regulatory network construction</w:t>
+      </w:r>
+    </w:p>
+    <w:p>
+      <w:pPr>
+        <w:rPr>
+          <w:rFonts w:ascii="Arial" w:hAnsi="Arial" w:cs="Arial"/>
+          <w:sz w:val="20"/>
+          <w:szCs w:val="20"/>
+          <w:u w:val="single"/>
+        </w:rPr>
+      </w:pPr>
+    </w:p>
+    <w:p>
+      <w:pPr>
+        <w:rPr>
+          <w:rFonts w:ascii="Arial" w:hAnsi="Arial" w:cs="Arial"/>
+          <w:sz w:val="20"/>
+          <w:szCs w:val="20"/>
+        </w:rPr>
+      </w:pPr>
+      <w:r>
+        <w:rPr>
+          <w:rFonts w:ascii="Arial" w:hAnsi="Arial" w:cs="Arial"/>
+          <w:sz w:val="20"/>
+          <w:szCs w:val="20"/>
+        </w:rPr>
         <w:lastRenderedPageBreak/>
-        <w:t>Regulatory network construction</w:t>
-      </w:r>
-    </w:p>
-    <w:p>
-      <w:pPr>
-        <w:rPr>
-          <w:rFonts w:ascii="Arial" w:hAnsi="Arial" w:cs="Arial"/>
-          <w:sz w:val="20"/>
-          <w:szCs w:val="20"/>
-          <w:u w:val="single"/>
-        </w:rPr>
-      </w:pPr>
-    </w:p>
-    <w:p>
-      <w:pPr>
-        <w:rPr>
-          <w:rFonts w:ascii="Arial" w:hAnsi="Arial" w:cs="Arial"/>
-          <w:sz w:val="20"/>
-          <w:szCs w:val="20"/>
-        </w:rPr>
-      </w:pPr>
-      <w:r>
-        <w:rPr>
-          <w:rFonts w:ascii="Arial" w:hAnsi="Arial" w:cs="Arial"/>
-          <w:sz w:val="20"/>
-          <w:szCs w:val="20"/>
-        </w:rPr>
         <w:tab/>
         <w:t>Candidate transcription factor (TF)–target relationships were identified from TF motifs within ATAC peaks associated with target genes. Motifs were mapped to TFs represented in the RNA dataset, and TF expression was pseudobulked by individual within each cell cluster and normalized to log2 counts per million (logCPM). TFs were required to be expressed in ≥50% of individuals. Candidate TF–target relationships were retained when TF and target expression were correlated across individuals (|Pearson’s r| ≥ 0.40, P ≤ 0.10), with positive and negative correlations considered candidate activating and repressive relationships, respectively. TFs were not required to themselves be differentially expressed.</w:t>
       </w:r>
@@ -31019,7 +30902,7 @@
       </w:r>
     </w:p>
   </w:comment>
-  <w:comment w:id="4" w:author="Graham, Gabriel J." w:date="2026-10-07T21:36:00Z" w:initials="GGJ">
+  <w:comment w:id="4" w:author="Graham, Gabriel J." w:date="2026-10-07T21:50:00Z" w:initials="GGJ">
     <w:p>
       <w:r>
         <w:rPr>
@@ -31032,11 +30915,11 @@
           <w:sz w:val="20"/>
           <w:szCs w:val="20"/>
         </w:rPr>
-        <w:t>This should be data from the negative binomial</w:t>
+        <w:t>Do we need both hedges g and F value?</w:t>
       </w:r>
     </w:p>
   </w:comment>
-  <w:comment w:id="5" w:author="Graham, Gabriel J." w:date="2026-10-07T21:50:00Z" w:initials="GGJ">
+  <w:comment w:id="5" w:author="Graham, Gabriel J." w:date="2026-10-09T15:54:00Z" w:initials="GGJ">
     <w:p>
       <w:r>
         <w:rPr>
@@ -31049,11 +30932,28 @@
           <w:sz w:val="20"/>
           <w:szCs w:val="20"/>
         </w:rPr>
-        <w:t>Do we need both hedges g and F value?</w:t>
+        <w:t>Which file are these data from? I can put in supplemental</w:t>
       </w:r>
     </w:p>
   </w:comment>
-  <w:comment w:id="6" w:author="Rhodes, Justin S" w:date="2026-10-01T15:21:00Z" w:initials="JR">
+  <w:comment w:id="6" w:author="Graham, Gabriel J." w:date="2026-10-09T15:55:00Z" w:initials="GGJ">
+    <w:p>
+      <w:r>
+        <w:rPr>
+          <w:rStyle w:val="CommentReference"/>
+        </w:rPr>
+        <w:annotationRef/>
+      </w:r>
+      <w:r>
+        <w:rPr>
+          <w:sz w:val="20"/>
+          <w:szCs w:val="20"/>
+        </w:rPr>
+        <w:t>same question as above</w:t>
+      </w:r>
+    </w:p>
+  </w:comment>
+  <w:comment w:id="7" w:author="Rhodes, Justin S" w:date="2026-10-01T15:21:00Z" w:initials="JR">
     <w:p>
       <w:pPr>
         <w:pStyle w:val="CommentText"/>
@@ -31069,7 +30969,7 @@
       </w:r>
     </w:p>
   </w:comment>
-  <w:comment w:id="8" w:author="Rhodes, Justin S" w:date="2026-10-01T15:18:00Z" w:initials="JR">
+  <w:comment w:id="9" w:author="Rhodes, Justin S" w:date="2026-10-01T15:18:00Z" w:initials="JR">
     <w:p>
       <w:pPr>
         <w:pStyle w:val="CommentText"/>
@@ -31085,7 +30985,7 @@
       </w:r>
     </w:p>
   </w:comment>
-  <w:comment w:id="7" w:author="Rhodes, Justin S" w:date="2026-10-01T15:32:00Z" w:initials="JR">
+  <w:comment w:id="8" w:author="Rhodes, Justin S" w:date="2026-10-01T15:32:00Z" w:initials="JR">
     <w:p>
       <w:pPr>
         <w:pStyle w:val="CommentText"/>
@@ -31101,7 +31001,7 @@
       </w:r>
     </w:p>
   </w:comment>
-  <w:comment w:id="9" w:author="Rhodes, Justin S" w:date="2026-10-02T10:19:00Z" w:initials="JR">
+  <w:comment w:id="10" w:author="Rhodes, Justin S" w:date="2026-10-02T10:19:00Z" w:initials="JR">
     <w:p>
       <w:pPr>
         <w:pStyle w:val="CommentText"/>
@@ -31117,7 +31017,7 @@
       </w:r>
     </w:p>
   </w:comment>
-  <w:comment w:id="10" w:author="Graham, Gabriel J." w:date="2026-10-05T14:10:00Z" w:initials="GGJ">
+  <w:comment w:id="11" w:author="Graham, Gabriel J." w:date="2026-10-05T14:10:00Z" w:initials="GGJ">
     <w:p>
       <w:r>
         <w:rPr>
@@ -31134,7 +31034,7 @@
       </w:r>
     </w:p>
   </w:comment>
-  <w:comment w:id="11" w:author="Rhodes, Justin S" w:date="2026-10-02T10:20:00Z" w:initials="JR">
+  <w:comment w:id="12" w:author="Rhodes, Justin S" w:date="2026-10-02T10:20:00Z" w:initials="JR">
     <w:p>
       <w:pPr>
         <w:pStyle w:val="CommentText"/>
@@ -31150,7 +31050,7 @@
       </w:r>
     </w:p>
   </w:comment>
-  <w:comment w:id="12" w:author="Graham, Gabriel J." w:date="2026-10-05T14:10:00Z" w:initials="GGJ">
+  <w:comment w:id="13" w:author="Graham, Gabriel J." w:date="2026-10-05T14:10:00Z" w:initials="GGJ">
     <w:p>
       <w:r>
         <w:rPr>
@@ -31167,7 +31067,7 @@
       </w:r>
     </w:p>
   </w:comment>
-  <w:comment w:id="13" w:author="Graham, Gabriel J." w:date="2026-10-06T19:21:00Z" w:initials="GGJ">
+  <w:comment w:id="14" w:author="Graham, Gabriel J." w:date="2026-10-09T15:56:00Z" w:initials="GGJ">
     <w:p>
       <w:r>
         <w:rPr>
@@ -31180,11 +31080,11 @@
           <w:sz w:val="20"/>
           <w:szCs w:val="20"/>
         </w:rPr>
-        <w:t>gabe check subsetting</w:t>
+        <w:t>Need this table, do you really think this is necessary though?</w:t>
       </w:r>
     </w:p>
   </w:comment>
-  <w:comment w:id="14" w:author="Graham, Gabriel J." w:date="2026-10-08T19:00:00Z" w:initials="GGJ">
+  <w:comment w:id="15" w:author="Graham, Gabriel J." w:date="2026-10-08T19:00:00Z" w:initials="GGJ">
     <w:p>
       <w:r>
         <w:rPr>
@@ -31201,7 +31101,7 @@
       </w:r>
     </w:p>
   </w:comment>
-  <w:comment w:id="15" w:author="Graham, Gabriel J." w:date="2026-08-10T13:14:00Z" w:initials="GGJ">
+  <w:comment w:id="16" w:author="Graham, Gabriel J." w:date="2026-08-10T13:14:00Z" w:initials="GGJ">
     <w:p>
       <w:r>
         <w:rPr>
@@ -31227,8 +31127,9 @@
   <w15:commentEx w15:paraId="160B58DC" w15:done="0"/>
   <w15:commentEx w15:paraId="3C4ECC42" w15:done="0"/>
   <w15:commentEx w15:paraId="49E1EED1" w15:done="0"/>
-  <w15:commentEx w15:paraId="7E7BB4EB" w15:done="0"/>
   <w15:commentEx w15:paraId="547D4B9C" w15:done="0"/>
+  <w15:commentEx w15:paraId="30A58DDD" w15:done="0"/>
+  <w15:commentEx w15:paraId="509769D1" w15:done="0"/>
   <w15:commentEx w15:paraId="7842C088" w15:done="0"/>
   <w15:commentEx w15:paraId="317650FE" w15:done="0"/>
   <w15:commentEx w15:paraId="2BA00BFB" w15:done="0"/>
@@ -31236,7 +31137,7 @@
   <w15:commentEx w15:paraId="49761346" w15:paraIdParent="3231B06A" w15:done="0"/>
   <w15:commentEx w15:paraId="12FED78F" w15:done="0"/>
   <w15:commentEx w15:paraId="361006A4" w15:paraIdParent="12FED78F" w15:done="0"/>
-  <w15:commentEx w15:paraId="6611DA96" w15:done="0"/>
+  <w15:commentEx w15:paraId="49D8820A" w15:done="0"/>
   <w15:commentEx w15:paraId="05D2AABA" w15:done="0"/>
   <w15:commentEx w15:paraId="4211409F" w15:done="0"/>
 </w15:commentsEx>
@@ -31248,8 +31149,9 @@
   <w16cex:commentExtensible w16cex:durableId="0FAB0F5A" w16cex:dateUtc="2026-10-08T23:18:00Z"/>
   <w16cex:commentExtensible w16cex:durableId="433C772E" w16cex:dateUtc="2026-08-24T16:14:00Z"/>
   <w16cex:commentExtensible w16cex:durableId="75DB0B03" w16cex:dateUtc="2026-10-01T00:00:00Z"/>
-  <w16cex:commentExtensible w16cex:durableId="6AF72370" w16cex:dateUtc="2026-10-08T01:36:00Z"/>
   <w16cex:commentExtensible w16cex:durableId="7D1E6C1C" w16cex:dateUtc="2026-10-08T01:50:00Z"/>
+  <w16cex:commentExtensible w16cex:durableId="4854A006" w16cex:dateUtc="2026-10-09T19:54:00Z"/>
+  <w16cex:commentExtensible w16cex:durableId="0B506FD9" w16cex:dateUtc="2026-10-09T19:55:00Z"/>
   <w16cex:commentExtensible w16cex:durableId="465231E1" w16cex:dateUtc="2026-10-01T20:21:00Z"/>
   <w16cex:commentExtensible w16cex:durableId="788BB19D" w16cex:dateUtc="2026-10-01T20:18:00Z"/>
   <w16cex:commentExtensible w16cex:durableId="6B4B8AEA" w16cex:dateUtc="2026-10-01T20:32:00Z"/>
@@ -31257,7 +31159,7 @@
   <w16cex:commentExtensible w16cex:durableId="7FB6B3D1" w16cex:dateUtc="2026-10-05T18:10:00Z"/>
   <w16cex:commentExtensible w16cex:durableId="4FB49A17" w16cex:dateUtc="2026-10-02T15:20:00Z"/>
   <w16cex:commentExtensible w16cex:durableId="0AF10FE5" w16cex:dateUtc="2026-10-05T18:10:00Z"/>
-  <w16cex:commentExtensible w16cex:durableId="221AEF3E" w16cex:dateUtc="2026-10-06T23:21:00Z"/>
+  <w16cex:commentExtensible w16cex:durableId="62899C02" w16cex:dateUtc="2026-10-09T19:56:00Z"/>
   <w16cex:commentExtensible w16cex:durableId="71A7CE24" w16cex:dateUtc="2026-10-08T23:00:00Z"/>
   <w16cex:commentExtensible w16cex:durableId="41C7445F" w16cex:dateUtc="2026-08-10T17:14:00Z"/>
 </w16cex:commentsExtensible>
@@ -31269,8 +31171,9 @@
   <w16cid:commentId w16cid:paraId="160B58DC" w16cid:durableId="0FAB0F5A"/>
   <w16cid:commentId w16cid:paraId="3C4ECC42" w16cid:durableId="433C772E"/>
   <w16cid:commentId w16cid:paraId="49E1EED1" w16cid:durableId="75DB0B03"/>
-  <w16cid:commentId w16cid:paraId="7E7BB4EB" w16cid:durableId="6AF72370"/>
   <w16cid:commentId w16cid:paraId="547D4B9C" w16cid:durableId="7D1E6C1C"/>
+  <w16cid:commentId w16cid:paraId="30A58DDD" w16cid:durableId="4854A006"/>
+  <w16cid:commentId w16cid:paraId="509769D1" w16cid:durableId="0B506FD9"/>
   <w16cid:commentId w16cid:paraId="7842C088" w16cid:durableId="465231E1"/>
   <w16cid:commentId w16cid:paraId="317650FE" w16cid:durableId="788BB19D"/>
   <w16cid:commentId w16cid:paraId="2BA00BFB" w16cid:durableId="6B4B8AEA"/>
@@ -31278,7 +31181,7 @@
   <w16cid:commentId w16cid:paraId="49761346" w16cid:durableId="7FB6B3D1"/>
   <w16cid:commentId w16cid:paraId="12FED78F" w16cid:durableId="4FB49A17"/>
   <w16cid:commentId w16cid:paraId="361006A4" w16cid:durableId="0AF10FE5"/>
-  <w16cid:commentId w16cid:paraId="6611DA96" w16cid:durableId="221AEF3E"/>
+  <w16cid:commentId w16cid:paraId="49D8820A" w16cid:durableId="62899C02"/>
   <w16cid:commentId w16cid:paraId="05D2AABA" w16cid:durableId="71A7CE24"/>
   <w16cid:commentId w16cid:paraId="4211409F" w16cid:durableId="41C7445F"/>
 </w16cid:commentsIds>

</xml_diff>

<commit_message>
Finishing the draft with claude
</commit_message>
<xml_diff>
--- a/Manuscript/Manuscript v.2/Manuscript Draft v.2.4.docx
+++ b/Manuscript/Manuscript v.2/Manuscript Draft v.2.4.docx
@@ -1765,34 +1765,7 @@
           <w:sz w:val="20"/>
           <w:szCs w:val="20"/>
         </w:rPr>
-        <w:t xml:space="preserve">is shown in </w:t>
-      </w:r>
-      <w:commentRangeStart w:id="0"/>
-      <w:r>
-        <w:rPr>
-          <w:rFonts w:ascii="Arial" w:hAnsi="Arial" w:cs="Arial"/>
-          <w:sz w:val="20"/>
-          <w:szCs w:val="20"/>
-        </w:rPr>
-        <w:t>Fig. 1A</w:t>
-      </w:r>
-      <w:commentRangeEnd w:id="0"/>
-      <w:r>
-        <w:rPr>
-          <w:rStyle w:val="CommentReference"/>
-          <w:rFonts w:ascii="Arial" w:hAnsi="Arial" w:cs="Arial"/>
-          <w:sz w:val="20"/>
-          <w:szCs w:val="20"/>
-        </w:rPr>
-        <w:commentReference w:id="0"/>
-      </w:r>
-      <w:r>
-        <w:rPr>
-          <w:rFonts w:ascii="Arial" w:hAnsi="Arial" w:cs="Arial"/>
-          <w:sz w:val="20"/>
-          <w:szCs w:val="20"/>
-        </w:rPr>
-        <w:t>. Trajectories summarize patterns observed across our previous studies and are intended to illustrate approximate changes among stages rather than precise temporal dynamics or the relative timing of individual processes.</w:t>
+        <w:t>is shown in Fig. 1A. Trajectories summarize patterns observed across our previous studies and are intended to illustrate approximate changes among stages rather than precise temporal dynamics or the relative timing of individual processes.</w:t>
       </w:r>
       <w:r>
         <w:rPr>
@@ -3917,7 +3890,7 @@
         </w:rPr>
         <w:t xml:space="preserve">, both approximately </w:t>
       </w:r>
-      <w:commentRangeStart w:id="1"/>
+      <w:commentRangeStart w:id="0"/>
       <w:r>
         <w:rPr>
           <w:rFonts w:ascii="Arial" w:hAnsi="Arial" w:cs="Arial"/>
@@ -3942,7 +3915,7 @@
         </w:rPr>
         <w:t xml:space="preserve">-fold </w:t>
       </w:r>
-      <w:commentRangeEnd w:id="1"/>
+      <w:commentRangeEnd w:id="0"/>
       <w:r>
         <w:rPr>
           <w:rStyle w:val="CommentReference"/>
@@ -3950,7 +3923,7 @@
           <w:sz w:val="20"/>
           <w:szCs w:val="20"/>
         </w:rPr>
-        <w:commentReference w:id="1"/>
+        <w:commentReference w:id="0"/>
       </w:r>
       <w:r>
         <w:rPr>
@@ -4672,7 +4645,7 @@
         </w:rPr>
         <w:t xml:space="preserve">Fig. </w:t>
       </w:r>
-      <w:commentRangeStart w:id="2"/>
+      <w:commentRangeStart w:id="1"/>
       <w:r>
         <w:rPr>
           <w:rFonts w:ascii="Arial" w:hAnsi="Arial" w:cs="Arial"/>
@@ -4682,7 +4655,7 @@
         </w:rPr>
         <w:t>S2</w:t>
       </w:r>
-      <w:commentRangeEnd w:id="2"/>
+      <w:commentRangeEnd w:id="1"/>
       <w:r>
         <w:rPr>
           <w:rStyle w:val="CommentReference"/>
@@ -4690,7 +4663,7 @@
           <w:sz w:val="20"/>
           <w:szCs w:val="20"/>
         </w:rPr>
-        <w:commentReference w:id="2"/>
+        <w:commentReference w:id="1"/>
       </w:r>
       <w:r>
         <w:rPr>
@@ -11310,34 +11283,23 @@
           <w:sz w:val="20"/>
           <w:szCs w:val="20"/>
         </w:rPr>
-        <w:t>, Appendix S1). As further evidence for the hypothesis</w:t>
-      </w:r>
-      <w:commentRangeStart w:id="3"/>
-      <w:r>
-        <w:rPr>
-          <w:rFonts w:ascii="Arial" w:hAnsi="Arial" w:cs="Arial"/>
-          <w:sz w:val="20"/>
-          <w:szCs w:val="20"/>
-        </w:rPr>
-        <w:t xml:space="preserve"> that new cells are added during the intermediate state,</w:t>
-      </w:r>
-      <w:commentRangeEnd w:id="3"/>
-      <w:r>
-        <w:rPr>
-          <w:rStyle w:val="CommentReference"/>
-          <w:rFonts w:ascii="Arial" w:hAnsi="Arial" w:cs="Arial"/>
-          <w:sz w:val="20"/>
-          <w:szCs w:val="20"/>
-        </w:rPr>
-        <w:commentReference w:id="3"/>
-      </w:r>
-      <w:r>
-        <w:rPr>
-          <w:rFonts w:ascii="Arial" w:hAnsi="Arial" w:cs="Arial"/>
-          <w:sz w:val="20"/>
-          <w:szCs w:val="20"/>
-        </w:rPr>
-        <w:t xml:space="preserve"> intermediates showed </w:t>
+        <w:t>, Appendix S1). As further evidence for the hypothesis that new cells are added during the intermediate</w:t>
+      </w:r>
+      <w:r>
+        <w:rPr>
+          <w:rFonts w:ascii="Arial" w:hAnsi="Arial" w:cs="Arial"/>
+          <w:sz w:val="20"/>
+          <w:szCs w:val="20"/>
+        </w:rPr>
+        <w:t>-female transition</w:t>
+      </w:r>
+      <w:r>
+        <w:rPr>
+          <w:rFonts w:ascii="Arial" w:hAnsi="Arial" w:cs="Arial"/>
+          <w:sz w:val="20"/>
+          <w:szCs w:val="20"/>
+        </w:rPr>
+        <w:t xml:space="preserve">, intermediates showed </w:t>
       </w:r>
       <w:r>
         <w:rPr>
@@ -16592,7 +16554,7 @@
         </w:rPr>
         <w:t>Given the identification of sex steroid receptors as candidate regulators of transcriptional changes in 6_POA_Mixed, we next asked how steroid receptor-associated transcription changed across sex change. We examined expression of genes associated with ESR2B, AR, or PGR binding motifs and separately tested whether chromatin accessibility at regions containing these motifs changed across sex change (Methods). ESR2B-associated gene expression increased gradually across sex change and differed significantly between males and females, with intermediates exhibiting intermediate values (</w:t>
       </w:r>
-      <w:commentRangeStart w:id="4"/>
+      <w:commentRangeStart w:id="2"/>
       <w:r>
         <w:rPr>
           <w:rFonts w:ascii="Arial" w:hAnsi="Arial" w:cs="Arial"/>
@@ -16601,7 +16563,7 @@
         </w:rPr>
         <w:t xml:space="preserve">Hedges’ g = 1.52; F(2,16) </w:t>
       </w:r>
-      <w:commentRangeEnd w:id="4"/>
+      <w:commentRangeEnd w:id="2"/>
       <w:r>
         <w:rPr>
           <w:rStyle w:val="CommentReference"/>
@@ -16609,7 +16571,7 @@
           <w:sz w:val="20"/>
           <w:szCs w:val="20"/>
         </w:rPr>
-        <w:commentReference w:id="4"/>
+        <w:commentReference w:id="2"/>
       </w:r>
       <w:r>
         <w:rPr>
@@ -16654,7 +16616,7 @@
         </w:rPr>
         <w:t xml:space="preserve">). </w:t>
       </w:r>
-      <w:commentRangeStart w:id="5"/>
+      <w:commentRangeStart w:id="3"/>
       <w:r>
         <w:rPr>
           <w:rFonts w:ascii="Arial" w:hAnsi="Arial" w:cs="Arial"/>
@@ -16699,7 +16661,7 @@
         </w:rPr>
         <w:t>XX</w:t>
       </w:r>
-      <w:commentRangeEnd w:id="5"/>
+      <w:commentRangeEnd w:id="3"/>
       <w:r>
         <w:rPr>
           <w:rStyle w:val="CommentReference"/>
@@ -16707,7 +16669,7 @@
           <w:sz w:val="20"/>
           <w:szCs w:val="20"/>
         </w:rPr>
-        <w:commentReference w:id="5"/>
+        <w:commentReference w:id="3"/>
       </w:r>
       <w:r>
         <w:rPr>
@@ -16905,7 +16867,7 @@
         </w:rPr>
         <w:t xml:space="preserve">). </w:t>
       </w:r>
-      <w:commentRangeStart w:id="6"/>
+      <w:commentRangeStart w:id="4"/>
       <w:r>
         <w:rPr>
           <w:rFonts w:ascii="Arial" w:hAnsi="Arial" w:cs="Arial"/>
@@ -16956,7 +16918,7 @@
         </w:rPr>
         <w:t xml:space="preserve">. </w:t>
       </w:r>
-      <w:commentRangeEnd w:id="6"/>
+      <w:commentRangeEnd w:id="4"/>
       <w:r>
         <w:rPr>
           <w:rStyle w:val="CommentReference"/>
@@ -16964,7 +16926,7 @@
           <w:sz w:val="20"/>
           <w:szCs w:val="20"/>
         </w:rPr>
-        <w:commentReference w:id="6"/>
+        <w:commentReference w:id="4"/>
       </w:r>
       <w:r>
         <w:rPr>
@@ -17391,7 +17353,8 @@
         </w:rPr>
         <w:t xml:space="preserve"> </w:t>
       </w:r>
-      <w:commentRangeStart w:id="7"/>
+      <w:commentRangeStart w:id="5"/>
+      <w:commentRangeStart w:id="6"/>
       <w:r>
         <w:rPr>
           <w:rFonts w:ascii="Arial" w:hAnsi="Arial" w:cs="Arial"/>
@@ -17472,7 +17435,7 @@
         </w:rPr>
         <w:t xml:space="preserve"> </w:t>
       </w:r>
-      <w:commentRangeEnd w:id="7"/>
+      <w:commentRangeEnd w:id="5"/>
       <w:r>
         <w:rPr>
           <w:rStyle w:val="CommentReference"/>
@@ -17480,9 +17443,19 @@
           <w:sz w:val="20"/>
           <w:szCs w:val="20"/>
         </w:rPr>
-        <w:commentReference w:id="7"/>
-      </w:r>
-      <w:commentRangeStart w:id="8"/>
+        <w:commentReference w:id="5"/>
+      </w:r>
+      <w:commentRangeEnd w:id="6"/>
+      <w:r>
+        <w:rPr>
+          <w:rStyle w:val="CommentReference"/>
+          <w:rFonts w:ascii="Arial" w:hAnsi="Arial" w:cs="Arial"/>
+          <w:sz w:val="20"/>
+          <w:szCs w:val="20"/>
+        </w:rPr>
+        <w:commentReference w:id="6"/>
+      </w:r>
+      <w:commentRangeStart w:id="7"/>
       <w:r>
         <w:rPr>
           <w:rFonts w:ascii="Arial" w:hAnsi="Arial" w:cs="Arial"/>
@@ -17557,7 +17530,7 @@
         </w:rPr>
         <w:t>.</w:t>
       </w:r>
-      <w:commentRangeStart w:id="9"/>
+      <w:commentRangeStart w:id="8"/>
       <w:r>
         <w:rPr>
           <w:rFonts w:ascii="Arial" w:hAnsi="Arial" w:cs="Arial"/>
@@ -17622,7 +17595,7 @@
         </w:rPr>
         <w:t>that occur during final feminization rather than the product of local E2 production</w:t>
       </w:r>
-      <w:commentRangeEnd w:id="9"/>
+      <w:commentRangeEnd w:id="8"/>
       <w:r>
         <w:rPr>
           <w:rStyle w:val="CommentReference"/>
@@ -17630,7 +17603,7 @@
           <w:sz w:val="20"/>
           <w:szCs w:val="20"/>
         </w:rPr>
-        <w:commentReference w:id="9"/>
+        <w:commentReference w:id="8"/>
       </w:r>
       <w:r>
         <w:rPr>
@@ -17640,7 +17613,7 @@
         </w:rPr>
         <w:t>. Thus, the transient reduction in brain aromatase appears to be u</w:t>
       </w:r>
-      <w:commentRangeEnd w:id="8"/>
+      <w:commentRangeEnd w:id="7"/>
       <w:r>
         <w:rPr>
           <w:rStyle w:val="CommentReference"/>
@@ -17648,7 +17621,7 @@
           <w:sz w:val="20"/>
           <w:szCs w:val="20"/>
         </w:rPr>
-        <w:commentReference w:id="8"/>
+        <w:commentReference w:id="7"/>
       </w:r>
       <w:r>
         <w:rPr>
@@ -21913,8 +21886,72 @@
         </w:rPr>
         <w:t>Quality control was initially performed separately for each pool to identify high-quality nuclei and remove low-quality barcodes. Variable feature analysis was used to identify nuclei with low gene expression variability. On</w:t>
       </w:r>
+      <w:commentRangeStart w:id="9"/>
       <w:commentRangeStart w:id="10"/>
+      <w:r>
+        <w:rPr>
+          <w:rFonts w:ascii="Arial" w:hAnsi="Arial" w:cs="Arial"/>
+          <w:color w:val="000000" w:themeColor="text1"/>
+          <w:sz w:val="20"/>
+          <w:szCs w:val="20"/>
+        </w:rPr>
+        <w:t>ly barcodes containing at least 55% of highly variable genes were retained. In</w:t>
+      </w:r>
+      <w:commentRangeEnd w:id="9"/>
+      <w:r>
+        <w:rPr>
+          <w:rStyle w:val="CommentReference"/>
+          <w:rFonts w:ascii="Arial" w:hAnsi="Arial" w:cs="Arial"/>
+          <w:color w:val="000000" w:themeColor="text1"/>
+          <w:sz w:val="20"/>
+          <w:szCs w:val="20"/>
+        </w:rPr>
+        <w:commentReference w:id="9"/>
+      </w:r>
+      <w:commentRangeEnd w:id="10"/>
+      <w:r>
+        <w:rPr>
+          <w:rStyle w:val="CommentReference"/>
+          <w:rFonts w:ascii="Arial" w:hAnsi="Arial" w:cs="Arial"/>
+          <w:color w:val="000000" w:themeColor="text1"/>
+          <w:sz w:val="20"/>
+          <w:szCs w:val="20"/>
+        </w:rPr>
+        <w:commentReference w:id="10"/>
+      </w:r>
+      <w:r>
+        <w:rPr>
+          <w:rFonts w:ascii="Arial" w:hAnsi="Arial" w:cs="Arial"/>
+          <w:color w:val="000000" w:themeColor="text1"/>
+          <w:sz w:val="20"/>
+          <w:szCs w:val="20"/>
+        </w:rPr>
+        <w:t xml:space="preserve"> addition, barcodes in which the top 50 or top 100 most highly expressed genes accounted for more than 50% or 60% of total gene expression, respectively, were removed.</w:t>
+      </w:r>
+    </w:p>
+    <w:p>
+      <w:pPr>
+        <w:pStyle w:val="Default"/>
+        <w:rPr>
+          <w:rFonts w:ascii="Arial" w:hAnsi="Arial" w:cs="Arial"/>
+          <w:color w:val="000000" w:themeColor="text1"/>
+          <w:sz w:val="20"/>
+          <w:szCs w:val="20"/>
+        </w:rPr>
+      </w:pPr>
+    </w:p>
+    <w:p>
+      <w:pPr>
+        <w:pStyle w:val="Default"/>
+        <w:rPr>
+          <w:rFonts w:ascii="Arial" w:hAnsi="Arial" w:cs="Arial"/>
+          <w:color w:val="000000" w:themeColor="text1"/>
+          <w:sz w:val="20"/>
+          <w:szCs w:val="20"/>
+        </w:rPr>
+      </w:pPr>
       <w:commentRangeStart w:id="11"/>
+      <w:commentRangeStart w:id="12"/>
       <w:r>
         <w:rPr>
           <w:rFonts w:ascii="Arial" w:hAnsi="Arial" w:cs="Arial"/>
@@ -21922,9 +21959,9 @@
           <w:sz w:val="20"/>
           <w:szCs w:val="20"/>
         </w:rPr>
-        <w:t>ly barcodes containing at least 55% of highly variable genes were retained. In</w:t>
-      </w:r>
-      <w:commentRangeEnd w:id="10"/>
+        <w:t>Following pool-level quality control, samples were merged and additional filtering was performed on the combined dataset. Nuclei were retained if they met the following criteria: 200 &lt; nCount_RNA &lt; 25,000; 200 &lt; nFeature_RNA &lt; 9,000; nCount_ATAC &lt; 25,000; nFeature_ATAC &lt; 16,000; mitochondrial reads &lt; 12%; protein-coding reads &gt; 85%; ribosomal reads &lt; 3%; TSS enrichment &gt; 0.8; and nucleosome signal &lt; 2.</w:t>
+      </w:r>
+      <w:commentRangeEnd w:id="11"/>
       <w:r>
         <w:rPr>
           <w:rStyle w:val="CommentReference"/>
@@ -21933,9 +21970,9 @@
           <w:sz w:val="20"/>
           <w:szCs w:val="20"/>
         </w:rPr>
-        <w:commentReference w:id="10"/>
-      </w:r>
-      <w:commentRangeEnd w:id="11"/>
+        <w:commentReference w:id="11"/>
+      </w:r>
+      <w:commentRangeEnd w:id="12"/>
       <w:r>
         <w:rPr>
           <w:rStyle w:val="CommentReference"/>
@@ -21944,71 +21981,7 @@
           <w:sz w:val="20"/>
           <w:szCs w:val="20"/>
         </w:rPr>
-        <w:commentReference w:id="11"/>
-      </w:r>
-      <w:r>
-        <w:rPr>
-          <w:rFonts w:ascii="Arial" w:hAnsi="Arial" w:cs="Arial"/>
-          <w:color w:val="000000" w:themeColor="text1"/>
-          <w:sz w:val="20"/>
-          <w:szCs w:val="20"/>
-        </w:rPr>
-        <w:t xml:space="preserve"> addition, barcodes in which the top 50 or top 100 most highly expressed genes accounted for more than 50% or 60% of total gene expression, respectively, were removed.</w:t>
-      </w:r>
-    </w:p>
-    <w:p>
-      <w:pPr>
-        <w:pStyle w:val="Default"/>
-        <w:rPr>
-          <w:rFonts w:ascii="Arial" w:hAnsi="Arial" w:cs="Arial"/>
-          <w:color w:val="000000" w:themeColor="text1"/>
-          <w:sz w:val="20"/>
-          <w:szCs w:val="20"/>
-        </w:rPr>
-      </w:pPr>
-    </w:p>
-    <w:p>
-      <w:pPr>
-        <w:pStyle w:val="Default"/>
-        <w:rPr>
-          <w:rFonts w:ascii="Arial" w:hAnsi="Arial" w:cs="Arial"/>
-          <w:color w:val="000000" w:themeColor="text1"/>
-          <w:sz w:val="20"/>
-          <w:szCs w:val="20"/>
-        </w:rPr>
-      </w:pPr>
-      <w:commentRangeStart w:id="12"/>
-      <w:commentRangeStart w:id="13"/>
-      <w:r>
-        <w:rPr>
-          <w:rFonts w:ascii="Arial" w:hAnsi="Arial" w:cs="Arial"/>
-          <w:color w:val="000000" w:themeColor="text1"/>
-          <w:sz w:val="20"/>
-          <w:szCs w:val="20"/>
-        </w:rPr>
-        <w:t>Following pool-level quality control, samples were merged and additional filtering was performed on the combined dataset. Nuclei were retained if they met the following criteria: 200 &lt; nCount_RNA &lt; 25,000; 200 &lt; nFeature_RNA &lt; 9,000; nCount_ATAC &lt; 25,000; nFeature_ATAC &lt; 16,000; mitochondrial reads &lt; 12%; protein-coding reads &gt; 85%; ribosomal reads &lt; 3%; TSS enrichment &gt; 0.8; and nucleosome signal &lt; 2.</w:t>
-      </w:r>
-      <w:commentRangeEnd w:id="12"/>
-      <w:r>
-        <w:rPr>
-          <w:rStyle w:val="CommentReference"/>
-          <w:rFonts w:ascii="Arial" w:hAnsi="Arial" w:cs="Arial"/>
-          <w:color w:val="000000" w:themeColor="text1"/>
-          <w:sz w:val="20"/>
-          <w:szCs w:val="20"/>
-        </w:rPr>
         <w:commentReference w:id="12"/>
-      </w:r>
-      <w:commentRangeEnd w:id="13"/>
-      <w:r>
-        <w:rPr>
-          <w:rStyle w:val="CommentReference"/>
-          <w:rFonts w:ascii="Arial" w:hAnsi="Arial" w:cs="Arial"/>
-          <w:color w:val="000000" w:themeColor="text1"/>
-          <w:sz w:val="20"/>
-          <w:szCs w:val="20"/>
-        </w:rPr>
-        <w:commentReference w:id="13"/>
       </w:r>
     </w:p>
     <w:p>
@@ -22344,7 +22317,23 @@
           <w:sz w:val="20"/>
           <w:szCs w:val="20"/>
         </w:rPr>
-        <w:t xml:space="preserve"> 50. </w:t>
+        <w:t xml:space="preserve"> </w:t>
+      </w:r>
+      <w:r>
+        <w:rPr>
+          <w:rFonts w:ascii="Arial" w:hAnsi="Arial" w:cs="Arial"/>
+          <w:sz w:val="20"/>
+          <w:szCs w:val="20"/>
+        </w:rPr>
+        <w:t>0.</w:t>
+      </w:r>
+      <w:r>
+        <w:rPr>
+          <w:rFonts w:ascii="Arial" w:hAnsi="Arial" w:cs="Arial"/>
+          <w:sz w:val="20"/>
+          <w:szCs w:val="20"/>
+        </w:rPr>
+        <w:t xml:space="preserve">5. </w:t>
       </w:r>
     </w:p>
     <w:p>
@@ -22527,14 +22516,330 @@
         </w:rPr>
         <w:t>Six males and six females from six tanks containing established male–female reproductive pairs were sampled (12 fish total</w:t>
       </w:r>
+      <w:commentRangeStart w:id="13"/>
+      <w:r>
+        <w:rPr>
+          <w:rFonts w:ascii="Arial" w:hAnsi="Arial" w:cs="Arial"/>
+          <w:sz w:val="20"/>
+          <w:szCs w:val="20"/>
+        </w:rPr>
+        <w:t xml:space="preserve">; </w:t>
+      </w:r>
+      <w:r>
+        <w:rPr>
+          <w:rFonts w:ascii="Arial" w:hAnsi="Arial" w:cs="Arial"/>
+          <w:sz w:val="20"/>
+          <w:szCs w:val="20"/>
+          <w:highlight w:val="yellow"/>
+        </w:rPr>
+        <w:t xml:space="preserve">see Supplementary Table </w:t>
+      </w:r>
+      <w:r>
+        <w:rPr>
+          <w:rFonts w:ascii="Arial" w:hAnsi="Arial" w:cs="Arial"/>
+          <w:sz w:val="20"/>
+          <w:szCs w:val="20"/>
+          <w:highlight w:val="yellow"/>
+        </w:rPr>
+        <w:t>xx</w:t>
+      </w:r>
+      <w:r>
+        <w:rPr>
+          <w:rFonts w:ascii="Arial" w:hAnsi="Arial" w:cs="Arial"/>
+          <w:sz w:val="20"/>
+          <w:szCs w:val="20"/>
+          <w:highlight w:val="yellow"/>
+        </w:rPr>
+        <w:t xml:space="preserve"> for lengths and weights</w:t>
+      </w:r>
+      <w:commentRangeEnd w:id="13"/>
+      <w:r>
+        <w:rPr>
+          <w:rStyle w:val="CommentReference"/>
+          <w:rFonts w:ascii="Arial" w:hAnsi="Arial" w:cs="Arial"/>
+          <w:sz w:val="20"/>
+          <w:szCs w:val="20"/>
+        </w:rPr>
+        <w:commentReference w:id="13"/>
+      </w:r>
+      <w:r>
+        <w:rPr>
+          <w:rFonts w:ascii="Arial" w:hAnsi="Arial" w:cs="Arial"/>
+          <w:sz w:val="20"/>
+          <w:szCs w:val="20"/>
+        </w:rPr>
+        <w:t>). Fish were decapitated, and brains were rapidly removed and placed in molds containing chilled OCT maintained at wet-ice temperature. Each mold contained four brains representing two reproductive pairs from two tanks (two males and two females). Brains were arranged with the anterior end facing down and the spinal cord facing up, with the two female brains positioned in the top row and the two male brains in the bottom row. This arrangement was designed to maximize the amount of brain tissue that could be accommodated within the capture area of each Visium HD slide.</w:t>
+      </w:r>
+    </w:p>
+    <w:p>
+      <w:pPr>
+        <w:rPr>
+          <w:rFonts w:ascii="Arial" w:hAnsi="Arial" w:cs="Arial"/>
+          <w:sz w:val="20"/>
+          <w:szCs w:val="20"/>
+        </w:rPr>
+      </w:pPr>
+    </w:p>
+    <w:p>
+      <w:pPr>
+        <w:rPr>
+          <w:rFonts w:ascii="Arial" w:hAnsi="Arial" w:cs="Arial"/>
+          <w:sz w:val="20"/>
+          <w:szCs w:val="20"/>
+        </w:rPr>
+      </w:pPr>
+      <w:r>
+        <w:rPr>
+          <w:rFonts w:ascii="Arial" w:hAnsi="Arial" w:cs="Arial"/>
+          <w:sz w:val="20"/>
+          <w:szCs w:val="20"/>
+        </w:rPr>
+        <w:t>Following embedding, molds were frozen at −80°C and transferred directly to a cryostat for fresh-frozen sectioning. Brains were sectioned at 10 μm, and sections were selected for Visium HD based on tissue quality and anatomical coverage, with the goal of maximizing the brain area represented and sampling across the rostrocaudal extent of the dissected regions. Four sections were placed on each Visium HD slide, with each section containing tissue from four fish representing two tanks. Four Visium HD slides were prepared. Two slides contained sections from the same four fish (two reproductive pairs), whereas the remaining two slides contained sections from the other eight fish (four reproductive pairs). Thus, all 12 fish were represented across the four slides, with four fish represented on two slides.</w:t>
+      </w:r>
+    </w:p>
+    <w:p>
+      <w:pPr>
+        <w:rPr>
+          <w:rFonts w:ascii="Arial" w:hAnsi="Arial" w:cs="Arial"/>
+          <w:sz w:val="20"/>
+          <w:szCs w:val="20"/>
+        </w:rPr>
+      </w:pPr>
+    </w:p>
+    <w:p>
+      <w:pPr>
+        <w:rPr>
+          <w:rFonts w:ascii="Arial" w:hAnsi="Arial" w:cs="Arial"/>
+          <w:sz w:val="20"/>
+          <w:szCs w:val="20"/>
+        </w:rPr>
+      </w:pPr>
+      <w:r>
+        <w:rPr>
+          <w:rFonts w:ascii="Arial" w:hAnsi="Arial" w:cs="Arial"/>
+          <w:sz w:val="20"/>
+          <w:szCs w:val="20"/>
+        </w:rPr>
+        <w:t>Sections were briefly thawed to promote adherence to the slide and then immediately returned to frozen conditions on dry ice or at −80°C until Visium HD processing. Although every effort was made to maintain a consistent plane of section, some brains were sectioned at slightly oblique angles.</w:t>
+      </w:r>
+    </w:p>
+    <w:p>
+      <w:pPr>
+        <w:rPr>
+          <w:rFonts w:ascii="Arial" w:hAnsi="Arial" w:cs="Arial"/>
+          <w:sz w:val="20"/>
+          <w:szCs w:val="20"/>
+        </w:rPr>
+      </w:pPr>
+    </w:p>
+    <w:p>
+      <w:pPr>
+        <w:rPr>
+          <w:rFonts w:ascii="Arial" w:hAnsi="Arial" w:cs="Arial"/>
+          <w:sz w:val="20"/>
+          <w:szCs w:val="20"/>
+          <w:u w:val="single"/>
+        </w:rPr>
+      </w:pPr>
       <w:commentRangeStart w:id="14"/>
       <w:r>
         <w:rPr>
           <w:rFonts w:ascii="Arial" w:hAnsi="Arial" w:cs="Arial"/>
           <w:sz w:val="20"/>
           <w:szCs w:val="20"/>
-        </w:rPr>
-        <w:t xml:space="preserve">; </w:t>
+          <w:u w:val="single"/>
+        </w:rPr>
+        <w:t>Visium HD</w:t>
+      </w:r>
+      <w:r>
+        <w:rPr>
+          <w:rFonts w:ascii="Arial" w:hAnsi="Arial" w:cs="Arial"/>
+          <w:sz w:val="20"/>
+          <w:szCs w:val="20"/>
+          <w:u w:val="single"/>
+        </w:rPr>
+        <w:t xml:space="preserve"> </w:t>
+      </w:r>
+      <w:r>
+        <w:rPr>
+          <w:rFonts w:ascii="Arial" w:hAnsi="Arial" w:cs="Arial"/>
+          <w:sz w:val="20"/>
+          <w:szCs w:val="20"/>
+          <w:u w:val="single"/>
+        </w:rPr>
+        <w:t>3’ Spatial transcriptomic</w:t>
+      </w:r>
+      <w:r>
+        <w:rPr>
+          <w:rFonts w:ascii="Arial" w:hAnsi="Arial" w:cs="Arial"/>
+          <w:sz w:val="20"/>
+          <w:szCs w:val="20"/>
+          <w:u w:val="single"/>
+        </w:rPr>
+        <w:t>s</w:t>
+      </w:r>
+    </w:p>
+    <w:p>
+      <w:pPr>
+        <w:rPr>
+          <w:rFonts w:ascii="Arial" w:hAnsi="Arial" w:cs="Arial"/>
+          <w:sz w:val="20"/>
+          <w:szCs w:val="20"/>
+        </w:rPr>
+      </w:pPr>
+    </w:p>
+    <w:p>
+      <w:pPr>
+        <w:ind w:firstLine="720"/>
+        <w:rPr>
+          <w:rFonts w:ascii="Arial" w:hAnsi="Arial" w:cs="Arial"/>
+          <w:sz w:val="20"/>
+          <w:szCs w:val="20"/>
+        </w:rPr>
+      </w:pPr>
+      <w:r>
+        <w:rPr>
+          <w:rFonts w:ascii="Arial" w:hAnsi="Arial" w:cs="Arial"/>
+          <w:sz w:val="20"/>
+          <w:szCs w:val="20"/>
+        </w:rPr>
+        <w:t>For Visium HD 3′ Spatial Gene Expression analysis, fresh frozen tissue sections were prepared according to the manufacturer's recommended tissue preparation workflow (CG000804, Rev B, 10x Genomics, USA). The workflow includes tissue sectioning, fixation, hematoxylin and eosin (H&amp;E) staining, and imaging. Visium HD 3′ is designed specifically for fresh frozen tissue and uses polyadenylated RNA for whole transcriptome capture. Following tissue fixation, sections were stained with H&amp;E to visualize tissue morphology. The stained tissue sections were imaged using a high-resolution microscope, generating a brightfield image for subsequent spatial registration and analysis. Following imaging, (Visium HD 3' Spatial Gene Expression, CG000805, Rev B) the tissue slide was aligned with the Visium HD 3′ spatial capture slide using the Visium CytAssist instrument. The CytAssist system positions the tissue section relative to the spatially barcoded capture surface. The tissue was subsequently processed to allow release of cellular RNA. Polyadenylated RNA molecules released from the tissue were captured by oligonucleotides containing spatial barcodes, unique molecular identifiers (UMIs), and poly(dT) sequences. The poly(dT) sequences hybridize to the poly(A) tails of mRNA molecules. This results in each captured transcript being associated with a spatial barcode corresponding to its original location in the tissue. Captured RNA was subjected to reverse transcription to generate spatially barcoded cDNA. During this process, the spatial barcode and UMI information become associated with the resulting cDNA molecules.</w:t>
+      </w:r>
+      <w:commentRangeEnd w:id="14"/>
+      <w:r>
+        <w:rPr>
+          <w:rStyle w:val="CommentReference"/>
+          <w:rFonts w:ascii="Arial" w:hAnsi="Arial" w:cs="Arial"/>
+          <w:sz w:val="20"/>
+          <w:szCs w:val="20"/>
+        </w:rPr>
+        <w:commentReference w:id="14"/>
+      </w:r>
+    </w:p>
+    <w:p>
+      <w:pPr>
+        <w:rPr>
+          <w:rFonts w:ascii="Arial" w:hAnsi="Arial" w:cs="Arial"/>
+          <w:sz w:val="20"/>
+          <w:szCs w:val="20"/>
+        </w:rPr>
+      </w:pPr>
+    </w:p>
+    <w:p>
+      <w:pPr>
+        <w:rPr>
+          <w:rFonts w:ascii="Arial" w:hAnsi="Arial" w:cs="Arial"/>
+          <w:sz w:val="20"/>
+          <w:szCs w:val="20"/>
+          <w:u w:val="single"/>
+        </w:rPr>
+      </w:pPr>
+      <w:r>
+        <w:rPr>
+          <w:rFonts w:ascii="Arial" w:hAnsi="Arial" w:cs="Arial"/>
+          <w:sz w:val="20"/>
+          <w:szCs w:val="20"/>
+          <w:u w:val="single"/>
+        </w:rPr>
+        <w:t>Final construction and sequencing of 10x Visium libraries</w:t>
+      </w:r>
+    </w:p>
+    <w:p>
+      <w:pPr>
+        <w:rPr>
+          <w:rFonts w:ascii="Arial" w:hAnsi="Arial" w:cs="Arial"/>
+          <w:sz w:val="20"/>
+          <w:szCs w:val="20"/>
+        </w:rPr>
+      </w:pPr>
+    </w:p>
+    <w:p>
+      <w:pPr>
+        <w:ind w:firstLine="720"/>
+        <w:rPr>
+          <w:rFonts w:ascii="Arial" w:hAnsi="Arial" w:cs="Arial"/>
+          <w:sz w:val="20"/>
+          <w:szCs w:val="20"/>
+        </w:rPr>
+      </w:pPr>
+      <w:r>
+        <w:rPr>
+          <w:rFonts w:ascii="Arial" w:hAnsi="Arial" w:cs="Arial"/>
+          <w:sz w:val="20"/>
+          <w:szCs w:val="20"/>
+        </w:rPr>
+        <w:t xml:space="preserve">Spatially barcoded cDNAs were immediately brought to the </w:t>
+      </w:r>
+      <w:r>
+        <w:rPr>
+          <w:rFonts w:ascii="Arial" w:hAnsi="Arial" w:cs="Arial"/>
+          <w:sz w:val="20"/>
+          <w:szCs w:val="20"/>
+        </w:rPr>
+        <w:t xml:space="preserve">UIUC Carver Biotech </w:t>
+      </w:r>
+      <w:r>
+        <w:rPr>
+          <w:rFonts w:ascii="Arial" w:hAnsi="Arial" w:cs="Arial"/>
+          <w:sz w:val="20"/>
+          <w:szCs w:val="20"/>
+        </w:rPr>
+        <w:t>DNA Services Core for amplification, strictly following the 10x Genomics Visium HD 3’ Fresh Frozen protocol. The amplified cDNAs were enzymatically fragmented and converted into sequencing-ready, dual-indexed libraries through standard end-repair, A-tailing, adaptor ligation, and PCR. The final libraries were quantitated on Qubit (Life Technologies, Grand Island, NY) and the average size determined on the Fragment Analyzer (Agilent Technologies, Santa Clara, CA). The libraries were pooled by calculated capture spot coverage via Loupe Browser and the pool diluted to 5nM concentration, then further quantitated by qPCR on a Bio-Rad CFX Connect Real-Time System (Bio-Rad Laboratories, Inc. CA). The final pool was sequenced on one lane of 25B flowcell on an Illumina NovaSeq X Plus (Illumina, San Diego, CA) to a length of 43nt (read 1, contains the spot barcode and unique molecular identifier used for removing PCR duplicates), 10nt for each index (libraries contain unique dual indexes to prevent index switching) and 75nt for read 2 (the cDNA read). Fastq.gz files were generated and demultiplexed with bcl-convert v4.3.6 Conversion Software (Illumina).</w:t>
+      </w:r>
+    </w:p>
+    <w:p>
+      <w:pPr>
+        <w:rPr>
+          <w:rFonts w:ascii="Arial" w:hAnsi="Arial" w:cs="Arial"/>
+          <w:sz w:val="20"/>
+          <w:szCs w:val="20"/>
+          <w:u w:val="single"/>
+        </w:rPr>
+      </w:pPr>
+    </w:p>
+    <w:p>
+      <w:pPr>
+        <w:rPr>
+          <w:rFonts w:ascii="Arial" w:hAnsi="Arial" w:cs="Arial"/>
+          <w:sz w:val="20"/>
+          <w:szCs w:val="20"/>
+          <w:u w:val="single"/>
+        </w:rPr>
+      </w:pPr>
+      <w:r>
+        <w:rPr>
+          <w:rFonts w:ascii="Arial" w:hAnsi="Arial" w:cs="Arial"/>
+          <w:sz w:val="20"/>
+          <w:szCs w:val="20"/>
+          <w:u w:val="single"/>
+        </w:rPr>
+        <w:t>Read Alignment</w:t>
+      </w:r>
+    </w:p>
+    <w:p>
+      <w:pPr>
+        <w:rPr>
+          <w:rFonts w:ascii="Arial" w:hAnsi="Arial" w:cs="Arial"/>
+          <w:sz w:val="20"/>
+          <w:szCs w:val="20"/>
+        </w:rPr>
+      </w:pPr>
+      <w:r>
+        <w:rPr>
+          <w:rFonts w:ascii="Arial" w:hAnsi="Arial" w:cs="Arial"/>
+          <w:sz w:val="20"/>
+          <w:szCs w:val="20"/>
+        </w:rPr>
+        <w:tab/>
+      </w:r>
+      <w:commentRangeStart w:id="15"/>
+      <w:r>
+        <w:rPr>
+          <w:rFonts w:ascii="Arial" w:hAnsi="Arial" w:cs="Arial"/>
+          <w:sz w:val="20"/>
+          <w:szCs w:val="20"/>
+        </w:rPr>
+        <w:t xml:space="preserve">Reads were aligned using space ranger version </w:t>
       </w:r>
       <w:r>
         <w:rPr>
@@ -22543,27 +22848,9 @@
           <w:szCs w:val="20"/>
           <w:highlight w:val="yellow"/>
         </w:rPr>
-        <w:t xml:space="preserve">see Supplementary Table </w:t>
-      </w:r>
-      <w:r>
-        <w:rPr>
-          <w:rFonts w:ascii="Arial" w:hAnsi="Arial" w:cs="Arial"/>
-          <w:sz w:val="20"/>
-          <w:szCs w:val="20"/>
-          <w:highlight w:val="yellow"/>
-        </w:rPr>
         <w:t>xx</w:t>
       </w:r>
-      <w:r>
-        <w:rPr>
-          <w:rFonts w:ascii="Arial" w:hAnsi="Arial" w:cs="Arial"/>
-          <w:sz w:val="20"/>
-          <w:szCs w:val="20"/>
-          <w:highlight w:val="yellow"/>
-        </w:rPr>
-        <w:t xml:space="preserve"> for lengths and weights</w:t>
-      </w:r>
-      <w:commentRangeEnd w:id="14"/>
+      <w:commentRangeEnd w:id="15"/>
       <w:r>
         <w:rPr>
           <w:rStyle w:val="CommentReference"/>
@@ -22571,305 +22858,7 @@
           <w:sz w:val="20"/>
           <w:szCs w:val="20"/>
         </w:rPr>
-        <w:commentReference w:id="14"/>
-      </w:r>
-      <w:r>
-        <w:rPr>
-          <w:rFonts w:ascii="Arial" w:hAnsi="Arial" w:cs="Arial"/>
-          <w:sz w:val="20"/>
-          <w:szCs w:val="20"/>
-        </w:rPr>
-        <w:t>). Fish were decapitated, and brains were rapidly removed and placed in molds containing chilled OCT maintained at wet-ice temperature. Each mold contained four brains representing two reproductive pairs from two tanks (two males and two females). Brains were arranged with the anterior end facing down and the spinal cord facing up, with the two female brains positioned in the top row and the two male brains in the bottom row. This arrangement was designed to maximize the amount of brain tissue that could be accommodated within the capture area of each Visium HD slide.</w:t>
-      </w:r>
-    </w:p>
-    <w:p>
-      <w:pPr>
-        <w:rPr>
-          <w:rFonts w:ascii="Arial" w:hAnsi="Arial" w:cs="Arial"/>
-          <w:sz w:val="20"/>
-          <w:szCs w:val="20"/>
-        </w:rPr>
-      </w:pPr>
-    </w:p>
-    <w:p>
-      <w:pPr>
-        <w:rPr>
-          <w:rFonts w:ascii="Arial" w:hAnsi="Arial" w:cs="Arial"/>
-          <w:sz w:val="20"/>
-          <w:szCs w:val="20"/>
-        </w:rPr>
-      </w:pPr>
-      <w:r>
-        <w:rPr>
-          <w:rFonts w:ascii="Arial" w:hAnsi="Arial" w:cs="Arial"/>
-          <w:sz w:val="20"/>
-          <w:szCs w:val="20"/>
-        </w:rPr>
-        <w:t>Following embedding, molds were frozen at −80°C and transferred directly to a cryostat for fresh-frozen sectioning. Brains were sectioned at 10 μm, and sections were selected for Visium HD based on tissue quality and anatomical coverage, with the goal of maximizing the brain area represented and sampling across the rostrocaudal extent of the dissected regions. Four sections were placed on each Visium HD slide, with each section containing tissue from four fish representing two tanks. Four Visium HD slides were prepared. Two slides contained sections from the same four fish (two reproductive pairs), whereas the remaining two slides contained sections from the other eight fish (four reproductive pairs). Thus, all 12 fish were represented across the four slides, with four fish represented on two slides.</w:t>
-      </w:r>
-    </w:p>
-    <w:p>
-      <w:pPr>
-        <w:rPr>
-          <w:rFonts w:ascii="Arial" w:hAnsi="Arial" w:cs="Arial"/>
-          <w:sz w:val="20"/>
-          <w:szCs w:val="20"/>
-        </w:rPr>
-      </w:pPr>
-    </w:p>
-    <w:p>
-      <w:pPr>
-        <w:rPr>
-          <w:rFonts w:ascii="Arial" w:hAnsi="Arial" w:cs="Arial"/>
-          <w:sz w:val="20"/>
-          <w:szCs w:val="20"/>
-        </w:rPr>
-      </w:pPr>
-      <w:r>
-        <w:rPr>
-          <w:rFonts w:ascii="Arial" w:hAnsi="Arial" w:cs="Arial"/>
-          <w:sz w:val="20"/>
-          <w:szCs w:val="20"/>
-        </w:rPr>
-        <w:t>Sections were briefly thawed to promote adherence to the slide and then immediately returned to frozen conditions on dry ice or at −80°C until Visium HD processing. Although every effort was made to maintain a consistent plane of section, some brains were sectioned at slightly oblique angles.</w:t>
-      </w:r>
-    </w:p>
-    <w:p>
-      <w:pPr>
-        <w:rPr>
-          <w:rFonts w:ascii="Arial" w:hAnsi="Arial" w:cs="Arial"/>
-          <w:sz w:val="20"/>
-          <w:szCs w:val="20"/>
-        </w:rPr>
-      </w:pPr>
-    </w:p>
-    <w:p>
-      <w:pPr>
-        <w:rPr>
-          <w:rFonts w:ascii="Arial" w:hAnsi="Arial" w:cs="Arial"/>
-          <w:sz w:val="20"/>
-          <w:szCs w:val="20"/>
-          <w:u w:val="single"/>
-        </w:rPr>
-      </w:pPr>
-      <w:commentRangeStart w:id="15"/>
-      <w:r>
-        <w:rPr>
-          <w:rFonts w:ascii="Arial" w:hAnsi="Arial" w:cs="Arial"/>
-          <w:sz w:val="20"/>
-          <w:szCs w:val="20"/>
-          <w:u w:val="single"/>
-        </w:rPr>
-        <w:t>Visium HD</w:t>
-      </w:r>
-      <w:r>
-        <w:rPr>
-          <w:rFonts w:ascii="Arial" w:hAnsi="Arial" w:cs="Arial"/>
-          <w:sz w:val="20"/>
-          <w:szCs w:val="20"/>
-          <w:u w:val="single"/>
-        </w:rPr>
-        <w:t xml:space="preserve"> </w:t>
-      </w:r>
-      <w:r>
-        <w:rPr>
-          <w:rFonts w:ascii="Arial" w:hAnsi="Arial" w:cs="Arial"/>
-          <w:sz w:val="20"/>
-          <w:szCs w:val="20"/>
-          <w:u w:val="single"/>
-        </w:rPr>
-        <w:t>3’ Spatial transcriptomic</w:t>
-      </w:r>
-      <w:r>
-        <w:rPr>
-          <w:rFonts w:ascii="Arial" w:hAnsi="Arial" w:cs="Arial"/>
-          <w:sz w:val="20"/>
-          <w:szCs w:val="20"/>
-          <w:u w:val="single"/>
-        </w:rPr>
-        <w:t>s</w:t>
-      </w:r>
-    </w:p>
-    <w:p>
-      <w:pPr>
-        <w:rPr>
-          <w:rFonts w:ascii="Arial" w:hAnsi="Arial" w:cs="Arial"/>
-          <w:sz w:val="20"/>
-          <w:szCs w:val="20"/>
-        </w:rPr>
-      </w:pPr>
-    </w:p>
-    <w:p>
-      <w:pPr>
-        <w:ind w:firstLine="720"/>
-        <w:rPr>
-          <w:rFonts w:ascii="Arial" w:hAnsi="Arial" w:cs="Arial"/>
-          <w:sz w:val="20"/>
-          <w:szCs w:val="20"/>
-        </w:rPr>
-      </w:pPr>
-      <w:r>
-        <w:rPr>
-          <w:rFonts w:ascii="Arial" w:hAnsi="Arial" w:cs="Arial"/>
-          <w:sz w:val="20"/>
-          <w:szCs w:val="20"/>
-        </w:rPr>
-        <w:t>For Visium HD 3′ Spatial Gene Expression analysis, fresh frozen tissue sections were prepared according to the manufacturer's recommended tissue preparation workflow (CG000804, Rev B, 10x Genomics, USA). The workflow includes tissue sectioning, fixation, hematoxylin and eosin (H&amp;E) staining, and imaging. Visium HD 3′ is designed specifically for fresh frozen tissue and uses polyadenylated RNA for whole transcriptome capture. Following tissue fixation, sections were stained with H&amp;E to visualize tissue morphology. The stained tissue sections were imaged using a high-resolution microscope, generating a brightfield image for subsequent spatial registration and analysis. Following imaging, (Visium HD 3' Spatial Gene Expression, CG000805, Rev B) the tissue slide was aligned with the Visium HD 3′ spatial capture slide using the Visium CytAssist instrument. The CytAssist system positions the tissue section relative to the spatially barcoded capture surface. The tissue was subsequently processed to allow release of cellular RNA. Polyadenylated RNA molecules released from the tissue were captured by oligonucleotides containing spatial barcodes, unique molecular identifiers (UMIs), and poly(dT) sequences. The poly(dT) sequences hybridize to the poly(A) tails of mRNA molecules. This results in each captured transcript being associated with a spatial barcode corresponding to its original location in the tissue. Captured RNA was subjected to reverse transcription to generate spatially barcoded cDNA. During this process, the spatial barcode and UMI information become associated with the resulting cDNA molecules.</w:t>
-      </w:r>
-      <w:commentRangeEnd w:id="15"/>
-      <w:r>
-        <w:rPr>
-          <w:rStyle w:val="CommentReference"/>
-          <w:rFonts w:ascii="Arial" w:hAnsi="Arial" w:cs="Arial"/>
-          <w:sz w:val="20"/>
-          <w:szCs w:val="20"/>
-        </w:rPr>
         <w:commentReference w:id="15"/>
-      </w:r>
-    </w:p>
-    <w:p>
-      <w:pPr>
-        <w:rPr>
-          <w:rFonts w:ascii="Arial" w:hAnsi="Arial" w:cs="Arial"/>
-          <w:sz w:val="20"/>
-          <w:szCs w:val="20"/>
-        </w:rPr>
-      </w:pPr>
-    </w:p>
-    <w:p>
-      <w:pPr>
-        <w:rPr>
-          <w:rFonts w:ascii="Arial" w:hAnsi="Arial" w:cs="Arial"/>
-          <w:sz w:val="20"/>
-          <w:szCs w:val="20"/>
-          <w:u w:val="single"/>
-        </w:rPr>
-      </w:pPr>
-      <w:r>
-        <w:rPr>
-          <w:rFonts w:ascii="Arial" w:hAnsi="Arial" w:cs="Arial"/>
-          <w:sz w:val="20"/>
-          <w:szCs w:val="20"/>
-          <w:u w:val="single"/>
-        </w:rPr>
-        <w:t>Final construction and sequencing of 10x Visium libraries</w:t>
-      </w:r>
-    </w:p>
-    <w:p>
-      <w:pPr>
-        <w:rPr>
-          <w:rFonts w:ascii="Arial" w:hAnsi="Arial" w:cs="Arial"/>
-          <w:sz w:val="20"/>
-          <w:szCs w:val="20"/>
-        </w:rPr>
-      </w:pPr>
-    </w:p>
-    <w:p>
-      <w:pPr>
-        <w:ind w:firstLine="720"/>
-        <w:rPr>
-          <w:rFonts w:ascii="Arial" w:hAnsi="Arial" w:cs="Arial"/>
-          <w:sz w:val="20"/>
-          <w:szCs w:val="20"/>
-        </w:rPr>
-      </w:pPr>
-      <w:r>
-        <w:rPr>
-          <w:rFonts w:ascii="Arial" w:hAnsi="Arial" w:cs="Arial"/>
-          <w:sz w:val="20"/>
-          <w:szCs w:val="20"/>
-        </w:rPr>
-        <w:t xml:space="preserve">Spatially barcoded cDNAs were immediately brought to the </w:t>
-      </w:r>
-      <w:r>
-        <w:rPr>
-          <w:rFonts w:ascii="Arial" w:hAnsi="Arial" w:cs="Arial"/>
-          <w:sz w:val="20"/>
-          <w:szCs w:val="20"/>
-        </w:rPr>
-        <w:t xml:space="preserve">UIUC Carver Biotech </w:t>
-      </w:r>
-      <w:r>
-        <w:rPr>
-          <w:rFonts w:ascii="Arial" w:hAnsi="Arial" w:cs="Arial"/>
-          <w:sz w:val="20"/>
-          <w:szCs w:val="20"/>
-        </w:rPr>
-        <w:t>DNA Services Core for amplification, strictly following the 10x Genomics Visium HD 3’ Fresh Frozen protocol. The amplified cDNAs were enzymatically fragmented and converted into sequencing-ready, dual-indexed libraries through standard end-repair, A-tailing, adaptor ligation, and PCR. The final libraries were quantitated on Qubit (Life Technologies, Grand Island, NY) and the average size determined on the Fragment Analyzer (Agilent Technologies, Santa Clara, CA). The libraries were pooled by calculated capture spot coverage via Loupe Browser and the pool diluted to 5nM concentration, then further quantitated by qPCR on a Bio-Rad CFX Connect Real-Time System (Bio-Rad Laboratories, Inc. CA). The final pool was sequenced on one lane of 25B flowcell on an Illumina NovaSeq X Plus (Illumina, San Diego, CA) to a length of 43nt (read 1, contains the spot barcode and unique molecular identifier used for removing PCR duplicates), 10nt for each index (libraries contain unique dual indexes to prevent index switching) and 75nt for read 2 (the cDNA read). Fastq.gz files were generated and demultiplexed with bcl-convert v4.3.6 Conversion Software (Illumina).</w:t>
-      </w:r>
-    </w:p>
-    <w:p>
-      <w:pPr>
-        <w:rPr>
-          <w:rFonts w:ascii="Arial" w:hAnsi="Arial" w:cs="Arial"/>
-          <w:sz w:val="20"/>
-          <w:szCs w:val="20"/>
-          <w:u w:val="single"/>
-        </w:rPr>
-      </w:pPr>
-    </w:p>
-    <w:p>
-      <w:pPr>
-        <w:rPr>
-          <w:rFonts w:ascii="Arial" w:hAnsi="Arial" w:cs="Arial"/>
-          <w:sz w:val="20"/>
-          <w:szCs w:val="20"/>
-          <w:u w:val="single"/>
-        </w:rPr>
-      </w:pPr>
-      <w:r>
-        <w:rPr>
-          <w:rFonts w:ascii="Arial" w:hAnsi="Arial" w:cs="Arial"/>
-          <w:sz w:val="20"/>
-          <w:szCs w:val="20"/>
-          <w:u w:val="single"/>
-        </w:rPr>
-        <w:t>Read Alignment</w:t>
-      </w:r>
-    </w:p>
-    <w:p>
-      <w:pPr>
-        <w:rPr>
-          <w:rFonts w:ascii="Arial" w:hAnsi="Arial" w:cs="Arial"/>
-          <w:sz w:val="20"/>
-          <w:szCs w:val="20"/>
-        </w:rPr>
-      </w:pPr>
-      <w:r>
-        <w:rPr>
-          <w:rFonts w:ascii="Arial" w:hAnsi="Arial" w:cs="Arial"/>
-          <w:sz w:val="20"/>
-          <w:szCs w:val="20"/>
-        </w:rPr>
-        <w:tab/>
-      </w:r>
-      <w:commentRangeStart w:id="16"/>
-      <w:r>
-        <w:rPr>
-          <w:rFonts w:ascii="Arial" w:hAnsi="Arial" w:cs="Arial"/>
-          <w:sz w:val="20"/>
-          <w:szCs w:val="20"/>
-        </w:rPr>
-        <w:t xml:space="preserve">Reads were aligned using space ranger version </w:t>
-      </w:r>
-      <w:r>
-        <w:rPr>
-          <w:rFonts w:ascii="Arial" w:hAnsi="Arial" w:cs="Arial"/>
-          <w:sz w:val="20"/>
-          <w:szCs w:val="20"/>
-          <w:highlight w:val="yellow"/>
-        </w:rPr>
-        <w:t>xx</w:t>
-      </w:r>
-      <w:commentRangeEnd w:id="16"/>
-      <w:r>
-        <w:rPr>
-          <w:rStyle w:val="CommentReference"/>
-          <w:rFonts w:ascii="Arial" w:hAnsi="Arial" w:cs="Arial"/>
-          <w:sz w:val="20"/>
-          <w:szCs w:val="20"/>
-        </w:rPr>
-        <w:commentReference w:id="16"/>
       </w:r>
       <w:r>
         <w:rPr>
@@ -30833,7 +30822,92 @@
 
 <file path=word/comments.xml><?xml version="1.0" encoding="utf-8"?>
 <w:comments xmlns:wpc="http://schemas.microsoft.com/office/word/2010/wordprocessingCanvas" xmlns:cx="http://schemas.microsoft.com/office/drawing/2014/chartex" xmlns:cx1="http://schemas.microsoft.com/office/drawing/2015/9/8/chartex" xmlns:cx2="http://schemas.microsoft.com/office/drawing/2015/10/21/chartex" xmlns:cx3="http://schemas.microsoft.com/office/drawing/2016/5/9/chartex" xmlns:cx4="http://schemas.microsoft.com/office/drawing/2016/5/10/chartex" xmlns:cx5="http://schemas.microsoft.com/office/drawing/2016/5/11/chartex" xmlns:cx6="http://schemas.microsoft.com/office/drawing/2016/5/12/chartex" xmlns:cx7="http://schemas.microsoft.com/office/drawing/2016/5/13/chartex" xmlns:cx8="http://schemas.microsoft.com/office/drawing/2016/5/14/chartex" xmlns:mc="http://schemas.openxmlformats.org/markup-compatibility/2006" xmlns:m="http://schemas.openxmlformats.org/officeDocument/2006/math" xmlns:aink="http://schemas.microsoft.com/office/drawing/2016/ink" xmlns:am3d="http://schemas.microsoft.com/office/drawing/2017/model3d" xmlns:oel="http://schemas.microsoft.com/office/2019/extlst" xmlns:r="http://schemas.openxmlformats.org/officeDocument/2006/relationships" xmlns:wp14="http://schemas.microsoft.com/office/word/2010/wordprocessingDrawing" xmlns:wp="http://schemas.openxmlformats.org/drawingml/2006/wordprocessingDrawing" xmlns:wpg="http://schemas.microsoft.com/office/word/2010/wordprocessingGroup" xmlns:wpi="http://schemas.microsoft.com/office/word/2010/wordprocessingInk" xmlns:wps="http://schemas.microsoft.com/office/word/2010/wordprocessingShape" xmlns:o="urn:schemas-microsoft-com:office:office" xmlns:v="urn:schemas-microsoft-com:vml" xmlns:w10="urn:schemas-microsoft-com:office:word" xmlns:w="http://schemas.openxmlformats.org/wordprocessingml/2006/main" xmlns:w14="http://schemas.microsoft.com/office/word/2010/wordml" xmlns:w15="http://schemas.microsoft.com/office/word/2012/wordml" xmlns:w16cex="http://schemas.microsoft.com/office/word/2018/wordml/cex" xmlns:w16cid="http://schemas.microsoft.com/office/word/2016/wordml/cid" xmlns:w16="http://schemas.microsoft.com/office/word/2018/wordml" xmlns:w16sdtdh="http://schemas.microsoft.com/office/word/2020/wordml/sdtdatahash" xmlns:w16sdtfl="http://schemas.microsoft.com/office/word/2024/wordml/sdtformatlock" xmlns:w16se="http://schemas.microsoft.com/office/word/2015/wordml/symex" xmlns:w16du="http://schemas.microsoft.com/office/word/2023/wordml/word16du" xmlns:wne="http://schemas.microsoft.com/office/word/2006/wordml" mc:Ignorable="w14 w15 w16se w16cid w16 w16cex w16sdtdh w16sdtfl w16du wp14">
-  <w:comment w:id="0" w:author="Rhodes, Justin S" w:date="2026-09-28T09:48:00Z" w:initials="JR">
+  <w:comment w:id="0" w:author="Graham, Gabriel J." w:date="2026-10-08T19:18:00Z" w:initials="GGJ">
+    <w:p>
+      <w:r>
+        <w:rPr>
+          <w:rStyle w:val="CommentReference"/>
+        </w:rPr>
+        <w:annotationRef/>
+      </w:r>
+      <w:r>
+        <w:rPr>
+          <w:sz w:val="20"/>
+          <w:szCs w:val="20"/>
+        </w:rPr>
+        <w:t>Note this is fold change of log10 transformed, should it be in raw scale instead which is closer to 20</w:t>
+      </w:r>
+    </w:p>
+  </w:comment>
+  <w:comment w:id="1" w:author="Graham, Gabriel J." w:date="2026-08-24T12:14:00Z" w:initials="GGJ">
+    <w:p>
+      <w:r>
+        <w:rPr>
+          <w:rStyle w:val="CommentReference"/>
+        </w:rPr>
+        <w:annotationRef/>
+      </w:r>
+      <w:r>
+        <w:rPr>
+          <w:sz w:val="20"/>
+          <w:szCs w:val="20"/>
+        </w:rPr>
+        <w:t>Coltan can you review the figure and see if there is anything you want to change about it</w:t>
+      </w:r>
+    </w:p>
+  </w:comment>
+  <w:comment w:id="2" w:author="Graham, Gabriel J." w:date="2026-10-07T21:50:00Z" w:initials="GGJ">
+    <w:p>
+      <w:r>
+        <w:rPr>
+          <w:rStyle w:val="CommentReference"/>
+        </w:rPr>
+        <w:annotationRef/>
+      </w:r>
+      <w:r>
+        <w:rPr>
+          <w:sz w:val="20"/>
+          <w:szCs w:val="20"/>
+        </w:rPr>
+        <w:t>Do we need both hedges g and F value?</w:t>
+      </w:r>
+    </w:p>
+  </w:comment>
+  <w:comment w:id="3" w:author="Graham, Gabriel J." w:date="2026-10-09T15:54:00Z" w:initials="GGJ">
+    <w:p>
+      <w:r>
+        <w:rPr>
+          <w:rStyle w:val="CommentReference"/>
+        </w:rPr>
+        <w:annotationRef/>
+      </w:r>
+      <w:r>
+        <w:rPr>
+          <w:sz w:val="20"/>
+          <w:szCs w:val="20"/>
+        </w:rPr>
+        <w:t>Which file are these data from? I can put in supplemental</w:t>
+      </w:r>
+    </w:p>
+  </w:comment>
+  <w:comment w:id="4" w:author="Graham, Gabriel J." w:date="2026-10-09T15:55:00Z" w:initials="GGJ">
+    <w:p>
+      <w:r>
+        <w:rPr>
+          <w:rStyle w:val="CommentReference"/>
+        </w:rPr>
+        <w:annotationRef/>
+      </w:r>
+      <w:r>
+        <w:rPr>
+          <w:sz w:val="20"/>
+          <w:szCs w:val="20"/>
+        </w:rPr>
+        <w:t>same question as above</w:t>
+      </w:r>
+    </w:p>
+  </w:comment>
+  <w:comment w:id="5" w:author="Rhodes, Justin S" w:date="2026-10-01T15:21:00Z" w:initials="JR">
     <w:p>
       <w:pPr>
         <w:pStyle w:val="CommentText"/>
@@ -30845,11 +30919,11 @@
         <w:annotationRef/>
       </w:r>
       <w:r>
-        <w:t xml:space="preserve">I still don't like this figure because it suggests temporal profiles are more well defined then they are. At the very least, we need to be clear about this. But lets flag this and see what our collaborators say. </w:t>
+        <w:t>I don’t like this sentence, it does not seem to follow, just because they are uncorrelated does not mean there is additional control beyond uncx, what is the logic there? Of course there is additinoal control beyond uncx, we identify many different contributors, these regulatory networks are exclusive meaning they exclude many other genes that are related, focusing on the most positive ones, also gene expression does not mean activtiy of the protein as you know.</w:t>
       </w:r>
     </w:p>
   </w:comment>
-  <w:comment w:id="1" w:author="Graham, Gabriel J." w:date="2026-10-08T19:18:00Z" w:initials="GGJ">
+  <w:comment w:id="6" w:author="Graham, Gabriel J." w:date="2026-10-10T14:05:00Z" w:initials="GGJ">
     <w:p>
       <w:r>
         <w:rPr>
@@ -30862,12 +30936,15 @@
           <w:sz w:val="20"/>
           <w:szCs w:val="20"/>
         </w:rPr>
-        <w:t>Note this is fold change of log10 transformed, should it be in raw scale instead which is closer to 20</w:t>
+        <w:t xml:space="preserve">Im not really sure how to square this so you can make the edits to this paragraph. To me it seems confusing that one TF has two opposing actions to different genes at different times, and i dont know how we can say that without any in vitro evidence </w:t>
       </w:r>
     </w:p>
   </w:comment>
-  <w:comment w:id="2" w:author="Graham, Gabriel J." w:date="2026-08-24T12:14:00Z" w:initials="GGJ">
-    <w:p>
+  <w:comment w:id="8" w:author="Rhodes, Justin S" w:date="2026-10-01T15:18:00Z" w:initials="JR">
+    <w:p>
+      <w:pPr>
+        <w:pStyle w:val="CommentText"/>
+      </w:pPr>
       <w:r>
         <w:rPr>
           <w:rStyle w:val="CommentReference"/>
@@ -30875,15 +30952,11 @@
         <w:annotationRef/>
       </w:r>
       <w:r>
-        <w:rPr>
-          <w:sz w:val="20"/>
-          <w:szCs w:val="20"/>
-        </w:rPr>
-        <w:t>Coltan can you review the figure and see if there is anything you want to change about it</w:t>
+        <w:t xml:space="preserve">I don’t know if I agree with this statement.  If it were just the circulating E2 then there should be increased expression of ESR2B genes in cluster 1 also.  In addition, the increased accessibility that you observed and cited here provides the most direct mechanism, the increase is due to changes in chromatin accessibility, not local or ciculating levels of E2.  </w:t>
       </w:r>
     </w:p>
   </w:comment>
-  <w:comment w:id="3" w:author="Rhodes, Justin S" w:date="2026-09-30T19:00:00Z" w:initials="JR">
+  <w:comment w:id="7" w:author="Rhodes, Justin S" w:date="2026-10-01T15:32:00Z" w:initials="JR">
     <w:p>
       <w:pPr>
         <w:pStyle w:val="CommentText"/>
@@ -30895,15 +30968,15 @@
         <w:annotationRef/>
       </w:r>
       <w:r>
-        <w:rPr>
-          <w:color w:val="000000"/>
-        </w:rPr>
-        <w:t>The problem is new cells are not added in the intermediate state they are added in the transition to females.</w:t>
+        <w:t xml:space="preserve">I think this section deserves more careful consideration about what we want to include.  I think the conclusion is for different receptors there are likely different mechanisms driving changes during sex change.  And it is super dynamic and complex.    Androgen receptors don’’t seem to change during sex change in the POA, neither does gene expression of androgen associated genes in general, or accessibilty in general, but certain genes, like znf, stx show altered regulation by AR during sex chagne late up and down regulated, could be related to difference in circulating 11KT, or accessibilty ( I should check accessibility between groups for these genes)..  For PGR, it seems likely the ligand either from the blood or local in the brain, since PGR gene expression generally goes up in females, while pgr goes transiently down, with no change in accessibility.  ESR2B genes generally go up in females and also accessibilty, suggesting accessibilty accounts for this.   </w:t>
       </w:r>
     </w:p>
   </w:comment>
-  <w:comment w:id="4" w:author="Graham, Gabriel J." w:date="2026-10-07T21:50:00Z" w:initials="GGJ">
-    <w:p>
+  <w:comment w:id="9" w:author="Rhodes, Justin S" w:date="2026-10-02T10:19:00Z" w:initials="JR">
+    <w:p>
+      <w:pPr>
+        <w:pStyle w:val="CommentText"/>
+      </w:pPr>
       <w:r>
         <w:rPr>
           <w:rStyle w:val="CommentReference"/>
@@ -30911,15 +30984,11 @@
         <w:annotationRef/>
       </w:r>
       <w:r>
-        <w:rPr>
-          <w:sz w:val="20"/>
-          <w:szCs w:val="20"/>
-        </w:rPr>
-        <w:t>Do we need both hedges g and F value?</w:t>
+        <w:t>Can we say more about what this means.  I don’t understand.  Are there references we can provide for this?</w:t>
       </w:r>
     </w:p>
   </w:comment>
-  <w:comment w:id="5" w:author="Graham, Gabriel J." w:date="2026-10-09T15:54:00Z" w:initials="GGJ">
+  <w:comment w:id="10" w:author="Graham, Gabriel J." w:date="2026-10-05T14:10:00Z" w:initials="GGJ">
     <w:p>
       <w:r>
         <w:rPr>
@@ -30932,12 +31001,15 @@
           <w:sz w:val="20"/>
           <w:szCs w:val="20"/>
         </w:rPr>
-        <w:t>Which file are these data from? I can put in supplemental</w:t>
+        <w:t>This is from Katies QC but what it means is cells that are not expressing at least 55% of the genes from the FindVariableGenes() function are removed, is I believe part of the satija lab workflow thout katie could speak more to it</w:t>
       </w:r>
     </w:p>
   </w:comment>
-  <w:comment w:id="6" w:author="Graham, Gabriel J." w:date="2026-10-09T15:55:00Z" w:initials="GGJ">
-    <w:p>
+  <w:comment w:id="11" w:author="Rhodes, Justin S" w:date="2026-10-02T10:20:00Z" w:initials="JR">
+    <w:p>
+      <w:pPr>
+        <w:pStyle w:val="CommentText"/>
+      </w:pPr>
       <w:r>
         <w:rPr>
           <w:rStyle w:val="CommentReference"/>
@@ -30945,19 +31017,12 @@
         <w:annotationRef/>
       </w:r>
       <w:r>
-        <w:rPr>
-          <w:sz w:val="20"/>
-          <w:szCs w:val="20"/>
-        </w:rPr>
-        <w:t>same question as above</w:t>
+        <w:t>Why did we use these criteria, following another paper or standard...</w:t>
       </w:r>
     </w:p>
   </w:comment>
-  <w:comment w:id="7" w:author="Rhodes, Justin S" w:date="2026-10-01T15:21:00Z" w:initials="JR">
-    <w:p>
-      <w:pPr>
-        <w:pStyle w:val="CommentText"/>
-      </w:pPr>
+  <w:comment w:id="12" w:author="Graham, Gabriel J." w:date="2026-10-05T14:10:00Z" w:initials="GGJ">
+    <w:p>
       <w:r>
         <w:rPr>
           <w:rStyle w:val="CommentReference"/>
@@ -30965,15 +31030,16 @@
         <w:annotationRef/>
       </w:r>
       <w:r>
-        <w:t>I don’t like this sentence, it does not seem to follow, just because they are uncorrelated does not mean there is additional control beyond uncx, what is the logic there? Of course there is additinoal control beyond uncx, we identify many different contributors, these regulatory networks are exclusive meaning they exclude many other genes that are related, focusing on the most positive ones, also gene expression does not mean activtiy of the protein as you know.</w:t>
+        <w:rPr>
+          <w:sz w:val="20"/>
+          <w:szCs w:val="20"/>
+        </w:rPr>
+        <w:t>Again, ask Katie, though most of this is standard</w:t>
       </w:r>
     </w:p>
   </w:comment>
-  <w:comment w:id="9" w:author="Rhodes, Justin S" w:date="2026-10-01T15:18:00Z" w:initials="JR">
-    <w:p>
-      <w:pPr>
-        <w:pStyle w:val="CommentText"/>
-      </w:pPr>
+  <w:comment w:id="13" w:author="Graham, Gabriel J." w:date="2026-10-09T15:56:00Z" w:initials="GGJ">
+    <w:p>
       <w:r>
         <w:rPr>
           <w:rStyle w:val="CommentReference"/>
@@ -30981,15 +31047,16 @@
         <w:annotationRef/>
       </w:r>
       <w:r>
-        <w:t xml:space="preserve">I don’t know if I agree with this statement.  If it were just the circulating E2 then there should be increased expression of ESR2B genes in cluster 1 also.  In addition, the increased accessibility that you observed and cited here provides the most direct mechanism, the increase is due to changes in chromatin accessibility, not local or ciculating levels of E2.  </w:t>
+        <w:rPr>
+          <w:sz w:val="20"/>
+          <w:szCs w:val="20"/>
+        </w:rPr>
+        <w:t>Need this table, do you really think this is necessary though?</w:t>
       </w:r>
     </w:p>
   </w:comment>
-  <w:comment w:id="8" w:author="Rhodes, Justin S" w:date="2026-10-01T15:32:00Z" w:initials="JR">
-    <w:p>
-      <w:pPr>
-        <w:pStyle w:val="CommentText"/>
-      </w:pPr>
+  <w:comment w:id="14" w:author="Graham, Gabriel J." w:date="2026-10-08T19:00:00Z" w:initials="GGJ">
+    <w:p>
       <w:r>
         <w:rPr>
           <w:rStyle w:val="CommentReference"/>
@@ -30997,111 +31064,15 @@
         <w:annotationRef/>
       </w:r>
       <w:r>
-        <w:t xml:space="preserve">I think this section deserves more careful consideration about what we want to include.  I think the conclusion is for different receptors there are likely different mechanisms driving changes during sex change.  And it is super dynamic and complex.    Androgen receptors don’’t seem to change during sex change in the POA, neither does gene expression of androgen associated genes in general, or accessibilty in general, but certain genes, like znf, stx show altered regulation by AR during sex chagne late up and down regulated, could be related to difference in circulating 11KT, or accessibilty ( I should check accessibility between groups for these genes)..  For PGR, it seems likely the ligand either from the blood or local in the brain, since PGR gene expression generally goes up in females, while pgr goes transiently down, with no change in accessibility.  ESR2B genes generally go up in females and also accessibilty, suggesting accessibilty accounts for this.   </w:t>
+        <w:rPr>
+          <w:sz w:val="20"/>
+          <w:szCs w:val="20"/>
+        </w:rPr>
+        <w:t>Justin how much of this can we remove cause to my eye it is all told in " we followed the manufacturers recommendation" and the rest is a description of that</w:t>
       </w:r>
     </w:p>
   </w:comment>
-  <w:comment w:id="10" w:author="Rhodes, Justin S" w:date="2026-10-02T10:19:00Z" w:initials="JR">
-    <w:p>
-      <w:pPr>
-        <w:pStyle w:val="CommentText"/>
-      </w:pPr>
-      <w:r>
-        <w:rPr>
-          <w:rStyle w:val="CommentReference"/>
-        </w:rPr>
-        <w:annotationRef/>
-      </w:r>
-      <w:r>
-        <w:t>Can we say more about what this means.  I don’t understand.  Are there references we can provide for this?</w:t>
-      </w:r>
-    </w:p>
-  </w:comment>
-  <w:comment w:id="11" w:author="Graham, Gabriel J." w:date="2026-10-05T14:10:00Z" w:initials="GGJ">
-    <w:p>
-      <w:r>
-        <w:rPr>
-          <w:rStyle w:val="CommentReference"/>
-        </w:rPr>
-        <w:annotationRef/>
-      </w:r>
-      <w:r>
-        <w:rPr>
-          <w:sz w:val="20"/>
-          <w:szCs w:val="20"/>
-        </w:rPr>
-        <w:t>This is from Katies QC but what it means is cells that are not expressing at least 55% of the genes from the FindVariableGenes() function are removed, is I believe part of the satija lab workflow thout katie could speak more to it</w:t>
-      </w:r>
-    </w:p>
-  </w:comment>
-  <w:comment w:id="12" w:author="Rhodes, Justin S" w:date="2026-10-02T10:20:00Z" w:initials="JR">
-    <w:p>
-      <w:pPr>
-        <w:pStyle w:val="CommentText"/>
-      </w:pPr>
-      <w:r>
-        <w:rPr>
-          <w:rStyle w:val="CommentReference"/>
-        </w:rPr>
-        <w:annotationRef/>
-      </w:r>
-      <w:r>
-        <w:t>Why did we use these criteria, following another paper or standard...</w:t>
-      </w:r>
-    </w:p>
-  </w:comment>
-  <w:comment w:id="13" w:author="Graham, Gabriel J." w:date="2026-10-05T14:10:00Z" w:initials="GGJ">
-    <w:p>
-      <w:r>
-        <w:rPr>
-          <w:rStyle w:val="CommentReference"/>
-        </w:rPr>
-        <w:annotationRef/>
-      </w:r>
-      <w:r>
-        <w:rPr>
-          <w:sz w:val="20"/>
-          <w:szCs w:val="20"/>
-        </w:rPr>
-        <w:t>Again, ask Katie, though most of this is standard</w:t>
-      </w:r>
-    </w:p>
-  </w:comment>
-  <w:comment w:id="14" w:author="Graham, Gabriel J." w:date="2026-10-09T15:56:00Z" w:initials="GGJ">
-    <w:p>
-      <w:r>
-        <w:rPr>
-          <w:rStyle w:val="CommentReference"/>
-        </w:rPr>
-        <w:annotationRef/>
-      </w:r>
-      <w:r>
-        <w:rPr>
-          <w:sz w:val="20"/>
-          <w:szCs w:val="20"/>
-        </w:rPr>
-        <w:t>Need this table, do you really think this is necessary though?</w:t>
-      </w:r>
-    </w:p>
-  </w:comment>
-  <w:comment w:id="15" w:author="Graham, Gabriel J." w:date="2026-10-08T19:00:00Z" w:initials="GGJ">
-    <w:p>
-      <w:r>
-        <w:rPr>
-          <w:rStyle w:val="CommentReference"/>
-        </w:rPr>
-        <w:annotationRef/>
-      </w:r>
-      <w:r>
-        <w:rPr>
-          <w:sz w:val="20"/>
-          <w:szCs w:val="20"/>
-        </w:rPr>
-        <w:t>Justin how much of this can we remove cause to my eye it is all told in " we followed the manufacturers recommendation" and the rest is a description of that</w:t>
-      </w:r>
-    </w:p>
-  </w:comment>
-  <w:comment w:id="16" w:author="Graham, Gabriel J." w:date="2026-08-10T13:14:00Z" w:initials="GGJ">
+  <w:comment w:id="15" w:author="Graham, Gabriel J." w:date="2026-08-10T13:14:00Z" w:initials="GGJ">
     <w:p>
       <w:r>
         <w:rPr>
@@ -31123,14 +31094,13 @@
 
 <file path=word/commentsExtended.xml><?xml version="1.0" encoding="utf-8"?>
 <w15:commentsEx xmlns:wpc="http://schemas.microsoft.com/office/word/2010/wordprocessingCanvas" xmlns:cx="http://schemas.microsoft.com/office/drawing/2014/chartex" xmlns:cx1="http://schemas.microsoft.com/office/drawing/2015/9/8/chartex" xmlns:cx2="http://schemas.microsoft.com/office/drawing/2015/10/21/chartex" xmlns:cx3="http://schemas.microsoft.com/office/drawing/2016/5/9/chartex" xmlns:cx4="http://schemas.microsoft.com/office/drawing/2016/5/10/chartex" xmlns:cx5="http://schemas.microsoft.com/office/drawing/2016/5/11/chartex" xmlns:cx6="http://schemas.microsoft.com/office/drawing/2016/5/12/chartex" xmlns:cx7="http://schemas.microsoft.com/office/drawing/2016/5/13/chartex" xmlns:cx8="http://schemas.microsoft.com/office/drawing/2016/5/14/chartex" xmlns:mc="http://schemas.openxmlformats.org/markup-compatibility/2006" xmlns:m="http://schemas.openxmlformats.org/officeDocument/2006/math" xmlns:aink="http://schemas.microsoft.com/office/drawing/2016/ink" xmlns:am3d="http://schemas.microsoft.com/office/drawing/2017/model3d" xmlns:oel="http://schemas.microsoft.com/office/2019/extlst" xmlns:r="http://schemas.openxmlformats.org/officeDocument/2006/relationships" xmlns:wp14="http://schemas.microsoft.com/office/word/2010/wordprocessingDrawing" xmlns:wp="http://schemas.openxmlformats.org/drawingml/2006/wordprocessingDrawing" xmlns:wpg="http://schemas.microsoft.com/office/word/2010/wordprocessingGroup" xmlns:wpi="http://schemas.microsoft.com/office/word/2010/wordprocessingInk" xmlns:wps="http://schemas.microsoft.com/office/word/2010/wordprocessingShape" xmlns:o="urn:schemas-microsoft-com:office:office" xmlns:v="urn:schemas-microsoft-com:vml" xmlns:w10="urn:schemas-microsoft-com:office:word" xmlns:w="http://schemas.openxmlformats.org/wordprocessingml/2006/main" xmlns:w14="http://schemas.microsoft.com/office/word/2010/wordml" xmlns:w15="http://schemas.microsoft.com/office/word/2012/wordml" xmlns:w16cex="http://schemas.microsoft.com/office/word/2018/wordml/cex" xmlns:w16cid="http://schemas.microsoft.com/office/word/2016/wordml/cid" xmlns:w16="http://schemas.microsoft.com/office/word/2018/wordml" xmlns:w16sdtdh="http://schemas.microsoft.com/office/word/2020/wordml/sdtdatahash" xmlns:w16sdtfl="http://schemas.microsoft.com/office/word/2024/wordml/sdtformatlock" xmlns:w16se="http://schemas.microsoft.com/office/word/2015/wordml/symex" xmlns:w16du="http://schemas.microsoft.com/office/word/2023/wordml/word16du" xmlns:wne="http://schemas.microsoft.com/office/word/2006/wordml" mc:Ignorable="w14 w15 w16se w16cid w16 w16cex w16sdtdh w16sdtfl w16du wp14">
-  <w15:commentEx w15:paraId="3B705D03" w15:done="0"/>
   <w15:commentEx w15:paraId="160B58DC" w15:done="0"/>
   <w15:commentEx w15:paraId="3C4ECC42" w15:done="0"/>
-  <w15:commentEx w15:paraId="49E1EED1" w15:done="0"/>
   <w15:commentEx w15:paraId="547D4B9C" w15:done="0"/>
   <w15:commentEx w15:paraId="30A58DDD" w15:done="0"/>
   <w15:commentEx w15:paraId="509769D1" w15:done="0"/>
   <w15:commentEx w15:paraId="7842C088" w15:done="0"/>
+  <w15:commentEx w15:paraId="2F6ED39A" w15:paraIdParent="7842C088" w15:done="0"/>
   <w15:commentEx w15:paraId="317650FE" w15:done="0"/>
   <w15:commentEx w15:paraId="2BA00BFB" w15:done="0"/>
   <w15:commentEx w15:paraId="3231B06A" w15:done="0"/>
@@ -31145,14 +31115,13 @@
 
 <file path=word/commentsExtensible.xml><?xml version="1.0" encoding="utf-8"?>
 <w16cex:commentsExtensible xmlns:wpc="http://schemas.microsoft.com/office/word/2010/wordprocessingCanvas" xmlns:cx="http://schemas.microsoft.com/office/drawing/2014/chartex" xmlns:cx1="http://schemas.microsoft.com/office/drawing/2015/9/8/chartex" xmlns:cx2="http://schemas.microsoft.com/office/drawing/2015/10/21/chartex" xmlns:cx3="http://schemas.microsoft.com/office/drawing/2016/5/9/chartex" xmlns:cx4="http://schemas.microsoft.com/office/drawing/2016/5/10/chartex" xmlns:cx5="http://schemas.microsoft.com/office/drawing/2016/5/11/chartex" xmlns:cx6="http://schemas.microsoft.com/office/drawing/2016/5/12/chartex" xmlns:cx7="http://schemas.microsoft.com/office/drawing/2016/5/13/chartex" xmlns:cx8="http://schemas.microsoft.com/office/drawing/2016/5/14/chartex" xmlns:cr="http://schemas.microsoft.com/office/comments/2020/reactions" xmlns:mc="http://schemas.openxmlformats.org/markup-compatibility/2006" xmlns:m="http://schemas.openxmlformats.org/officeDocument/2006/math" xmlns:aink="http://schemas.microsoft.com/office/drawing/2016/ink" xmlns:am3d="http://schemas.microsoft.com/office/drawing/2017/model3d" xmlns:oel="http://schemas.microsoft.com/office/2019/extlst" xmlns:r="http://schemas.openxmlformats.org/officeDocument/2006/relationships" xmlns:wp14="http://schemas.microsoft.com/office/word/2010/wordprocessingDrawing" xmlns:wp="http://schemas.openxmlformats.org/drawingml/2006/wordprocessingDrawing" xmlns:wpg="http://schemas.microsoft.com/office/word/2010/wordprocessingGroup" xmlns:wpi="http://schemas.microsoft.com/office/word/2010/wordprocessingInk" xmlns:wps="http://schemas.microsoft.com/office/word/2010/wordprocessingShape" xmlns:o="urn:schemas-microsoft-com:office:office" xmlns:v="urn:schemas-microsoft-com:vml" xmlns:w10="urn:schemas-microsoft-com:office:word" xmlns:w="http://schemas.openxmlformats.org/wordprocessingml/2006/main" xmlns:w14="http://schemas.microsoft.com/office/word/2010/wordml" xmlns:w15="http://schemas.microsoft.com/office/word/2012/wordml" xmlns:w16cex="http://schemas.microsoft.com/office/word/2018/wordml/cex" xmlns:w16cid="http://schemas.microsoft.com/office/word/2016/wordml/cid" xmlns:w16="http://schemas.microsoft.com/office/word/2018/wordml" xmlns:w16sdtdh="http://schemas.microsoft.com/office/word/2020/wordml/sdtdatahash" xmlns:w16sdtfl="http://schemas.microsoft.com/office/word/2024/wordml/sdtformatlock" xmlns:w16se="http://schemas.microsoft.com/office/word/2015/wordml/symex" xmlns:w16du="http://schemas.microsoft.com/office/word/2023/wordml/word16du" xmlns:wne="http://schemas.microsoft.com/office/word/2006/wordml" mc:Ignorable="w14 w15 w16se w16cid w16 w16cex w16sdtdh w16sdtfl cr w16du wp14">
-  <w16cex:commentExtensible w16cex:durableId="6DA39714" w16cex:dateUtc="2026-09-28T14:48:00Z"/>
   <w16cex:commentExtensible w16cex:durableId="0FAB0F5A" w16cex:dateUtc="2026-10-08T23:18:00Z"/>
   <w16cex:commentExtensible w16cex:durableId="433C772E" w16cex:dateUtc="2026-08-24T16:14:00Z"/>
-  <w16cex:commentExtensible w16cex:durableId="75DB0B03" w16cex:dateUtc="2026-10-01T00:00:00Z"/>
   <w16cex:commentExtensible w16cex:durableId="7D1E6C1C" w16cex:dateUtc="2026-10-08T01:50:00Z"/>
   <w16cex:commentExtensible w16cex:durableId="4854A006" w16cex:dateUtc="2026-10-09T19:54:00Z"/>
   <w16cex:commentExtensible w16cex:durableId="0B506FD9" w16cex:dateUtc="2026-10-09T19:55:00Z"/>
   <w16cex:commentExtensible w16cex:durableId="465231E1" w16cex:dateUtc="2026-10-01T20:21:00Z"/>
+  <w16cex:commentExtensible w16cex:durableId="2C6F3F9F" w16cex:dateUtc="2026-10-10T18:05:00Z"/>
   <w16cex:commentExtensible w16cex:durableId="788BB19D" w16cex:dateUtc="2026-10-01T20:18:00Z"/>
   <w16cex:commentExtensible w16cex:durableId="6B4B8AEA" w16cex:dateUtc="2026-10-01T20:32:00Z"/>
   <w16cex:commentExtensible w16cex:durableId="4EA48AB1" w16cex:dateUtc="2026-10-02T15:19:00Z"/>
@@ -31167,14 +31136,13 @@
 
 <file path=word/commentsIds.xml><?xml version="1.0" encoding="utf-8"?>
 <w16cid:commentsIds xmlns:wpc="http://schemas.microsoft.com/office/word/2010/wordprocessingCanvas" xmlns:cx="http://schemas.microsoft.com/office/drawing/2014/chartex" xmlns:cx1="http://schemas.microsoft.com/office/drawing/2015/9/8/chartex" xmlns:cx2="http://schemas.microsoft.com/office/drawing/2015/10/21/chartex" xmlns:cx3="http://schemas.microsoft.com/office/drawing/2016/5/9/chartex" xmlns:cx4="http://schemas.microsoft.com/office/drawing/2016/5/10/chartex" xmlns:cx5="http://schemas.microsoft.com/office/drawing/2016/5/11/chartex" xmlns:cx6="http://schemas.microsoft.com/office/drawing/2016/5/12/chartex" xmlns:cx7="http://schemas.microsoft.com/office/drawing/2016/5/13/chartex" xmlns:cx8="http://schemas.microsoft.com/office/drawing/2016/5/14/chartex" xmlns:mc="http://schemas.openxmlformats.org/markup-compatibility/2006" xmlns:m="http://schemas.openxmlformats.org/officeDocument/2006/math" xmlns:aink="http://schemas.microsoft.com/office/drawing/2016/ink" xmlns:am3d="http://schemas.microsoft.com/office/drawing/2017/model3d" xmlns:oel="http://schemas.microsoft.com/office/2019/extlst" xmlns:r="http://schemas.openxmlformats.org/officeDocument/2006/relationships" xmlns:wp14="http://schemas.microsoft.com/office/word/2010/wordprocessingDrawing" xmlns:wp="http://schemas.openxmlformats.org/drawingml/2006/wordprocessingDrawing" xmlns:wpg="http://schemas.microsoft.com/office/word/2010/wordprocessingGroup" xmlns:wpi="http://schemas.microsoft.com/office/word/2010/wordprocessingInk" xmlns:wps="http://schemas.microsoft.com/office/word/2010/wordprocessingShape" xmlns:o="urn:schemas-microsoft-com:office:office" xmlns:v="urn:schemas-microsoft-com:vml" xmlns:w10="urn:schemas-microsoft-com:office:word" xmlns:w="http://schemas.openxmlformats.org/wordprocessingml/2006/main" xmlns:w14="http://schemas.microsoft.com/office/word/2010/wordml" xmlns:w15="http://schemas.microsoft.com/office/word/2012/wordml" xmlns:w16cex="http://schemas.microsoft.com/office/word/2018/wordml/cex" xmlns:w16cid="http://schemas.microsoft.com/office/word/2016/wordml/cid" xmlns:w16="http://schemas.microsoft.com/office/word/2018/wordml" xmlns:w16sdtdh="http://schemas.microsoft.com/office/word/2020/wordml/sdtdatahash" xmlns:w16sdtfl="http://schemas.microsoft.com/office/word/2024/wordml/sdtformatlock" xmlns:w16se="http://schemas.microsoft.com/office/word/2015/wordml/symex" xmlns:w16du="http://schemas.microsoft.com/office/word/2023/wordml/word16du" xmlns:wne="http://schemas.microsoft.com/office/word/2006/wordml" mc:Ignorable="w14 w15 w16se w16cid w16 w16cex w16sdtdh w16sdtfl w16du wp14">
-  <w16cid:commentId w16cid:paraId="3B705D03" w16cid:durableId="6DA39714"/>
   <w16cid:commentId w16cid:paraId="160B58DC" w16cid:durableId="0FAB0F5A"/>
   <w16cid:commentId w16cid:paraId="3C4ECC42" w16cid:durableId="433C772E"/>
-  <w16cid:commentId w16cid:paraId="49E1EED1" w16cid:durableId="75DB0B03"/>
   <w16cid:commentId w16cid:paraId="547D4B9C" w16cid:durableId="7D1E6C1C"/>
   <w16cid:commentId w16cid:paraId="30A58DDD" w16cid:durableId="4854A006"/>
   <w16cid:commentId w16cid:paraId="509769D1" w16cid:durableId="0B506FD9"/>
   <w16cid:commentId w16cid:paraId="7842C088" w16cid:durableId="465231E1"/>
+  <w16cid:commentId w16cid:paraId="2F6ED39A" w16cid:durableId="2C6F3F9F"/>
   <w16cid:commentId w16cid:paraId="317650FE" w16cid:durableId="788BB19D"/>
   <w16cid:commentId w16cid:paraId="2BA00BFB" w16cid:durableId="6B4B8AEA"/>
   <w16cid:commentId w16cid:paraId="3231B06A" w16cid:durableId="4EA48AB1"/>
@@ -32034,11 +32002,11 @@
 
 <file path=word/people.xml><?xml version="1.0" encoding="utf-8"?>
 <w15:people xmlns:wpc="http://schemas.microsoft.com/office/word/2010/wordprocessingCanvas" xmlns:cx="http://schemas.microsoft.com/office/drawing/2014/chartex" xmlns:cx1="http://schemas.microsoft.com/office/drawing/2015/9/8/chartex" xmlns:cx2="http://schemas.microsoft.com/office/drawing/2015/10/21/chartex" xmlns:cx3="http://schemas.microsoft.com/office/drawing/2016/5/9/chartex" xmlns:cx4="http://schemas.microsoft.com/office/drawing/2016/5/10/chartex" xmlns:cx5="http://schemas.microsoft.com/office/drawing/2016/5/11/chartex" xmlns:cx6="http://schemas.microsoft.com/office/drawing/2016/5/12/chartex" xmlns:cx7="http://schemas.microsoft.com/office/drawing/2016/5/13/chartex" xmlns:cx8="http://schemas.microsoft.com/office/drawing/2016/5/14/chartex" xmlns:mc="http://schemas.openxmlformats.org/markup-compatibility/2006" xmlns:m="http://schemas.openxmlformats.org/officeDocument/2006/math" xmlns:aink="http://schemas.microsoft.com/office/drawing/2016/ink" xmlns:am3d="http://schemas.microsoft.com/office/drawing/2017/model3d" xmlns:oel="http://schemas.microsoft.com/office/2019/extlst" xmlns:r="http://schemas.openxmlformats.org/officeDocument/2006/relationships" xmlns:wp14="http://schemas.microsoft.com/office/word/2010/wordprocessingDrawing" xmlns:wp="http://schemas.openxmlformats.org/drawingml/2006/wordprocessingDrawing" xmlns:wpg="http://schemas.microsoft.com/office/word/2010/wordprocessingGroup" xmlns:wpi="http://schemas.microsoft.com/office/word/2010/wordprocessingInk" xmlns:wps="http://schemas.microsoft.com/office/word/2010/wordprocessingShape" xmlns:o="urn:schemas-microsoft-com:office:office" xmlns:v="urn:schemas-microsoft-com:vml" xmlns:w10="urn:schemas-microsoft-com:office:word" xmlns:w="http://schemas.openxmlformats.org/wordprocessingml/2006/main" xmlns:w14="http://schemas.microsoft.com/office/word/2010/wordml" xmlns:w15="http://schemas.microsoft.com/office/word/2012/wordml" xmlns:w16cex="http://schemas.microsoft.com/office/word/2018/wordml/cex" xmlns:w16cid="http://schemas.microsoft.com/office/word/2016/wordml/cid" xmlns:w16="http://schemas.microsoft.com/office/word/2018/wordml" xmlns:w16sdtdh="http://schemas.microsoft.com/office/word/2020/wordml/sdtdatahash" xmlns:w16sdtfl="http://schemas.microsoft.com/office/word/2024/wordml/sdtformatlock" xmlns:w16se="http://schemas.microsoft.com/office/word/2015/wordml/symex" xmlns:w16du="http://schemas.microsoft.com/office/word/2023/wordml/word16du" xmlns:wne="http://schemas.microsoft.com/office/word/2006/wordml" mc:Ignorable="w14 w15 w16se w16cid w16 w16cex w16sdtdh w16sdtfl w16du wp14">
+  <w15:person w15:author="Graham, Gabriel J.">
+    <w15:presenceInfo w15:providerId="AD" w15:userId="S::gjg2134@cumc.columbia.edu::d04249e3-dddd-46f1-a69e-ff52b6530909"/>
+  </w15:person>
   <w15:person w15:author="Rhodes, Justin S">
     <w15:presenceInfo w15:providerId="AD" w15:userId="S::jrhodes@illinois.edu::27bcc96f-859c-4b57-a2a0-7a1e2125262b"/>
-  </w15:person>
-  <w15:person w15:author="Graham, Gabriel J.">
-    <w15:presenceInfo w15:providerId="AD" w15:userId="S::gjg2134@cumc.columbia.edu::d04249e3-dddd-46f1-a69e-ff52b6530909"/>
   </w15:person>
 </w15:people>
 </file>

</xml_diff>